<commit_message>
Revise manuscript: justify the normalization choice, add Appendix A, sharpen the contribution
</commit_message>
<xml_diff>
--- a/paper/NBA_Moneyline_Calibration_Paper.docx
+++ b/paper/NBA_Moneyline_Calibration_Paper.docx
@@ -139,7 +139,7 @@
           <w:sz w:val="22"/>
           <w:szCs w:val="22"/>
         </w:rPr>
-        <w:t xml:space="preserve">Two qualifications are reported rather than buried. A logistic calibration regression does not reject perfect calibration under most variance estimators, but does under two-way clustering on season and team (p = .037), an estimator that is unreliable at 13 clusters. And of five vig-removal rules, four leave the gap below its own break-even threshold while one, power normalization, produces a gap of -1.31 points against a 1.24-point threshold.</w:t>
+        <w:t xml:space="preserve">That conclusion is not universal, and the limits are stated here rather than left to the appendix. Repeating the test under five vig-removal rules gives gaps from -1.31 to +0.58 points. Four of the five leave the gap below that rule's own break-even threshold and none of those four is significant. The fifth, power normalization, produces a gap of -1.31 points against a 1.24-point threshold at p = .004. Separately, the secondary logistic calibration regression does not reject perfect calibration under four of five variance estimators but does under two-way clustering on season and team (p = .037), an estimator resting on only 13 clusters and therefore unreliable.</w:t>
       </w:r>
     </w:p>
     <w:p>
@@ -154,7 +154,7 @@
           <w:sz w:val="22"/>
           <w:szCs w:val="22"/>
         </w:rPr>
-        <w:t xml:space="preserve">The study also quantifies a methodological issue: comparing outcomes with raw implied probabilities, without removing the vig, manufactures an apparent favorite bias of 2.5 percentage points that is the bookmaker margin rather than evidence about bettors.</w:t>
+        <w:t xml:space="preserve">Taken together the more durable finding is methodological. On the same 15,351 games, raw implied probabilities imply a favorite bias of -2.50 points at p &lt; .001, proportional normalization implies +0.58 points at p = .223, and power normalization implies -1.31 points at p = .004. The existence, size and even the sign of estimated favorite bias in this market depend materially on how the bookmaker's margin is removed, and a pre-specified, adequately powered, economically anchored design is what makes that dependence visible instead of invisible.</w:t>
       </w:r>
     </w:p>
     <w:p>
@@ -690,7 +690,37 @@
           <w:sz w:val="22"/>
           <w:szCs w:val="22"/>
         </w:rPr>
-        <w:t xml:space="preserve">This assumes the margin is taken in proportion to price, so that in absolute terms the favorite absorbs more of it than the underdog. That is one assumption among several, and because the entire distinction between an apparent favorite bias and a calibration gap depends on it, four alternatives are tested in section 5.4. The favorite is the side with the higher vig-free probability. Raw probabilities are retained for the sensitivity analysis.</w:t>
+        <w:t xml:space="preserve">This assumes the margin is taken in proportion to price, so that in absolute terms the favorite absorbs more of it than the underdog. The rule has one clean property: dividing both sides by the same constant leaves the ratio q1/q2 unchanged, so the relative pricing of the two sides is preserved exactly and only the level is rescaled. The additive rule preserves the difference q1 - q2 instead. Neither is derivable from first principles; each preserves a different feature of the quoted price.</w:t>
+      </w:r>
+    </w:p>
+    <w:p>
+      <w:pPr>
+        <w:spacing w:after="160" w:line="340"/>
+        <w:jc w:val="both"/>
+      </w:pPr>
+      <w:r>
+        <w:rPr>
+          <w:rFonts w:ascii="Georgia" w:cs="Georgia" w:eastAsia="Georgia" w:hAnsi="Georgia"/>
+          <w:color w:val="1a1a1a"/>
+          <w:sz w:val="22"/>
+          <w:szCs w:val="22"/>
+        </w:rPr>
+        <w:t xml:space="preserve">Three things should be said plainly about why proportional is the primary rule, because the choice determines the headline number. First, it was fixed in the frozen analysis plan before any outcome data were examined, and that plan is published with the replication materials, so it was not selected after seeing which rule produced which answer. Second, it is the prevailing convention in the applied betting-market literature, which makes the primary estimate comparable with prior work. Third, its property of preserving relative pricing is the natural default for a calibration question, where the object of interest is whether the two sides are priced correctly against each other.</w:t>
+      </w:r>
+    </w:p>
+    <w:p>
+      <w:pPr>
+        <w:spacing w:after="160" w:line="340"/>
+        <w:jc w:val="both"/>
+      </w:pPr>
+      <w:r>
+        <w:rPr>
+          <w:rFonts w:ascii="Georgia" w:cs="Georgia" w:eastAsia="Georgia" w:hAnsi="Georgia"/>
+          <w:color w:val="1a1a1a"/>
+          <w:sz w:val="22"/>
+          <w:szCs w:val="22"/>
+        </w:rPr>
+        <w:t xml:space="preserve">What should not be claimed is that proportional normalization has stronger theoretical warrant than the alternatives. It does not. Of the rules tested, the one with an actual behavioral model behind it is Shin (1993), and for a two-outcome book Shin reduces exactly to the additive rule, which puts the gap at -0.60 rather than +0.58 points. That estimate is not significant (p = .186) and sits well below its own break-even requirement, so the substantive conclusion is unchanged, but the sign is not. Section 5.4 reports all five rules and Appendix A proves the Shin result. The favorite is the side with the higher vig-free probability. Raw probabilities are retained for the sensitivity analysis.</w:t>
       </w:r>
     </w:p>
     <w:p>
@@ -3676,7 +3706,7 @@
           <w:sz w:val="22"/>
           <w:szCs w:val="22"/>
         </w:rPr>
-        <w:t xml:space="preserve">Three families of check are reported: across seasons, across dependence structures, and across vig-removal rules. The first two leave the primary conclusion intact. The third leaves it intact under four of five rules and qualifies it under the fifth.</w:t>
+        <w:t xml:space="preserve">Three families of check are reported: across seasons, across dependence structures, and across vig-removal rules. The first two leave the primary conclusion intact. The third does not merely qualify it. Under one of five normalization rules the sample shows a statistically significant favorite bias that marginally exceeds its own break-even threshold, which is evidence against universal robustness and is treated here as a finding rather than as a footnote.</w:t>
       </w:r>
     </w:p>
     <w:p>
@@ -3706,7 +3736,22 @@
           <w:sz w:val="22"/>
           <w:szCs w:val="22"/>
         </w:rPr>
-        <w:t xml:space="preserve">Dependence is the more serious concern, and the primary estimate is unmoved by it. Table 4 re-estimates the same gap under variance estimators that allow correlation within seasons and within teams. The point estimate is +0.58 points in every specification by construction; what changes is the standard error, which ranges from 0.39 to 0.53 points against the Poisson-binomial value of 0.47. No estimator rejects calibration. A team-blocked bootstrap over 32 favorite teams gives a 95 percent interval of -0.52 to +1.57 points, wider than the season-blocked interval of -0.19 to +1.26 and still containing zero.</w:t>
+        <w:t xml:space="preserve">Dependence is the more serious concern, and the primary estimate is unmoved by it. The most credible single check is the team-blocked bootstrap, because it resamples 32 favorite teams rather than 13 seasons and therefore does not depend on asymptotics that fail at small cluster counts. It gives a 95 percent interval of -0.52 to +1.57 percentage points, wider than the season-blocked interval of -0.19 to +1.26, and containing zero.</w:t>
+      </w:r>
+    </w:p>
+    <w:p>
+      <w:pPr>
+        <w:spacing w:after="160" w:line="340"/>
+        <w:jc w:val="both"/>
+      </w:pPr>
+      <w:r>
+        <w:rPr>
+          <w:rFonts w:ascii="Georgia" w:cs="Georgia" w:eastAsia="Georgia" w:hAnsi="Georgia"/>
+          <w:color w:val="1a1a1a"/>
+          <w:sz w:val="22"/>
+          <w:szCs w:val="22"/>
+        </w:rPr>
+        <w:t xml:space="preserve">Table 4 adds the cluster-robust estimators. The point estimate is +0.58 points in every specification by construction; what changes is the standard error, which ranges from 0.39 to 0.53 points against the Poisson-binomial value of 0.47. No estimator rejects calibration. The two rows resting on 13 season clusters are reported as sensitivity checks and should not be read as reliable finite-sample inference: cluster-robust variance is asymptotic in the number of clusters, and at 13 it is known to understate variance, so the season-clustered p of .134 is if anything too small rather than too large.</w:t>
       </w:r>
     </w:p>
     <w:p>
@@ -3727,12 +3772,12 @@
         </w:tblBorders>
       </w:tblPr>
       <w:tblGrid>
-        <w:gridCol w:w="3100"/>
-        <w:gridCol w:w="1000"/>
-        <w:gridCol w:w="1000"/>
-        <w:gridCol w:w="800"/>
-        <w:gridCol w:w="800"/>
-        <w:gridCol w:w="2660"/>
+        <w:gridCol w:w="3300"/>
+        <w:gridCol w:w="900"/>
+        <w:gridCol w:w="900"/>
+        <w:gridCol w:w="750"/>
+        <w:gridCol w:w="750"/>
+        <w:gridCol w:w="2760"/>
       </w:tblGrid>
       <w:tr>
         <w:trPr>
@@ -3740,7 +3785,7 @@
         </w:trPr>
         <w:tc>
           <w:tcPr>
-            <w:tcW w:type="dxa" w:w="3100"/>
+            <w:tcW w:type="dxa" w:w="3300"/>
             <w:shd w:fill="eef1f5" w:val="clear"/>
             <w:tcMar>
               <w:top w:type="dxa" w:w="60"/>
@@ -3769,7 +3814,7 @@
         </w:tc>
         <w:tc>
           <w:tcPr>
-            <w:tcW w:type="dxa" w:w="1000"/>
+            <w:tcW w:type="dxa" w:w="900"/>
             <w:shd w:fill="eef1f5" w:val="clear"/>
             <w:tcMar>
               <w:top w:type="dxa" w:w="60"/>
@@ -3798,7 +3843,7 @@
         </w:tc>
         <w:tc>
           <w:tcPr>
-            <w:tcW w:type="dxa" w:w="1000"/>
+            <w:tcW w:type="dxa" w:w="900"/>
             <w:shd w:fill="eef1f5" w:val="clear"/>
             <w:tcMar>
               <w:top w:type="dxa" w:w="60"/>
@@ -3827,7 +3872,7 @@
         </w:tc>
         <w:tc>
           <w:tcPr>
-            <w:tcW w:type="dxa" w:w="800"/>
+            <w:tcW w:type="dxa" w:w="750"/>
             <w:shd w:fill="eef1f5" w:val="clear"/>
             <w:tcMar>
               <w:top w:type="dxa" w:w="60"/>
@@ -3856,7 +3901,7 @@
         </w:tc>
         <w:tc>
           <w:tcPr>
-            <w:tcW w:type="dxa" w:w="800"/>
+            <w:tcW w:type="dxa" w:w="750"/>
             <w:shd w:fill="eef1f5" w:val="clear"/>
             <w:tcMar>
               <w:top w:type="dxa" w:w="60"/>
@@ -3885,7 +3930,7 @@
         </w:tc>
         <w:tc>
           <w:tcPr>
-            <w:tcW w:type="dxa" w:w="2660"/>
+            <w:tcW w:type="dxa" w:w="2760"/>
             <w:shd w:fill="eef1f5" w:val="clear"/>
             <w:tcMar>
               <w:top w:type="dxa" w:w="60"/>
@@ -3916,7 +3961,7 @@
       <w:tr>
         <w:tc>
           <w:tcPr>
-            <w:tcW w:type="dxa" w:w="3100"/>
+            <w:tcW w:type="dxa" w:w="3300"/>
             <w:tcMar>
               <w:top w:type="dxa" w:w="60"/>
               <w:left w:type="dxa" w:w="90"/>
@@ -3944,7 +3989,7 @@
         </w:tc>
         <w:tc>
           <w:tcPr>
-            <w:tcW w:type="dxa" w:w="1000"/>
+            <w:tcW w:type="dxa" w:w="900"/>
             <w:tcMar>
               <w:top w:type="dxa" w:w="60"/>
               <w:left w:type="dxa" w:w="90"/>
@@ -3972,7 +4017,7 @@
         </w:tc>
         <w:tc>
           <w:tcPr>
-            <w:tcW w:type="dxa" w:w="1000"/>
+            <w:tcW w:type="dxa" w:w="900"/>
             <w:tcMar>
               <w:top w:type="dxa" w:w="60"/>
               <w:left w:type="dxa" w:w="90"/>
@@ -4000,7 +4045,7 @@
         </w:tc>
         <w:tc>
           <w:tcPr>
-            <w:tcW w:type="dxa" w:w="800"/>
+            <w:tcW w:type="dxa" w:w="750"/>
             <w:tcMar>
               <w:top w:type="dxa" w:w="60"/>
               <w:left w:type="dxa" w:w="90"/>
@@ -4028,7 +4073,7 @@
         </w:tc>
         <w:tc>
           <w:tcPr>
-            <w:tcW w:type="dxa" w:w="800"/>
+            <w:tcW w:type="dxa" w:w="750"/>
             <w:tcMar>
               <w:top w:type="dxa" w:w="60"/>
               <w:left w:type="dxa" w:w="90"/>
@@ -4056,7 +4101,7 @@
         </w:tc>
         <w:tc>
           <w:tcPr>
-            <w:tcW w:type="dxa" w:w="2660"/>
+            <w:tcW w:type="dxa" w:w="2760"/>
             <w:tcMar>
               <w:top w:type="dxa" w:w="60"/>
               <w:left w:type="dxa" w:w="90"/>
@@ -4086,7 +4131,7 @@
       <w:tr>
         <w:tc>
           <w:tcPr>
-            <w:tcW w:type="dxa" w:w="3100"/>
+            <w:tcW w:type="dxa" w:w="3300"/>
             <w:tcMar>
               <w:top w:type="dxa" w:w="60"/>
               <w:left w:type="dxa" w:w="90"/>
@@ -4114,7 +4159,7 @@
         </w:tc>
         <w:tc>
           <w:tcPr>
-            <w:tcW w:type="dxa" w:w="1000"/>
+            <w:tcW w:type="dxa" w:w="900"/>
             <w:tcMar>
               <w:top w:type="dxa" w:w="60"/>
               <w:left w:type="dxa" w:w="90"/>
@@ -4142,7 +4187,7 @@
         </w:tc>
         <w:tc>
           <w:tcPr>
-            <w:tcW w:type="dxa" w:w="1000"/>
+            <w:tcW w:type="dxa" w:w="900"/>
             <w:tcMar>
               <w:top w:type="dxa" w:w="60"/>
               <w:left w:type="dxa" w:w="90"/>
@@ -4170,7 +4215,7 @@
         </w:tc>
         <w:tc>
           <w:tcPr>
-            <w:tcW w:type="dxa" w:w="800"/>
+            <w:tcW w:type="dxa" w:w="750"/>
             <w:tcMar>
               <w:top w:type="dxa" w:w="60"/>
               <w:left w:type="dxa" w:w="90"/>
@@ -4198,7 +4243,7 @@
         </w:tc>
         <w:tc>
           <w:tcPr>
-            <w:tcW w:type="dxa" w:w="800"/>
+            <w:tcW w:type="dxa" w:w="750"/>
             <w:tcMar>
               <w:top w:type="dxa" w:w="60"/>
               <w:left w:type="dxa" w:w="90"/>
@@ -4226,7 +4271,7 @@
         </w:tc>
         <w:tc>
           <w:tcPr>
-            <w:tcW w:type="dxa" w:w="2660"/>
+            <w:tcW w:type="dxa" w:w="2760"/>
             <w:tcMar>
               <w:top w:type="dxa" w:w="60"/>
               <w:left w:type="dxa" w:w="90"/>
@@ -4256,7 +4301,7 @@
       <w:tr>
         <w:tc>
           <w:tcPr>
-            <w:tcW w:type="dxa" w:w="3100"/>
+            <w:tcW w:type="dxa" w:w="3300"/>
             <w:tcMar>
               <w:top w:type="dxa" w:w="60"/>
               <w:left w:type="dxa" w:w="90"/>
@@ -4278,13 +4323,13 @@
                 <w:sz w:val="17"/>
                 <w:szCs w:val="17"/>
               </w:rPr>
-              <w:t xml:space="preserve">Clustered by season</w:t>
-            </w:r>
-          </w:p>
-        </w:tc>
-        <w:tc>
-          <w:tcPr>
-            <w:tcW w:type="dxa" w:w="1000"/>
+              <w:t xml:space="preserve">Clustered by season (13 clusters, unreliable)</w:t>
+            </w:r>
+          </w:p>
+        </w:tc>
+        <w:tc>
+          <w:tcPr>
+            <w:tcW w:type="dxa" w:w="900"/>
             <w:tcMar>
               <w:top w:type="dxa" w:w="60"/>
               <w:left w:type="dxa" w:w="90"/>
@@ -4312,7 +4357,7 @@
         </w:tc>
         <w:tc>
           <w:tcPr>
-            <w:tcW w:type="dxa" w:w="1000"/>
+            <w:tcW w:type="dxa" w:w="900"/>
             <w:tcMar>
               <w:top w:type="dxa" w:w="60"/>
               <w:left w:type="dxa" w:w="90"/>
@@ -4340,7 +4385,7 @@
         </w:tc>
         <w:tc>
           <w:tcPr>
-            <w:tcW w:type="dxa" w:w="800"/>
+            <w:tcW w:type="dxa" w:w="750"/>
             <w:tcMar>
               <w:top w:type="dxa" w:w="60"/>
               <w:left w:type="dxa" w:w="90"/>
@@ -4368,7 +4413,7 @@
         </w:tc>
         <w:tc>
           <w:tcPr>
-            <w:tcW w:type="dxa" w:w="800"/>
+            <w:tcW w:type="dxa" w:w="750"/>
             <w:tcMar>
               <w:top w:type="dxa" w:w="60"/>
               <w:left w:type="dxa" w:w="90"/>
@@ -4396,7 +4441,7 @@
         </w:tc>
         <w:tc>
           <w:tcPr>
-            <w:tcW w:type="dxa" w:w="2660"/>
+            <w:tcW w:type="dxa" w:w="2760"/>
             <w:tcMar>
               <w:top w:type="dxa" w:w="60"/>
               <w:left w:type="dxa" w:w="90"/>
@@ -4426,7 +4471,7 @@
       <w:tr>
         <w:tc>
           <w:tcPr>
-            <w:tcW w:type="dxa" w:w="3100"/>
+            <w:tcW w:type="dxa" w:w="3300"/>
             <w:tcMar>
               <w:top w:type="dxa" w:w="60"/>
               <w:left w:type="dxa" w:w="90"/>
@@ -4454,7 +4499,7 @@
         </w:tc>
         <w:tc>
           <w:tcPr>
-            <w:tcW w:type="dxa" w:w="1000"/>
+            <w:tcW w:type="dxa" w:w="900"/>
             <w:tcMar>
               <w:top w:type="dxa" w:w="60"/>
               <w:left w:type="dxa" w:w="90"/>
@@ -4482,7 +4527,7 @@
         </w:tc>
         <w:tc>
           <w:tcPr>
-            <w:tcW w:type="dxa" w:w="1000"/>
+            <w:tcW w:type="dxa" w:w="900"/>
             <w:tcMar>
               <w:top w:type="dxa" w:w="60"/>
               <w:left w:type="dxa" w:w="90"/>
@@ -4510,7 +4555,7 @@
         </w:tc>
         <w:tc>
           <w:tcPr>
-            <w:tcW w:type="dxa" w:w="800"/>
+            <w:tcW w:type="dxa" w:w="750"/>
             <w:tcMar>
               <w:top w:type="dxa" w:w="60"/>
               <w:left w:type="dxa" w:w="90"/>
@@ -4538,7 +4583,7 @@
         </w:tc>
         <w:tc>
           <w:tcPr>
-            <w:tcW w:type="dxa" w:w="800"/>
+            <w:tcW w:type="dxa" w:w="750"/>
             <w:tcMar>
               <w:top w:type="dxa" w:w="60"/>
               <w:left w:type="dxa" w:w="90"/>
@@ -4566,7 +4611,7 @@
         </w:tc>
         <w:tc>
           <w:tcPr>
-            <w:tcW w:type="dxa" w:w="2660"/>
+            <w:tcW w:type="dxa" w:w="2760"/>
             <w:tcMar>
               <w:top w:type="dxa" w:w="60"/>
               <w:left w:type="dxa" w:w="90"/>
@@ -4596,7 +4641,7 @@
       <w:tr>
         <w:tc>
           <w:tcPr>
-            <w:tcW w:type="dxa" w:w="3100"/>
+            <w:tcW w:type="dxa" w:w="3300"/>
             <w:tcMar>
               <w:top w:type="dxa" w:w="60"/>
               <w:left w:type="dxa" w:w="90"/>
@@ -4624,7 +4669,7 @@
         </w:tc>
         <w:tc>
           <w:tcPr>
-            <w:tcW w:type="dxa" w:w="1000"/>
+            <w:tcW w:type="dxa" w:w="900"/>
             <w:tcMar>
               <w:top w:type="dxa" w:w="60"/>
               <w:left w:type="dxa" w:w="90"/>
@@ -4652,7 +4697,7 @@
         </w:tc>
         <w:tc>
           <w:tcPr>
-            <w:tcW w:type="dxa" w:w="1000"/>
+            <w:tcW w:type="dxa" w:w="900"/>
             <w:tcMar>
               <w:top w:type="dxa" w:w="60"/>
               <w:left w:type="dxa" w:w="90"/>
@@ -4680,7 +4725,7 @@
         </w:tc>
         <w:tc>
           <w:tcPr>
-            <w:tcW w:type="dxa" w:w="800"/>
+            <w:tcW w:type="dxa" w:w="750"/>
             <w:tcMar>
               <w:top w:type="dxa" w:w="60"/>
               <w:left w:type="dxa" w:w="90"/>
@@ -4708,7 +4753,7 @@
         </w:tc>
         <w:tc>
           <w:tcPr>
-            <w:tcW w:type="dxa" w:w="800"/>
+            <w:tcW w:type="dxa" w:w="750"/>
             <w:tcMar>
               <w:top w:type="dxa" w:w="60"/>
               <w:left w:type="dxa" w:w="90"/>
@@ -4736,7 +4781,7 @@
         </w:tc>
         <w:tc>
           <w:tcPr>
-            <w:tcW w:type="dxa" w:w="2660"/>
+            <w:tcW w:type="dxa" w:w="2760"/>
             <w:tcMar>
               <w:top w:type="dxa" w:w="60"/>
               <w:left w:type="dxa" w:w="90"/>
@@ -4766,7 +4811,7 @@
       <w:tr>
         <w:tc>
           <w:tcPr>
-            <w:tcW w:type="dxa" w:w="3100"/>
+            <w:tcW w:type="dxa" w:w="3300"/>
             <w:tcMar>
               <w:top w:type="dxa" w:w="60"/>
               <w:left w:type="dxa" w:w="90"/>
@@ -4788,13 +4833,13 @@
                 <w:sz w:val="17"/>
                 <w:szCs w:val="17"/>
               </w:rPr>
-              <w:t xml:space="preserve">Two-way, season and favorite team</w:t>
-            </w:r>
-          </w:p>
-        </w:tc>
-        <w:tc>
-          <w:tcPr>
-            <w:tcW w:type="dxa" w:w="1000"/>
+              <w:t xml:space="preserve">Two-way, season and team (13 clusters, unreliable)</w:t>
+            </w:r>
+          </w:p>
+        </w:tc>
+        <w:tc>
+          <w:tcPr>
+            <w:tcW w:type="dxa" w:w="900"/>
             <w:tcMar>
               <w:top w:type="dxa" w:w="60"/>
               <w:left w:type="dxa" w:w="90"/>
@@ -4822,7 +4867,7 @@
         </w:tc>
         <w:tc>
           <w:tcPr>
-            <w:tcW w:type="dxa" w:w="1000"/>
+            <w:tcW w:type="dxa" w:w="900"/>
             <w:tcMar>
               <w:top w:type="dxa" w:w="60"/>
               <w:left w:type="dxa" w:w="90"/>
@@ -4850,7 +4895,7 @@
         </w:tc>
         <w:tc>
           <w:tcPr>
-            <w:tcW w:type="dxa" w:w="800"/>
+            <w:tcW w:type="dxa" w:w="750"/>
             <w:tcMar>
               <w:top w:type="dxa" w:w="60"/>
               <w:left w:type="dxa" w:w="90"/>
@@ -4878,7 +4923,7 @@
         </w:tc>
         <w:tc>
           <w:tcPr>
-            <w:tcW w:type="dxa" w:w="800"/>
+            <w:tcW w:type="dxa" w:w="750"/>
             <w:tcMar>
               <w:top w:type="dxa" w:w="60"/>
               <w:left w:type="dxa" w:w="90"/>
@@ -4906,7 +4951,7 @@
         </w:tc>
         <w:tc>
           <w:tcPr>
-            <w:tcW w:type="dxa" w:w="2660"/>
+            <w:tcW w:type="dxa" w:w="2760"/>
             <w:tcMar>
               <w:top w:type="dxa" w:w="60"/>
               <w:left w:type="dxa" w:w="90"/>
@@ -4948,7 +4993,7 @@
           <w:sz w:val="17"/>
           <w:szCs w:val="17"/>
         </w:rPr>
-        <w:t xml:space="preserve">Table 4. The primary calibration gap under six variance estimators. The gap is +0.58 pp throughout; only its standard error changes. None rejects calibration at .05.</w:t>
+        <w:t xml:space="preserve">Table 4. The primary calibration gap under six variance estimators. The gap is +0.58 pp throughout; only its standard error changes, and none rejects calibration at .05. Estimators built on 13 season clusters are flagged: cluster-robust variance is asymptotic in the cluster count and is not reliable at that number. The team-blocked bootstrap over 32 clusters, 95% CI -0.52 to +1.57 pp, is the more dependable check.</w:t>
       </w:r>
     </w:p>
     <w:p>
@@ -4978,7 +5023,22 @@
           <w:sz w:val="22"/>
           <w:szCs w:val="22"/>
         </w:rPr>
-        <w:t xml:space="preserve">Vig removal is the assumption the whole analysis rests on, so four alternatives to proportional normalization were run. Under additive normalization each side gives up the same number of probability points. Under power normalization each raw probability is raised to a common exponent. Shin (1993) prices against a share of insider money, which loads more margin onto longshots; for a two-outcome book Shin's solution turns out to coincide exactly with the additive rule, which was verified symbolically to forty decimal digits and numerically across the whole sample. Under the constant-odds-ratio rule the quoted and fair odds differ by a common factor.</w:t>
+        <w:t xml:space="preserve">Vig removal is the assumption the whole analysis rests on, so four alternatives to proportional normalization were run. Under additive normalization each side gives up the same number of probability points. Under power normalization each raw probability is raised to a common exponent chosen so the pair sums to one. Under the constant-odds-ratio rule the quoted and fair odds differ by a common factor. Shin (1993) prices against a share of insider money, which is designed to load more margin onto longshots.</w:t>
+      </w:r>
+    </w:p>
+    <w:p>
+      <w:pPr>
+        <w:spacing w:after="160" w:line="340"/>
+        <w:jc w:val="both"/>
+      </w:pPr>
+      <w:r>
+        <w:rPr>
+          <w:rFonts w:ascii="Georgia" w:cs="Georgia" w:eastAsia="Georgia" w:hAnsi="Georgia"/>
+          <w:color w:val="1a1a1a"/>
+          <w:sz w:val="22"/>
+          <w:szCs w:val="22"/>
+        </w:rPr>
+        <w:t xml:space="preserve">Shin turns out to be redundant here. For a two-outcome book its solution coincides exactly with the additive rule, because the sum constraint together with Shin's difference-preserving property leaves only one admissible pair. Appendix A gives the derivation and verifies every step against the sample at machine precision; the recovered insider share ranges from 0.4 to 7.2 percent, so these are genuine Shin solutions rather than a degenerate case. The two rules separate again with three or more outcomes.</w:t>
       </w:r>
     </w:p>
     <w:p>
@@ -6433,7 +6493,22 @@
           <w:sz w:val="22"/>
           <w:szCs w:val="22"/>
         </w:rPr>
-        <w:t xml:space="preserve">The headline reading survives, with one qualification stated plainly. Four of the five rules leave the gap below its own break-even threshold and none of those four is significant at .05. The fifth, power normalization, produces a gap of -1.31 points against a 1.24-point threshold, and it is significant at p = .004. Under that rule alone the sample would show a small, statistically detectable favorite bias marginally above the level a bettor would need to overcome, in the direction of betting underdogs, with a margin over break-even of seven hundredths of a percentage point. Power normalization is also the rule that behaves least plausibly at extreme prices, pushing heavy favorites toward implied probabilities above what any of the other rules produce. The honest summary is that the conclusion is robust to the normalization choice under four of five rules and is not universal across all of them.</w:t>
+        <w:t xml:space="preserve">The result is that the primary conclusion is robust to four of five normalization rules examined, but power normalization produces a statistically significant favorite bias that marginally exceeds its own estimated break-even threshold. Four rules leave the gap below their own threshold and none of those four is significant at .05. Power normalization gives -1.31 points against a 1.24-point threshold at p = .004: a detectable favorite bias, in the direction of betting underdogs, clearing the economic bar by seven hundredths of a percentage point.</w:t>
+      </w:r>
+    </w:p>
+    <w:p>
+      <w:pPr>
+        <w:spacing w:after="160" w:line="340"/>
+        <w:jc w:val="both"/>
+      </w:pPr>
+      <w:r>
+        <w:rPr>
+          <w:rFonts w:ascii="Georgia" w:cs="Georgia" w:eastAsia="Georgia" w:hAnsi="Georgia"/>
+          <w:color w:val="1a1a1a"/>
+          <w:sz w:val="22"/>
+          <w:szCs w:val="22"/>
+        </w:rPr>
+        <w:t xml:space="preserve">Two reasons are offered for regarding that specification as the least persuasive of the five, and neither is that it produced an inconvenient answer. First, raising probabilities to a common exponent is the rule with the least interpretation: it is a curve-fitting device, whereas proportional preserves relative pricing, additive imposes an equal margin, and Shin follows from a model of insider money. Second, it behaves worst where the sample is thinnest, pushing heavy favorites to higher implied probabilities than any other rule and thereby manufacturing most of the gap in exactly the region with the fewest games. Neither reason is decisive. A reader who prefers power normalization should read this sample as showing a small, marginally exploitable favorite bias, and that reading is legitimate on the evidence presented here.</w:t>
       </w:r>
     </w:p>
     <w:p>
@@ -6712,7 +6787,22 @@
           <w:sz w:val="22"/>
           <w:szCs w:val="22"/>
         </w:rPr>
-        <w:t xml:space="preserve">Read together with Table 5, the more durable contribution is methodological. An analyst who compares outcomes with raw implied probabilities in this sample finds a 2.5-point favorite bias at z = -5.90 and would reasonably report it as a behavioral result. It is the margin. A pre-specified, adequately powered, economically anchored calibration test can tell those two things apart, and that is the part of this design worth reusing.</w:t>
+        <w:t xml:space="preserve">Read together with Table 5, the more durable contribution is methodological, and it is larger than the vig artifact alone. Three treatments of the same 15,351 games give an estimated favorite bias of -2.50 points at p &lt; .001 with raw probabilities, +0.58 points at p = .223 under proportional normalization, and -1.31 points at p = .004 under power normalization. The existence, the magnitude and the sign of the estimate all move with a modeling choice that most papers in this literature make in a single sentence and never revisit.</w:t>
+      </w:r>
+    </w:p>
+    <w:p>
+      <w:pPr>
+        <w:spacing w:after="160" w:line="340"/>
+        <w:jc w:val="both"/>
+      </w:pPr>
+      <w:r>
+        <w:rPr>
+          <w:rFonts w:ascii="Georgia" w:cs="Georgia" w:eastAsia="Georgia" w:hAnsi="Georgia"/>
+          <w:color w:val="1a1a1a"/>
+          <w:sz w:val="22"/>
+          <w:szCs w:val="22"/>
+        </w:rPr>
+        <w:t xml:space="preserve">That is the finding worth carrying forward. An analyst who compares outcomes with raw implied probabilities here finds a 2.5-point favorite bias and would reasonably report it as behavioral; it is the bookmaker's margin. An analyst who picks a normalization rule without stating why can land on either side of zero. A pre-specified design with an economic anchor and a power justification does not make the choice for you, but it makes the consequences of the choice visible, and it is the part of this design most worth reusing.</w:t>
       </w:r>
     </w:p>
     <w:p>
@@ -6849,7 +6939,7 @@
           <w:sz w:val="22"/>
           <w:szCs w:val="22"/>
         </w:rPr>
-        <w:t xml:space="preserve">For researchers, the design points a way past a recurring problem in the literature, where underpowered bucket tests produce results, in either direction, that cannot support the conclusions drawn from them, and where a step as ordinary as removing the vig determines the sign of the headline finding.</w:t>
+        <w:t xml:space="preserve">For researchers, the sharper conclusion is about method. A pre-specified, economically anchored calibration test under proportional normalization finds no meaningful aggregate favorite bias in this series, and that finding survives correction for dependence. But the estimated existence and even the direction of favorite bias here depend materially on how the bookmaker's margin is removed, and that dependence is invisible to the underpowered single-specification bucket tests this literature has relied on. Reporting the normalization sensitivity is not a caveat attached to the result. On this evidence it is the result.</w:t>
       </w:r>
     </w:p>
     <w:p>
@@ -6895,7 +6985,7 @@
           <w:sz w:val="22"/>
           <w:szCs w:val="22"/>
         </w:rPr>
-        <w:t xml:space="preserve">Code. All scripts required to reproduce the reported results, tables and figures are available at https://github.com/jacobburdier05/nba-moneyline-calibration. A single command runs verification, dataset construction, the confirmatory analyses, the robustness analyses and the figures in about one minute.</w:t>
+        <w:t xml:space="preserve">Code. All scripts required to reproduce the reported results, tables and figures are available at https://github.com/jacobburdier05/nba-moneyline-calibration. A single command runs verification, dataset construction, the confirmatory analyses, the robustness analyses, the figures and the Appendix A verification in about three minutes.</w:t>
       </w:r>
     </w:p>
     <w:p>
@@ -6910,7 +7000,288 @@
           <w:sz w:val="22"/>
           <w:szCs w:val="22"/>
         </w:rPr>
-        <w:t xml:space="preserve">Analysis plan. The pre-specified analysis plan is published in the same repository under preregistration/analysis_plan.md, with a provenance note stating when it was transcribed into the repository and what evidence does and does not exist for the date it was frozen.</w:t>
+        <w:t xml:space="preserve">Analysis plan. The pre-specified analysis plan is published in the same repository under preregistration/analysis_plan.md, with a provenance note stating when it was transcribed into the repository and what evidence does and does not exist for the date it was frozen. It fixes proportional normalization as the primary rule, which is why that choice is not a post hoc selection.</w:t>
+      </w:r>
+    </w:p>
+    <w:p>
+      <w:pPr>
+        <w:spacing w:after="140" w:before="320" w:line="300"/>
+      </w:pPr>
+      <w:r>
+        <w:rPr>
+          <w:rFonts w:ascii="Georgia" w:cs="Georgia" w:eastAsia="Georgia" w:hAnsi="Georgia"/>
+          <w:b/>
+          <w:bCs/>
+          <w:color w:val="1a1a2e"/>
+          <w:sz w:val="28"/>
+          <w:szCs w:val="28"/>
+        </w:rPr>
+        <w:t xml:space="preserve">Appendix A. Shin's normalization equals the additive rule for a two-outcome book</w:t>
+      </w:r>
+    </w:p>
+    <w:p>
+      <w:pPr>
+        <w:spacing w:after="160" w:line="340"/>
+        <w:jc w:val="both"/>
+      </w:pPr>
+      <w:r>
+        <w:rPr>
+          <w:rFonts w:ascii="Georgia" w:cs="Georgia" w:eastAsia="Georgia" w:hAnsi="Georgia"/>
+          <w:color w:val="1a1a1a"/>
+          <w:sz w:val="22"/>
+          <w:szCs w:val="22"/>
+        </w:rPr>
+        <w:t xml:space="preserve">Section 5.4 reports that Shin (1993) and the additive rule give identical results in Table 5. Because that claim is unusual and it affects how Table 5 should be read, the derivation is given here rather than asserted. Every step is verified against the sample by src/shin_equivalence_proof.py in the replication materials.</w:t>
+      </w:r>
+    </w:p>
+    <w:p>
+      <w:pPr>
+        <w:spacing w:after="160" w:line="340"/>
+        <w:jc w:val="both"/>
+      </w:pPr>
+      <w:r>
+        <w:rPr>
+          <w:rFonts w:ascii="Georgia" w:cs="Georgia" w:eastAsia="Georgia" w:hAnsi="Georgia"/>
+          <w:color w:val="1a1a1a"/>
+          <w:sz w:val="22"/>
+          <w:szCs w:val="22"/>
+        </w:rPr>
+        <w:t xml:space="preserve">Let q1 and q2 be the raw implied probabilities of the two sides and P = q1 + q2 the booksum, with P greater than one. Shin sets</w:t>
+      </w:r>
+    </w:p>
+    <w:p>
+      <w:pPr>
+        <w:spacing w:after="80" w:before="80" w:line="300"/>
+        <w:jc w:val="center"/>
+      </w:pPr>
+      <w:r>
+        <w:rPr>
+          <w:rFonts w:ascii="Georgia" w:cs="Georgia" w:eastAsia="Georgia" w:hAnsi="Georgia"/>
+          <w:i/>
+          <w:iCs/>
+          <w:color w:val="1a1a1a"/>
+          <w:sz w:val="22"/>
+          <w:szCs w:val="22"/>
+        </w:rPr>
+        <w:t xml:space="preserve">pi_i = [ sqrt( z^2 + 4(1 - z) q_i^2 / P ) - z ] / ( 2(1 - z) )</w:t>
+      </w:r>
+    </w:p>
+    <w:p>
+      <w:pPr>
+        <w:spacing w:after="160" w:line="340"/>
+        <w:jc w:val="both"/>
+      </w:pPr>
+      <w:r>
+        <w:rPr>
+          <w:rFonts w:ascii="Georgia" w:cs="Georgia" w:eastAsia="Georgia" w:hAnsi="Georgia"/>
+          <w:color w:val="1a1a1a"/>
+          <w:sz w:val="22"/>
+          <w:szCs w:val="22"/>
+        </w:rPr>
+        <w:t xml:space="preserve">with z chosen so the pair sums to one. The additive rule sets pi_i = q_i - (P - 1)/2.</w:t>
+      </w:r>
+    </w:p>
+    <w:p>
+      <w:pPr>
+        <w:spacing w:after="100" w:before="240" w:line="300"/>
+      </w:pPr>
+      <w:r>
+        <w:rPr>
+          <w:rFonts w:ascii="Georgia" w:cs="Georgia" w:eastAsia="Georgia" w:hAnsi="Georgia"/>
+          <w:b/>
+          <w:bCs/>
+          <w:color w:val="2c2c54"/>
+          <w:sz w:val="24"/>
+          <w:szCs w:val="24"/>
+        </w:rPr>
+        <w:t xml:space="preserve">Step 1. Invert for z</w:t>
+      </w:r>
+    </w:p>
+    <w:p>
+      <w:pPr>
+        <w:spacing w:after="160" w:line="340"/>
+        <w:jc w:val="both"/>
+      </w:pPr>
+      <w:r>
+        <w:rPr>
+          <w:rFonts w:ascii="Georgia" w:cs="Georgia" w:eastAsia="Georgia" w:hAnsi="Georgia"/>
+          <w:color w:val="1a1a1a"/>
+          <w:sz w:val="22"/>
+          <w:szCs w:val="22"/>
+        </w:rPr>
+        <w:t xml:space="preserve">Rearrange to 2 pi (1 - z) + z = sqrt( z^2 + 4(1 - z) q^2 / P ) and square both sides. The z-squared terms cancel, and dividing through by 4(1 - z), which is nonzero for z below one, leaves</w:t>
+      </w:r>
+    </w:p>
+    <w:p>
+      <w:pPr>
+        <w:spacing w:after="80" w:before="80" w:line="300"/>
+        <w:jc w:val="center"/>
+      </w:pPr>
+      <w:r>
+        <w:rPr>
+          <w:rFonts w:ascii="Georgia" w:cs="Georgia" w:eastAsia="Georgia" w:hAnsi="Georgia"/>
+          <w:i/>
+          <w:iCs/>
+          <w:color w:val="1a1a1a"/>
+          <w:sz w:val="22"/>
+          <w:szCs w:val="22"/>
+        </w:rPr>
+        <w:t xml:space="preserve">pi^2 + z pi (1 - pi) = q^2 / P,      so     z = ( q^2 / P - pi^2 ) / ( pi (1 - pi) )</w:t>
+      </w:r>
+    </w:p>
+    <w:p>
+      <w:pPr>
+        <w:spacing w:after="100" w:before="240" w:line="300"/>
+      </w:pPr>
+      <w:r>
+        <w:rPr>
+          <w:rFonts w:ascii="Georgia" w:cs="Georgia" w:eastAsia="Georgia" w:hAnsi="Georgia"/>
+          <w:b/>
+          <w:bCs/>
+          <w:color w:val="2c2c54"/>
+          <w:sz w:val="24"/>
+          <w:szCs w:val="24"/>
+        </w:rPr>
+        <w:t xml:space="preserve">Step 2. Require both sides to return the same z</w:t>
+      </w:r>
+    </w:p>
+    <w:p>
+      <w:pPr>
+        <w:spacing w:after="160" w:line="340"/>
+        <w:jc w:val="both"/>
+      </w:pPr>
+      <w:r>
+        <w:rPr>
+          <w:rFonts w:ascii="Georgia" w:cs="Georgia" w:eastAsia="Georgia" w:hAnsi="Georgia"/>
+          <w:color w:val="1a1a1a"/>
+          <w:sz w:val="22"/>
+          <w:szCs w:val="22"/>
+        </w:rPr>
+        <w:t xml:space="preserve">Shin's z is a single property of the book, so the expression above must give the same value for each side. Because the pair sums to one, 1 - pi_1 equals pi_2 and 1 - pi_2 equals pi_1, so both denominators equal pi_1 pi_2 and the requirement reduces to equal numerators:</w:t>
+      </w:r>
+    </w:p>
+    <w:p>
+      <w:pPr>
+        <w:spacing w:after="80" w:before="80" w:line="300"/>
+        <w:jc w:val="center"/>
+      </w:pPr>
+      <w:r>
+        <w:rPr>
+          <w:rFonts w:ascii="Georgia" w:cs="Georgia" w:eastAsia="Georgia" w:hAnsi="Georgia"/>
+          <w:i/>
+          <w:iCs/>
+          <w:color w:val="1a1a1a"/>
+          <w:sz w:val="22"/>
+          <w:szCs w:val="22"/>
+        </w:rPr>
+        <w:t xml:space="preserve">( q1^2 - q2^2 ) / P = pi_1^2 - pi_2^2,   that is   (q1 - q2)(q1 + q2)/P = (pi_1 - pi_2)(pi_1 + pi_2)</w:t>
+      </w:r>
+    </w:p>
+    <w:p>
+      <w:pPr>
+        <w:spacing w:after="160" w:line="340"/>
+        <w:jc w:val="both"/>
+      </w:pPr>
+      <w:r>
+        <w:rPr>
+          <w:rFonts w:ascii="Georgia" w:cs="Georgia" w:eastAsia="Georgia" w:hAnsi="Georgia"/>
+          <w:color w:val="1a1a1a"/>
+          <w:sz w:val="22"/>
+          <w:szCs w:val="22"/>
+        </w:rPr>
+        <w:t xml:space="preserve">Since q1 + q2 = P by definition and pi_1 + pi_2 = 1 by the constraint, this collapses to q1 - q2 = pi_1 - pi_2. Shin's rule preserves the difference of the raw probabilities.</w:t>
+      </w:r>
+    </w:p>
+    <w:p>
+      <w:pPr>
+        <w:spacing w:after="100" w:before="240" w:line="300"/>
+      </w:pPr>
+      <w:r>
+        <w:rPr>
+          <w:rFonts w:ascii="Georgia" w:cs="Georgia" w:eastAsia="Georgia" w:hAnsi="Georgia"/>
+          <w:b/>
+          <w:bCs/>
+          <w:color w:val="2c2c54"/>
+          <w:sz w:val="24"/>
+          <w:szCs w:val="24"/>
+        </w:rPr>
+        <w:t xml:space="preserve">Step 3. Solve</w:t>
+      </w:r>
+    </w:p>
+    <w:p>
+      <w:pPr>
+        <w:spacing w:after="160" w:line="340"/>
+        <w:jc w:val="both"/>
+      </w:pPr>
+      <w:r>
+        <w:rPr>
+          <w:rFonts w:ascii="Georgia" w:cs="Georgia" w:eastAsia="Georgia" w:hAnsi="Georgia"/>
+          <w:color w:val="1a1a1a"/>
+          <w:sz w:val="22"/>
+          <w:szCs w:val="22"/>
+        </w:rPr>
+        <w:t xml:space="preserve">Two linear conditions now pin the pair down uniquely: the sum is one and the difference is q1 - q2. Therefore pi_1 = (1 + q1 - q2)/2. The additive rule gives q1 - (q1 + q2 - 1)/2, which is the same expression. The two rules coincide.</w:t>
+      </w:r>
+    </w:p>
+    <w:p>
+      <w:pPr>
+        <w:spacing w:after="100" w:before="240" w:line="300"/>
+      </w:pPr>
+      <w:r>
+        <w:rPr>
+          <w:rFonts w:ascii="Georgia" w:cs="Georgia" w:eastAsia="Georgia" w:hAnsi="Georgia"/>
+          <w:b/>
+          <w:bCs/>
+          <w:color w:val="2c2c54"/>
+          <w:sz w:val="24"/>
+          <w:szCs w:val="24"/>
+        </w:rPr>
+        <w:t xml:space="preserve">Numerical verification and scope</w:t>
+      </w:r>
+    </w:p>
+    <w:p>
+      <w:pPr>
+        <w:spacing w:after="160" w:line="340"/>
+        <w:jc w:val="both"/>
+      </w:pPr>
+      <w:r>
+        <w:rPr>
+          <w:rFonts w:ascii="Georgia" w:cs="Georgia" w:eastAsia="Georgia" w:hAnsi="Georgia"/>
+          <w:color w:val="1a1a1a"/>
+          <w:sz w:val="22"/>
+          <w:szCs w:val="22"/>
+        </w:rPr>
+        <w:t xml:space="preserve">Across the 15,350 games in the sample with a positive margin, the maximum absolute error is 3.3e-16 for the difference-preserving property in step 2, 2.8e-16 for the closed form in step 3, and 2.8e-16 for the equivalence itself, all at the limit of double precision. The recovered insider share z is consistent across the two sides to 1.5e-14 and ranges from 0.0037 to 0.0718 with a mean of 0.0384, so these are genuine interior Shin solutions and not a degenerate corner. One game in the archive is quoted with a booksum below one, where Shin's model has no valid solution; it is excluded from this appendix and falls back to proportional in Table 5.</w:t>
+      </w:r>
+    </w:p>
+    <w:p>
+      <w:pPr>
+        <w:spacing w:after="160" w:line="340"/>
+        <w:jc w:val="both"/>
+      </w:pPr>
+      <w:r>
+        <w:rPr>
+          <w:rFonts w:ascii="Georgia" w:cs="Georgia" w:eastAsia="Georgia" w:hAnsi="Georgia"/>
+          <w:color w:val="1a1a1a"/>
+          <w:sz w:val="22"/>
+          <w:szCs w:val="22"/>
+        </w:rPr>
+        <w:t xml:space="preserve">The equivalence does not mean the two rules express the same idea. Shin's is derived from a bookmaker pricing against insider money and is intended to load margin onto longshots; the additive rule is a mechanical convention with no behavioral content. They coincide only because a two-outcome market leaves a single degree of freedom once the sum constraint and the difference-preserving property are both imposed. With three or more outcomes they separate. The practical consequence for this paper is narrow: a reader who asks why Shin was not tested should know that it was, and that in this market it is the additive row.</w:t>
+      </w:r>
+    </w:p>
+    <w:p>
+      <w:pPr>
+        <w:spacing w:after="160" w:line="340"/>
+        <w:jc w:val="both"/>
+      </w:pPr>
+      <w:r>
+        <w:rPr>
+          <w:rFonts w:ascii="Georgia" w:cs="Georgia" w:eastAsia="Georgia" w:hAnsi="Georgia"/>
+          <w:color w:val="1a1a1a"/>
+          <w:sz w:val="22"/>
+          <w:szCs w:val="22"/>
+        </w:rPr>
+        <w:t xml:space="preserve">One implementation note, recorded because it produced wrong numbers before it was caught. Evaluated directly, the numerator sqrt(z^2 + a) - z is a difference of nearly equal quantities as z approaches one, and in double precision it loses most of its significant digits, which sends the root finder to values whose probabilities sum to roughly 0.98 rather than one. Multiplying by the conjugate gives the algebraically identical and numerically stable form pi = 2 q^2 / [ P ( sqrt(z^2 + a) + z ) ], which is what the code uses.</w:t>
       </w:r>
     </w:p>
     <w:p>

</xml_diff>

<commit_message>
Manuscript: remove the unsourced literature range, state the MDE approximation, soften four overstated phrases
</commit_message>
<xml_diff>
--- a/paper/NBA_Moneyline_Calibration_Paper.docx
+++ b/paper/NBA_Moneyline_Calibration_Paper.docx
@@ -154,7 +154,7 @@
           <w:sz w:val="22"/>
           <w:szCs w:val="22"/>
         </w:rPr>
-        <w:t xml:space="preserve">Taken together the more durable finding is methodological. On the same 15,351 games, raw implied probabilities imply a favorite bias of -2.50 points at p &lt; .001, proportional normalization implies +0.58 points at p = .223, and power normalization implies -1.31 points at p = .004. The existence, size and even the sign of estimated favorite bias in this market depend materially on how the bookmaker's margin is removed, and a pre-specified, adequately powered, economically anchored design is what makes that dependence visible instead of invisible.</w:t>
+        <w:t xml:space="preserve">Taken together the more durable finding is methodological. On the same 15,351 games, raw implied probabilities imply a favorite bias of -2.50 points at p &lt; .001, proportional normalization implies +0.58 points at p = .223, and power normalization implies -1.31 points at p = .004. The existence, size and even the sign of estimated favorite bias in this market depend materially on how the bookmaker's margin is removed, and a pre-specified design, adequately powered for its primary estimand and anchored to an economic threshold, is what makes that dependence visible instead of invisible.</w:t>
       </w:r>
     </w:p>
     <w:p>
@@ -228,7 +228,7 @@
           <w:sz w:val="22"/>
           <w:szCs w:val="22"/>
         </w:rPr>
-        <w:t xml:space="preserve">A short power calculation makes the issue clear. A 74-game group of favorites priced near .85, the kind of narrow bucket often used in these studies, has only about 7 percent power to detect a 1.7 percentage-point pricing deviation. Even samples of several hundred games often miss moderate deviations. That creates two risks: a significant result from a small group can turn on one or two outcomes, and a null result can be uninformative because the test was never able to detect the effect in the first place.</w:t>
+        <w:t xml:space="preserve">A short power calculation makes the issue clear. Take a 74-game group of favorites priced near .85, the kind of narrow bucket often used in these studies, and ask whether it could detect a deviation the size of the break-even margin computed later from these very prices, 3.01 percentage points. It has about 11 percent power to do so. Even samples of several hundred games often miss moderate deviations. That creates two risks: a significant result from a small group can turn on one or two outcomes, and a null result can be uninformative because the test was never able to detect the effect in the first place.</w:t>
       </w:r>
     </w:p>
     <w:p>
@@ -443,7 +443,7 @@
           <w:sz w:val="22"/>
           <w:szCs w:val="22"/>
         </w:rPr>
-        <w:t xml:space="preserve">The fourth is methodological, and it is where this paper sits. Winkelmann, Otting, Deutscher, and Makarewicz (2024) benchmark inefficiency tests against simulated and real odds and ask whether the tests themselves are up to the job. What is still missing is an NBA moneyline calibration analysis with a pre-specified comparison and an explicit power justification. This paper is not trying to rediscover favorite bias. It asks whether an adequately powered, economically anchored test can separate real favorite mispricing from the artifact created by the bookmaker's margin.</w:t>
+        <w:t xml:space="preserve">The fourth is methodological, and it is where this paper sits. Winkelmann, Otting, Deutscher, and Makarewicz (2024) benchmark inefficiency tests against simulated and real odds and ask whether the tests themselves are up to the job. What is still missing is an NBA moneyline calibration analysis with a pre-specified comparison and an explicit power justification. This paper is not trying to rediscover favorite bias. It asks whether a test adequately powered for a pre-specified estimand, and anchored to an economic threshold, can separate real favorite mispricing from the artifact created by the bookmaker's margin.</w:t>
       </w:r>
     </w:p>
     <w:p>
@@ -843,7 +843,7 @@
           <w:sz w:val="22"/>
           <w:szCs w:val="22"/>
         </w:rPr>
-        <w:t xml:space="preserve">The null result matters only if the design could have caught a deviation worth caring about, so the calculation is stated in full. Let p be the vig-free implied probability of each game in the primary group and n the number of games. The standard error of the gap is the square root of the sum of p(1 - p), divided by n. For a two-sided test at alpha, power against a true gap is the probability that the standardized estimate exceeds the critical value in either tail, and the minimum detectable effect at target power is the sum of the two critical values multiplied by the standard error. The variance is the heterogeneous per-game one rather than a single pooled value, so the calculation reflects the actual distribution of prices.</w:t>
+        <w:t xml:space="preserve">The null result matters only if the design could have caught a deviation worth caring about, so the calculation is stated in full. Let p be the vig-free implied probability of each game in the primary group and n the number of games. The standard error of the gap is the square root of the sum of p(1 - p), divided by n. For a two-sided test at alpha, power against a true gap is the probability that the standardized estimate exceeds the critical value in either tail. Under the normal approximation, the conventional two-sided minimum detectable effect at 80 percent power is the sum of the two critical values multiplied by that standard error. The variance is the heterogeneous per-game one rather than a single pooled value, so the calculation reflects the actual distribution of prices.</w:t>
       </w:r>
     </w:p>
     <w:p>
@@ -1303,7 +1303,7 @@
                 <w:sz w:val="17"/>
                 <w:szCs w:val="17"/>
               </w:rPr>
-              <w:t xml:space="preserve">Minimum detectable effect</w:t>
+              <w:t xml:space="preserve">Minimum detectable effect, normal approximation</w:t>
             </w:r>
           </w:p>
         </w:tc>
@@ -1331,7 +1331,65 @@
                 <w:sz w:val="17"/>
                 <w:szCs w:val="17"/>
               </w:rPr>
-              <w:t xml:space="preserve">1.33 pp</w:t>
+              <w:t xml:space="preserve">1.3281 pp</w:t>
+            </w:r>
+          </w:p>
+        </w:tc>
+      </w:tr>
+      <w:tr>
+        <w:tc>
+          <w:tcPr>
+            <w:tcW w:type="dxa" w:w="5400"/>
+            <w:tcMar>
+              <w:top w:type="dxa" w:w="60"/>
+              <w:left w:type="dxa" w:w="90"/>
+              <w:bottom w:type="dxa" w:w="60"/>
+              <w:right w:type="dxa" w:w="90"/>
+            </w:tcMar>
+          </w:tcPr>
+          <w:p>
+            <w:pPr>
+              <w:spacing w:after="0" w:line="240"/>
+              <w:jc w:val="left"/>
+            </w:pPr>
+            <w:r>
+              <w:rPr>
+                <w:rFonts w:ascii="Georgia" w:cs="Georgia" w:eastAsia="Georgia" w:hAnsi="Georgia"/>
+                <w:b w:val="false"/>
+                <w:bCs w:val="false"/>
+                <w:color w:val="1a1a1a"/>
+                <w:sz w:val="17"/>
+                <w:szCs w:val="17"/>
+              </w:rPr>
+              <w:t xml:space="preserve">Minimum detectable effect, exact Poisson-binomial</w:t>
+            </w:r>
+          </w:p>
+        </w:tc>
+        <w:tc>
+          <w:tcPr>
+            <w:tcW w:type="dxa" w:w="3960"/>
+            <w:tcMar>
+              <w:top w:type="dxa" w:w="60"/>
+              <w:left w:type="dxa" w:w="90"/>
+              <w:bottom w:type="dxa" w:w="60"/>
+              <w:right w:type="dxa" w:w="90"/>
+            </w:tcMar>
+          </w:tcPr>
+          <w:p>
+            <w:pPr>
+              <w:spacing w:after="0" w:line="240"/>
+              <w:jc w:val="right"/>
+            </w:pPr>
+            <w:r>
+              <w:rPr>
+                <w:rFonts w:ascii="Georgia" w:cs="Georgia" w:eastAsia="Georgia" w:hAnsi="Georgia"/>
+                <w:b w:val="false"/>
+                <w:bCs w:val="false"/>
+                <w:color w:val="1a1a1a"/>
+                <w:sz w:val="17"/>
+                <w:szCs w:val="17"/>
+              </w:rPr>
+              <w:t xml:space="preserve">1.3242 pp</w:t>
             </w:r>
           </w:p>
         </w:tc>
@@ -1467,7 +1525,22 @@
           <w:sz w:val="17"/>
           <w:szCs w:val="17"/>
         </w:rPr>
-        <w:t xml:space="preserve">Table 1. Power parameters for the primary test. The minimum detectable effect is the sum of the two critical values multiplied by the standard error. Figure 3 plots the full power curve behind these numbers.</w:t>
+        <w:t xml:space="preserve">Table 1. Power parameters for the primary test. The normal-approximation MDE is the sum of the two critical values multiplied by the standard error; the exact figure inverts the Poisson-binomial power function directly. Figure 3 plots the full power curve behind these numbers.</w:t>
+      </w:r>
+    </w:p>
+    <w:p>
+      <w:pPr>
+        <w:spacing w:after="160" w:line="340"/>
+        <w:jc w:val="both"/>
+      </w:pPr>
+      <w:r>
+        <w:rPr>
+          <w:rFonts w:ascii="Georgia" w:cs="Georgia" w:eastAsia="Georgia" w:hAnsi="Georgia"/>
+          <w:color w:val="1a1a1a"/>
+          <w:sz w:val="22"/>
+          <w:szCs w:val="22"/>
+        </w:rPr>
+        <w:t xml:space="preserve">That formula is an approximation, not an exact inversion of the Poisson-binomial power function, so the exact version was computed as a check. Building the exact Poisson-binomial distribution by discrete Fourier transform of its characteristic function gives an exact two-sided rejection region of 5,425 wins or fewer, or 5,554 or more, with true size .0484 rather than .05 because the statistic is discrete. Inverting exact power at 80 percent gives a minimum detectable effect of 1.3242 points against the normal approximation's 1.3281, a difference of four thousandths of a percentage point. The approximation is reported in the text because it is the conventional quantity; it is not doing any work the exact calculation would undo.</w:t>
       </w:r>
     </w:p>
     <w:p>
@@ -3721,7 +3794,7 @@
           <w:sz w:val="22"/>
           <w:szCs w:val="22"/>
         </w:rPr>
-        <w:t xml:space="preserve">Across seasons, no individual season rejects the null. The 13 season-level gaps range from -2.82 to +2.52 percentage points and every p value is above .10. Heterogeneity is assessed with the Cochran Q statistic in its meta-analytic form, which is a test of whether the season gaps differ from one another by more than sampling noise, not a test that the pooled gap is zero. Writing y for the season gap and w for the inverse of its Poisson-binomial null variance, Q is the sum of w times the squared deviation of y from the inverse-variance-weighted mean, referred to a chi-squared distribution on twelve degrees of freedom. Constructed that way, Q = 8.37 with p = .756 and I-squared at 0 percent, so there is no detectable variation across seasons. In the extreme tail above .90 implied probability, 756 games produce a +0.63-point gap with p = .506; its minimum detectable effect of 2.66 points sits just below its 3.02-point break-even requirement, so even the thinnest pre-specified slice is adequately powered for economically relevant bias.</w:t>
+        <w:t xml:space="preserve">Across seasons, no individual season rejects the null. The 13 season-level gaps range from -2.82 to +2.52 percentage points and every p value is above .10. Heterogeneity is assessed with the Cochran Q statistic in its meta-analytic form, which is a test of whether the season gaps differ from one another by more than sampling noise, not a test that the pooled gap is zero. Writing y for the season gap and w for the inverse of its Poisson-binomial null variance, Q is the sum of w times the squared deviation of y from the inverse-variance-weighted mean, referred to a chi-squared distribution on twelve degrees of freedom. Constructed that way, Q = 8.37 with p = .756 and I-squared at 0 percent, so there is no detectable variation across seasons. In the extreme tail above .90 implied probability, 756 games produce a +0.63-point gap with p = .506; its minimum detectable effect of 2.66 points sits just below its 3.02-point break-even requirement, so even the thinnest pre-specified slice is adequately powered for economically relevant bias in that slice.</w:t>
       </w:r>
     </w:p>
     <w:p>
@@ -6508,7 +6581,7 @@
           <w:sz w:val="22"/>
           <w:szCs w:val="22"/>
         </w:rPr>
-        <w:t xml:space="preserve">Two reasons are offered for regarding that specification as the least persuasive of the five, and neither is that it produced an inconvenient answer. First, raising probabilities to a common exponent is the rule with the least interpretation: it is a curve-fitting device, whereas proportional preserves relative pricing, additive imposes an equal margin, and Shin follows from a model of insider money. Second, it behaves worst where the sample is thinnest, pushing heavy favorites to higher implied probabilities than any other rule and thereby manufacturing most of the gap in exactly the region with the fewest games. Neither reason is decisive. A reader who prefers power normalization should read this sample as showing a small, marginally exploitable favorite bias, and that reading is legitimate on the evidence presented here.</w:t>
+        <w:t xml:space="preserve">Two reasons are offered for regarding that specification as the least persuasive of the five, and neither is that it produced an inconvenient answer. First, raising probabilities to a common exponent is a flexible transformation without the same direct behavioral or structural interpretation as the others: proportional preserves relative pricing, additive imposes an equal margin, and Shin follows from a model of insider money. Second, it departs furthest from the other rules where the sample is thinnest, pushing heavy favorites to higher implied probabilities than any other rule and thereby concentrating much of the estimated gap in the region with the fewest observations. Neither reason is decisive. A reader who prefers power normalization should read this sample as showing a small, marginally exploitable favorite bias, and that reading is legitimate on the evidence presented here.</w:t>
       </w:r>
     </w:p>
     <w:p>
@@ -6696,7 +6769,7 @@
           <w:sz w:val="17"/>
           <w:szCs w:val="17"/>
         </w:rPr>
-        <w:t xml:space="preserve">Figure 3. Power of the primary test against a true calibration gap, two-sided at alpha = .05, n = 6,840, standard error 0.474 pp from the heterogeneous per-game null variance. Marked: the 1.33-point minimum detectable effect, the 1.7 and 5.1-point ends of the range claimed in prior work, and the 3.01-point break-even requirement.</w:t>
+        <w:t xml:space="preserve">Figure 3. Power of the primary test against a true calibration gap, two-sided at alpha = .05, n = 6,840, standard error 0.474 pp from the heterogeneous per-game null variance. Every mark is computed from this sample: the observed +0.58-point gap, the 1.33-point minimum detectable effect, and the 3.01-point break-even requirement. No mark is taken from outside the dataset; see the note in section 6 on why.</w:t>
       </w:r>
     </w:p>
     <w:p>
@@ -6772,7 +6845,7 @@
           <w:sz w:val="22"/>
           <w:szCs w:val="22"/>
         </w:rPr>
-        <w:t xml:space="preserve">The design's power is what makes the null meaningful. A narrow bucket of a few dozen games could not have detected the biases commonly claimed in this literature; this design could have. Figure 3 makes the claim exact rather than rhetorical: power is 95 percent against a 1.7-point gap, the smallest commonly claimed, and effectively certain against gaps of three points or more.</w:t>
+        <w:t xml:space="preserve">The design's power is what makes the null meaningful, and Figure 3 states the claim in the only units this paper can defend. Power exceeds 99.9 percent at the 3.01-point break-even requirement, so a bias large enough to be exploitable at these prices would have been detected almost regardless of where in the range it sat. Power is 80 percent at 1.33 points, well below that threshold. A narrow bucket of a few dozen games has no comparable claim: at 74 games the same calculation gives about 11 percent.</w:t>
       </w:r>
     </w:p>
     <w:p>
@@ -6803,6 +6876,21 @@
           <w:szCs w:val="22"/>
         </w:rPr>
         <w:t xml:space="preserve">That is the finding worth carrying forward. An analyst who compares outcomes with raw implied probabilities here finds a 2.5-point favorite bias and would reasonably report it as behavioral; it is the bookmaker's margin. An analyst who picks a normalization rule without stating why can land on either side of zero. A pre-specified design with an economic anchor and a power justification does not make the choice for you, but it makes the consequences of the choice visible, and it is the part of this design most worth reusing.</w:t>
+      </w:r>
+    </w:p>
+    <w:p>
+      <w:pPr>
+        <w:spacing w:after="160" w:line="340"/>
+        <w:jc w:val="both"/>
+      </w:pPr>
+      <w:r>
+        <w:rPr>
+          <w:rFonts w:ascii="Georgia" w:cs="Georgia" w:eastAsia="Georgia" w:hAnsi="Georgia"/>
+          <w:color w:val="1a1a1a"/>
+          <w:sz w:val="22"/>
+          <w:szCs w:val="22"/>
+        </w:rPr>
+        <w:t xml:space="preserve">One thing Figure 3 deliberately does not do is mark effect sizes drawn from prior work. An earlier draft marked 1.7 and 5.1 percentage points as the smallest and largest favorite-bias effects reported in the cited literature. Those two numbers could not be traced to any source in that citation set, and the attempt to source them turned up a substantive problem rather than a clerical one. Six of the eight cited papers report rates of return or point-spread cover rates, not win-probability calibration gaps, and the two quantities are not interchangeable without the odds attached. The one literature review among them, Newall and Cortis (2021), is entirely directional and reports no effect magnitudes. Converting the classic return estimates into calibration gaps at these prices spans a far wider range than 1.7 to 5.1 and points in the opposite direction, because that work concerns parimutuel horse racing. The marks were therefore removed rather than re-sourced, and the power argument is made against this sample's own break-even threshold instead. A related caution applies to the moneyline branch of the literature generally: Woodland and Woodland (2001) is the closest antecedent, its conversion method has been questioned by Berkowitz, Depken and Gandar (2018), and the authors themselves reported in 2011 that the effect disappears in later seasons.</w:t>
       </w:r>
     </w:p>
     <w:p>
@@ -6909,7 +6997,7 @@
           <w:sz w:val="22"/>
           <w:szCs w:val="22"/>
         </w:rPr>
-        <w:t xml:space="preserve">A pre-specified, adequately powered, economically anchored test on verified data finds the archived NBA consensus moneylines in this series calibrated: over 15,351 games, favorites were priced correctly to within a fraction of the bookmaker's own margin, and the estimate holds under variance estimators that allow correlation within seasons and within teams.</w:t>
+        <w:t xml:space="preserve">A pre-specified, economically anchored test, adequately powered for its pre-specified primary estimand and run on cross-validated archival data, finds the archived NBA consensus moneylines in this series calibrated: over 15,351 games, favorites were priced correctly to within a fraction of the bookmaker's own margin, and the estimate holds under variance estimators that allow correlation within seasons and within teams.</w:t>
       </w:r>
     </w:p>
     <w:p>
@@ -7361,7 +7449,7 @@
           <w:sz w:val="20"/>
           <w:szCs w:val="20"/>
         </w:rPr>
-        <w:t xml:space="preserve">Cheung, K. C. (2015). Fixed-odds betting and traditional odds. Sports Trading Network.</w:t>
+        <w:t xml:space="preserve">Berkowitz, J. P., Depken, C. A., &amp; Gandar, J. M. (2018). The conversion of money lines into win probabilities: Reconciliations and simplifications. Journal of Sports Economics, 19(1). Working paper: https://pages.charlotte.edu/wp-content/uploads/sites/850/2012/10/wp2016-006.pdf</w:t>
       </w:r>
     </w:p>
     <w:p>
@@ -7377,7 +7465,7 @@
           <w:sz w:val="20"/>
           <w:szCs w:val="20"/>
         </w:rPr>
-        <w:t xml:space="preserve">Dotan, G. (2020). Beating the book: A machine learning approach to identifying an edge in NBA betting markets (Master's thesis, UCLA). Data repository: https://github.com/guydotan/ucla-thesis</w:t>
+        <w:t xml:space="preserve">Cheung, K. C. (2015). Fixed-odds betting and traditional odds. Sports Trading Network.</w:t>
       </w:r>
     </w:p>
     <w:p>
@@ -7393,7 +7481,7 @@
           <w:sz w:val="20"/>
           <w:szCs w:val="20"/>
         </w:rPr>
-        <w:t xml:space="preserve">Fama, E. F. (1970). Efficient capital markets: A review of theory and empirical work. The Journal of Finance, 25(2), 383-417. https://doi.org/10.2307/2325486</w:t>
+        <w:t xml:space="preserve">Dotan, G. (2020). Beating the book: A machine learning approach to identifying an edge in NBA betting markets (Master's thesis, UCLA). Data repository: https://github.com/guydotan/ucla-thesis</w:t>
       </w:r>
     </w:p>
     <w:p>
@@ -7409,7 +7497,7 @@
           <w:sz w:val="20"/>
           <w:szCs w:val="20"/>
         </w:rPr>
-        <w:t xml:space="preserve">Griffith, R. M. (1949). Odds adjustments by American horse-race bettors. The American Journal of Psychology, 62(2), 290-294. https://doi.org/10.2307/1418469</w:t>
+        <w:t xml:space="preserve">Fama, E. F. (1970). Efficient capital markets: A review of theory and empirical work. The Journal of Finance, 25(2), 383-417. https://doi.org/10.2307/2325486</w:t>
       </w:r>
     </w:p>
     <w:p>
@@ -7425,7 +7513,7 @@
           <w:sz w:val="20"/>
           <w:szCs w:val="20"/>
         </w:rPr>
-        <w:t xml:space="preserve">Holm, S. (1979). A simple sequentially rejective multiple test procedure. Scandinavian Journal of Statistics, 6(2), 65-70.</w:t>
+        <w:t xml:space="preserve">Griffith, R. M. (1949). Odds adjustments by American horse-race bettors. The American Journal of Psychology, 62(2), 290-294. https://doi.org/10.2307/1418469</w:t>
       </w:r>
     </w:p>
     <w:p>
@@ -7441,7 +7529,7 @@
           <w:sz w:val="20"/>
           <w:szCs w:val="20"/>
         </w:rPr>
-        <w:t xml:space="preserve">Kahneman, D., &amp; Tversky, A. (1979). Prospect theory: An analysis of decision under risk. Econometrica, 47(2), 263-291. https://doi.org/10.2307/1914185</w:t>
+        <w:t xml:space="preserve">Holm, S. (1979). A simple sequentially rejective multiple test procedure. Scandinavian Journal of Statistics, 6(2), 65-70.</w:t>
       </w:r>
     </w:p>
     <w:p>
@@ -7457,7 +7545,7 @@
           <w:sz w:val="20"/>
           <w:szCs w:val="20"/>
         </w:rPr>
-        <w:t xml:space="preserve">Levitt, S. D. (2004). Why are gambling markets organised so differently from financial markets? The Economic Journal, 114(495), 223-246. https://doi.org/10.1111/j.1468-0297.2004.00207.x</w:t>
+        <w:t xml:space="preserve">Kahneman, D., &amp; Tversky, A. (1979). Prospect theory: An analysis of decision under risk. Econometrica, 47(2), 263-291. https://doi.org/10.2307/1914185</w:t>
       </w:r>
     </w:p>
     <w:p>
@@ -7473,7 +7561,7 @@
           <w:sz w:val="20"/>
           <w:szCs w:val="20"/>
         </w:rPr>
-        <w:t xml:space="preserve">Moskowitz, T. J. (2021). Asset pricing and sports betting. The Journal of Finance, 76(6), 3153-3209. https://doi.org/10.1111/jofi.13082</w:t>
+        <w:t xml:space="preserve">Levitt, S. D. (2004). Why are gambling markets organised so differently from financial markets? The Economic Journal, 114(495), 223-246. https://doi.org/10.1111/j.1468-0297.2004.00207.x</w:t>
       </w:r>
     </w:p>
     <w:p>
@@ -7489,7 +7577,7 @@
           <w:sz w:val="20"/>
           <w:szCs w:val="20"/>
         </w:rPr>
-        <w:t xml:space="preserve">Newall, P. W. S., &amp; Cortis, D. (2021). Are sports bettors biased toward longshots, favorites, or both? A literature review. Risks, 9(1), Article 22. https://doi.org/10.3390/risks9010022</w:t>
+        <w:t xml:space="preserve">Moskowitz, T. J. (2021). Asset pricing and sports betting. The Journal of Finance, 76(6), 3153-3209. https://doi.org/10.1111/jofi.13082</w:t>
       </w:r>
     </w:p>
     <w:p>
@@ -7505,7 +7593,7 @@
           <w:sz w:val="20"/>
           <w:szCs w:val="20"/>
         </w:rPr>
-        <w:t xml:space="preserve">Paul, R. J., &amp; Weinbach, A. P. (2008). Price setting in the NBA gambling market: Tests of the Levitt model of sportsbook behavior. International Journal of Sport Finance, 3(3), 137-145.</w:t>
+        <w:t xml:space="preserve">Newall, P. W. S., &amp; Cortis, D. (2021). Are sports bettors biased toward longshots, favorites, or both? A literature review. Risks, 9(1), Article 22. https://doi.org/10.3390/risks9010022</w:t>
       </w:r>
     </w:p>
     <w:p>
@@ -7521,7 +7609,7 @@
           <w:sz w:val="20"/>
           <w:szCs w:val="20"/>
         </w:rPr>
-        <w:t xml:space="preserve">Sauer, R. D., Brajer, V., Ferris, S. P., &amp; Marr, M. W. (1988). Hold your bets: Another look at the efficiency of the gambling market for National Football League games. Journal of Political Economy, 96(1), 206-213. https://doi.org/10.1086/261532</w:t>
+        <w:t xml:space="preserve">Paul, R. J., &amp; Weinbach, A. P. (2008). Price setting in the NBA gambling market: Tests of the Levitt model of sportsbook behavior. International Journal of Sport Finance, 3(3), 137-145.</w:t>
       </w:r>
     </w:p>
     <w:p>
@@ -7537,7 +7625,7 @@
           <w:sz w:val="20"/>
           <w:szCs w:val="20"/>
         </w:rPr>
-        <w:t xml:space="preserve">Shin, H. S. (1993). Measuring the incidence of insider trading in a market for state-contingent claims. The Economic Journal, 103(420), 1141-1153. https://doi.org/10.2307/2234240</w:t>
+        <w:t xml:space="preserve">Sauer, R. D., Brajer, V., Ferris, S. P., &amp; Marr, M. W. (1988). Hold your bets: Another look at the efficiency of the gambling market for National Football League games. Journal of Political Economy, 96(1), 206-213. https://doi.org/10.1086/261532</w:t>
       </w:r>
     </w:p>
     <w:p>
@@ -7553,7 +7641,7 @@
           <w:sz w:val="20"/>
           <w:szCs w:val="20"/>
         </w:rPr>
-        <w:t xml:space="preserve">Sportsbook Reviews Online. (n.d.). NBA scores and odds archives. https://www.sportsbookreviewsonline.com/scoresoddsarchives/nba/nbaoddsarchives.htm</w:t>
+        <w:t xml:space="preserve">Shin, H. S. (1993). Measuring the incidence of insider trading in a market for state-contingent claims. The Economic Journal, 103(420), 1141-1153. https://doi.org/10.2307/2234240</w:t>
       </w:r>
     </w:p>
     <w:p>
@@ -7569,7 +7657,7 @@
           <w:sz w:val="20"/>
           <w:szCs w:val="20"/>
         </w:rPr>
-        <w:t xml:space="preserve">Thaler, R. H., &amp; Ziemba, W. T. (1988). Anomalies: Parimutuel betting markets. Journal of Economic Perspectives, 2(2), 161-174. https://doi.org/10.1257/jep.2.2.161</w:t>
+        <w:t xml:space="preserve">Sportsbook Reviews Online. (n.d.). NBA scores and odds archives. https://www.sportsbookreviewsonline.com/scoresoddsarchives/nba/nbaoddsarchives.htm</w:t>
       </w:r>
     </w:p>
     <w:p>
@@ -7585,7 +7673,7 @@
           <w:sz w:val="20"/>
           <w:szCs w:val="20"/>
         </w:rPr>
-        <w:t xml:space="preserve">Winkelmann, D., Otting, M., Deutscher, C., &amp; Makarewicz, T. (2024). Are betting markets inefficient? Evidence from simulations and real data. Journal of Sports Economics, 25(1). https://doi.org/10.1177/15270025231204997</w:t>
+        <w:t xml:space="preserve">Thaler, R. H., &amp; Ziemba, W. T. (1988). Anomalies: Parimutuel betting markets. Journal of Economic Perspectives, 2(2), 161-174. https://doi.org/10.1257/jep.2.2.161</w:t>
       </w:r>
     </w:p>
     <w:p>
@@ -7601,7 +7689,39 @@
           <w:sz w:val="20"/>
           <w:szCs w:val="20"/>
         </w:rPr>
+        <w:t xml:space="preserve">Winkelmann, D., Otting, M., Deutscher, C., &amp; Makarewicz, T. (2024). Are betting markets inefficient? Evidence from simulations and real data. Journal of Sports Economics, 25(1). https://doi.org/10.1177/15270025231204997</w:t>
+      </w:r>
+    </w:p>
+    <w:p>
+      <w:pPr>
+        <w:spacing w:after="120" w:line="260"/>
+        <w:ind w:left="360" w:hanging="360"/>
+        <w:jc w:val="left"/>
+      </w:pPr>
+      <w:r>
+        <w:rPr>
+          <w:rFonts w:ascii="Georgia" w:cs="Georgia" w:eastAsia="Georgia" w:hAnsi="Georgia"/>
+          <w:color w:val="1a1a1a"/>
+          <w:sz w:val="20"/>
+          <w:szCs w:val="20"/>
+        </w:rPr>
         <w:t xml:space="preserve">Woodland, L. M., &amp; Woodland, B. M. (2001). Market efficiency and profitable wagering in the National Hockey League: Can bettors score on longshots? Southern Economic Journal, 67(4), 983-995.</w:t>
+      </w:r>
+    </w:p>
+    <w:p>
+      <w:pPr>
+        <w:spacing w:after="120" w:line="260"/>
+        <w:ind w:left="360" w:hanging="360"/>
+        <w:jc w:val="left"/>
+      </w:pPr>
+      <w:r>
+        <w:rPr>
+          <w:rFonts w:ascii="Georgia" w:cs="Georgia" w:eastAsia="Georgia" w:hAnsi="Georgia"/>
+          <w:color w:val="1a1a1a"/>
+          <w:sz w:val="20"/>
+          <w:szCs w:val="20"/>
+        </w:rPr>
+        <w:t xml:space="preserve">Woodland, L. M., &amp; Woodland, B. M. (2011). The reverse favourite-longshot bias in the National Hockey League: Do bettors still score on longshots? Journal of Sports Economics, 12(1), 106-117.</w:t>
       </w:r>
     </w:p>
     <w:p>

</xml_diff>

<commit_message>
Split the manuscript: 15-page main paper plus a 6-page supplement
</commit_message>
<xml_diff>
--- a/paper/NBA_Moneyline_Calibration_Paper.docx
+++ b/paper/NBA_Moneyline_Calibration_Paper.docx
@@ -51,7 +51,7 @@
     </w:p>
     <w:p>
       <w:pPr>
-        <w:spacing w:after="260"/>
+        <w:spacing w:after="240"/>
         <w:jc w:val="center"/>
       </w:pPr>
       <w:r>
@@ -62,23 +62,6 @@
           <w:szCs w:val="20"/>
         </w:rPr>
         <w:t xml:space="preserve">August 2026</w:t>
-      </w:r>
-    </w:p>
-    <w:p>
-      <w:pPr>
-        <w:spacing w:after="200"/>
-        <w:jc w:val="center"/>
-      </w:pPr>
-      <w:r>
-        <w:rPr>
-          <w:rFonts w:ascii="Georgia" w:cs="Georgia" w:eastAsia="Georgia" w:hAnsi="Georgia"/>
-          <w:i/>
-          <w:iCs/>
-          <w:color w:val="6b6b6b"/>
-          <w:sz w:val="20"/>
-          <w:szCs w:val="20"/>
-        </w:rPr>
-        <w:t xml:space="preserve">A pre-specified look at whether favorites in an archived NBA moneyline series were priced fairly, using a verified public archive</w:t>
       </w:r>
     </w:p>
     <w:p>
@@ -109,7 +92,7 @@
           <w:sz w:val="22"/>
           <w:szCs w:val="22"/>
         </w:rPr>
-        <w:t xml:space="preserve">Tests for bias in sports-betting prices often rely on small groups of games. That creates a power problem: a significant result can be fragile, while a non-significant result may simply be too weak to detect a meaningful effect. This study set its analysis strategy before looking at outcomes, defined the smallest effect worth detecting as the margin a bettor would need to overcome at the quoted prices, and then ran one primary test on 15,351 NBA regular-season games from 2007-08 through 2019-20.</w:t>
+        <w:t xml:space="preserve">Tests for bias in sports-betting prices often rely on small groups of games, which creates a power problem: a significant result can be fragile, and a non-significant one may simply be too weak to detect a meaningful effect. This study fixed its analysis plan before looking at outcomes, set the smallest effect worth detecting at the margin a bettor must overcome at the quoted prices, and ran one primary test on 15,351 NBA regular-season games from 2007-08 through 2019-20.</w:t>
       </w:r>
     </w:p>
     <w:p>
@@ -124,7 +107,7 @@
           <w:sz w:val="22"/>
           <w:szCs w:val="22"/>
         </w:rPr>
-        <w:t xml:space="preserve">Favorites with a vig-free implied probability above .70 (6,840 games) won 80.83 percent of the time, compared with an implied 80.26 percent. That is a 0.58 percentage-point gap (z = 1.22, p = .223). The estimate is stable across six variance estimators that allow correlation within seasons and within teams, none of which rejects calibration. At the quoted prices a bettor needed favorites to outperform their vig-free probability by 3.01 percentage points to break even, against a design able to detect 1.33 points, so the observed gap is well inside the region the test was built to rule out.</w:t>
+        <w:t xml:space="preserve">Favorites with a vig-free implied probability above .70 (6,840 games) won 80.83 percent of the time against an implied 80.26 percent, a gap of 0.58 percentage points (z = 1.22, p = .223). The estimate is unchanged across six variance estimators allowing correlation within seasons and within teams, none of which rejects calibration. A bettor needed favorites to beat their vig-free probability by 3.01 points to break even, against a design able to detect 1.33, so the observed gap sits well inside the region the test was built to rule out.</w:t>
       </w:r>
     </w:p>
     <w:p>
@@ -139,27 +122,12 @@
           <w:sz w:val="22"/>
           <w:szCs w:val="22"/>
         </w:rPr>
-        <w:t xml:space="preserve">That conclusion is not universal, and the limits are stated here rather than left to the appendix. Repeating the test under five vig-removal rules gives gaps from -1.31 to +0.58 points. Four of the five leave the gap below that rule's own break-even threshold and none of those four is significant. The fifth, power normalization, produces a gap of -1.31 points against a 1.24-point threshold at p = .004. Separately, the secondary logistic calibration regression does not reject perfect calibration under four of five variance estimators but does under two-way clustering on season and team (p = .037), an estimator resting on only 13 clusters and therefore unreliable.</w:t>
-      </w:r>
-    </w:p>
-    <w:p>
-      <w:pPr>
-        <w:spacing w:after="160" w:line="340"/>
-        <w:jc w:val="both"/>
-      </w:pPr>
-      <w:r>
-        <w:rPr>
-          <w:rFonts w:ascii="Georgia" w:cs="Georgia" w:eastAsia="Georgia" w:hAnsi="Georgia"/>
-          <w:color w:val="1a1a1a"/>
-          <w:sz w:val="22"/>
-          <w:szCs w:val="22"/>
-        </w:rPr>
-        <w:t xml:space="preserve">Taken together the more durable finding is methodological. On the same 15,351 games, raw implied probabilities imply a favorite bias of -2.50 points at p &lt; .001, proportional normalization implies +0.58 points at p = .223, and power normalization implies -1.31 points at p = .004. The existence, size and even the sign of estimated favorite bias in this market depend materially on how the bookmaker's margin is removed, and a pre-specified design, adequately powered for its primary estimand and anchored to an economic threshold, is what makes that dependence visible instead of invisible.</w:t>
-      </w:r>
-    </w:p>
-    <w:p>
-      <w:pPr>
-        <w:spacing w:after="200" w:before="120"/>
+        <w:t xml:space="preserve">That conclusion is not universal. Under five vig-removal rules the gap runs from -1.31 to +0.58 points; four leave it below that rule's own break-even threshold and none of those four is significant, but power normalization gives -1.31 against a 1.24-point threshold at p = .004. On the same games, raw implied probabilities imply a favorite bias of -2.50 points at p &lt; .001. The existence, size and even the sign of estimated favorite bias in this market depend materially on how the bookmaker's margin is removed. That dependence, rather than the null itself, is the paper's more durable finding, and a pre-specified design anchored to an economic threshold is what makes it visible.</w:t>
+      </w:r>
+    </w:p>
+    <w:p>
+      <w:pPr>
+        <w:spacing w:after="180" w:before="120"/>
         <w:jc w:val="both"/>
       </w:pPr>
       <w:r>
@@ -213,7 +181,7 @@
           <w:sz w:val="22"/>
           <w:szCs w:val="22"/>
         </w:rPr>
-        <w:t xml:space="preserve">Legal sports betting is now a large consumer market in the United States. State-regulated sportsbooks accepted roughly $149.9 billion in wagers during 2024 (American Gaming Association, 2025). That scale makes it worth asking how well prices work, but it does not make every statistical finding about those prices convincing. A dataset can include thousands of games and still leave only a few dozen observations in the odds range that builds a conclusion.</w:t>
+        <w:t xml:space="preserve">State-regulated sportsbooks accepted roughly $149.9 billion in wagers during 2024 (American Gaming Association, 2025). That scale makes it worth asking how well the prices work, but it does not make every statistical finding about them convincing. A dataset can hold thousands of games and still leave only a few dozen observations in the range that carries the conclusion. Take a 74-game bucket of favorites priced near .85, the kind of slice these studies routinely report, and ask whether it could detect a deviation the size of the break-even margin computed later from these very prices, 3.01 percentage points. It has about 11 percent power. A significant result from such a test can turn on one or two outcomes, and a null result says almost nothing.</w:t>
       </w:r>
     </w:p>
     <w:p>
@@ -228,22 +196,7 @@
           <w:sz w:val="22"/>
           <w:szCs w:val="22"/>
         </w:rPr>
-        <w:t xml:space="preserve">A short power calculation makes the issue clear. Take a 74-game group of favorites priced near .85, the kind of narrow bucket often used in these studies, and ask whether it could detect a deviation the size of the break-even margin computed later from these very prices, 3.01 percentage points. It has about 11 percent power to do so. Even samples of several hundred games often miss moderate deviations. That creates two risks: a significant result from a small group can turn on one or two outcomes, and a null result can be uninformative because the test was never able to detect the effect in the first place.</w:t>
-      </w:r>
-    </w:p>
-    <w:p>
-      <w:pPr>
-        <w:spacing w:after="160" w:line="340"/>
-        <w:jc w:val="both"/>
-      </w:pPr>
-      <w:r>
-        <w:rPr>
-          <w:rFonts w:ascii="Georgia" w:cs="Georgia" w:eastAsia="Georgia" w:hAnsi="Georgia"/>
-          <w:color w:val="1a1a1a"/>
-          <w:sz w:val="22"/>
-          <w:szCs w:val="22"/>
-        </w:rPr>
-        <w:t xml:space="preserve">This study is built to avoid that trap, and it asks one question:</w:t>
+        <w:t xml:space="preserve">This study is built to avoid that trap. It asks one question:</w:t>
       </w:r>
     </w:p>
     <w:p>
@@ -276,7 +229,190 @@
           <w:sz w:val="22"/>
           <w:szCs w:val="22"/>
         </w:rPr>
-        <w:t xml:space="preserve">The population is NBA regular-season games from 2007-08 through 2019-20. The primary estimand is the calibration gap among favorites whose vig-free implied probability exceeds .70. The threshold, the analysis plan, and the smallest effect worth detecting were all fixed before outcomes were examined. With 6,840 games in that group the design detects a deviation of 1.33 percentage points at 80 percent power, comfortably below the 3.01-point break-even requirement a bettor actually faces. Whatever the outcome, the result is informative.</w:t>
+        <w:t xml:space="preserve">The population is NBA regular-season games from 2007-08 through 2019-20. The primary estimand is the calibration gap among favorites whose vig-free implied probability exceeds .70. Threshold, analysis plan, and smallest effect worth detecting were all fixed before outcomes were examined.</w:t>
+      </w:r>
+    </w:p>
+    <w:p>
+      <w:pPr>
+        <w:spacing w:after="160" w:line="340"/>
+        <w:jc w:val="both"/>
+      </w:pPr>
+      <w:r>
+        <w:rPr>
+          <w:rFonts w:ascii="Georgia" w:cs="Georgia" w:eastAsia="Georgia" w:hAnsi="Georgia"/>
+          <w:color w:val="1a1a1a"/>
+          <w:sz w:val="22"/>
+          <w:szCs w:val="22"/>
+        </w:rPr>
+        <w:t xml:space="preserve">Three claims are easy to conflate and this paper is careful about which it makes. Calibration asks whether stated probabilities match realized frequencies. Profitability asks whether a betting rule earns a positive return after paying the quoted price. Market efficiency asks whether information is impounded so thoroughly that no systematic strategy can exploit it. A market can be well calibrated on average and still contain predictable conditional patterns, and it can carry small calibration errors that no bettor could monetize after the margin. The primary estimand here is calibration, with a secondary direct test of flat-stake profitability. No claim is made about informational efficiency.</w:t>
+      </w:r>
+    </w:p>
+    <w:p>
+      <w:pPr>
+        <w:spacing w:after="140" w:before="320" w:line="300"/>
+      </w:pPr>
+      <w:r>
+        <w:rPr>
+          <w:rFonts w:ascii="Georgia" w:cs="Georgia" w:eastAsia="Georgia" w:hAnsi="Georgia"/>
+          <w:b/>
+          <w:bCs/>
+          <w:color w:val="1a1a2e"/>
+          <w:sz w:val="28"/>
+          <w:szCs w:val="28"/>
+        </w:rPr>
+        <w:t xml:space="preserve">2. Background</w:t>
+      </w:r>
+    </w:p>
+    <w:p>
+      <w:pPr>
+        <w:spacing w:after="160" w:line="340"/>
+        <w:jc w:val="both"/>
+      </w:pPr>
+      <w:r>
+        <w:rPr>
+          <w:rFonts w:ascii="Georgia" w:cs="Georgia" w:eastAsia="Georgia" w:hAnsi="Georgia"/>
+          <w:color w:val="1a1a1a"/>
+          <w:sz w:val="22"/>
+          <w:szCs w:val="22"/>
+        </w:rPr>
+        <w:t xml:space="preserve">Fama (1970) frames efficiency as a question about what information prices absorb, and betting markets give that a clean test because every price settles against a known outcome. Early point-spread work on professional football found that simple public rules did not produce stable profits (Zuber, Gandar, &amp; Bowers, 1985; Sauer, Brajer, Ferris, &amp; Marr, 1988). Four strands of the later literature bear on this study, and they disagree.</w:t>
+      </w:r>
+    </w:p>
+    <w:p>
+      <w:pPr>
+        <w:spacing w:after="160" w:line="340"/>
+        <w:jc w:val="both"/>
+      </w:pPr>
+      <w:r>
+        <w:rPr>
+          <w:rFonts w:ascii="Georgia" w:cs="Georgia" w:eastAsia="Georgia" w:hAnsi="Georgia"/>
+          <w:color w:val="1a1a1a"/>
+          <w:sz w:val="22"/>
+          <w:szCs w:val="22"/>
+        </w:rPr>
+        <w:t xml:space="preserve">The behavioral strand concerns direction. Longshot bias means longshots are overpriced, the classic horse-racing result (Griffith, 1949; Thaler &amp; Ziemba, 1988); favorite bias is the reverse. Because the labels are used inconsistently this paper follows Newall and Cortis (2021). Woodland and Woodland (2001) report favorite bias in NHL money lines, though their conversion method was later questioned by Berkowitz, Depken and Gandar (2018) and the authors themselves reported in 2011 that the effect disappears in later seasons. A second strand concerns pricing: Levitt (2004) argues a book can shade prices toward bettor demand rather than balancing every position, a candidate mechanism rather than evidence of mispricing, and Paul and Weinbach (2008) find NBA favorites attract disproportionate tickets without betting against them beating the market. A third asks whether anything survives costs, and finds largely not (Moskowitz, 2021; Angelini &amp; De Angelis, 2019).</w:t>
+      </w:r>
+    </w:p>
+    <w:p>
+      <w:pPr>
+        <w:spacing w:after="160" w:line="340"/>
+        <w:jc w:val="both"/>
+      </w:pPr>
+      <w:r>
+        <w:rPr>
+          <w:rFonts w:ascii="Georgia" w:cs="Georgia" w:eastAsia="Georgia" w:hAnsi="Georgia"/>
+          <w:color w:val="1a1a1a"/>
+          <w:sz w:val="22"/>
+          <w:szCs w:val="22"/>
+        </w:rPr>
+        <w:t xml:space="preserve">The fourth strand is methodological, and it is where this paper sits. Winkelmann, Otting, Deutscher, and Makarewicz (2024) ask whether the inefficiency tests themselves are up to the job. What is missing is an NBA moneyline calibration analysis with a pre-specified comparison and an explicit power justification. This paper is not trying to rediscover favorite bias. It asks whether a test adequately powered for a pre-specified estimand, and anchored to an economic threshold, can separate real mispricing from the artifact created by the bookmaker's margin.</w:t>
+      </w:r>
+    </w:p>
+    <w:p>
+      <w:pPr>
+        <w:spacing w:after="140" w:before="320" w:line="300"/>
+      </w:pPr>
+      <w:r>
+        <w:rPr>
+          <w:rFonts w:ascii="Georgia" w:cs="Georgia" w:eastAsia="Georgia" w:hAnsi="Georgia"/>
+          <w:b/>
+          <w:bCs/>
+          <w:color w:val="1a1a2e"/>
+          <w:sz w:val="28"/>
+          <w:szCs w:val="28"/>
+        </w:rPr>
+        <w:t xml:space="preserve">3. Data</w:t>
+      </w:r>
+    </w:p>
+    <w:p>
+      <w:pPr>
+        <w:spacing w:after="160" w:line="340"/>
+        <w:jc w:val="both"/>
+      </w:pPr>
+      <w:r>
+        <w:rPr>
+          <w:rFonts w:ascii="Georgia" w:cs="Georgia" w:eastAsia="Georgia" w:hAnsi="Georgia"/>
+          <w:color w:val="1a1a1a"/>
+          <w:sz w:val="22"/>
+          <w:szCs w:val="22"/>
+        </w:rPr>
+        <w:t xml:space="preserve">The data are consensus moneylines and final scores for 15,490 NBA regular-season games from 2007-08 through 2019-20, published originally by the sportsbookreviewsonline.com archive and redistributed in the repository accompanying Dotan (2020). Files were retrieved unmodified on 20 July 2026.</w:t>
+      </w:r>
+    </w:p>
+    <w:p>
+      <w:pPr>
+        <w:spacing w:after="160" w:line="340"/>
+        <w:jc w:val="both"/>
+      </w:pPr>
+      <w:r>
+        <w:rPr>
+          <w:rFonts w:ascii="Georgia" w:cs="Georgia" w:eastAsia="Georgia" w:hAnsi="Georgia"/>
+          <w:color w:val="1a1a1a"/>
+          <w:sz w:val="22"/>
+          <w:szCs w:val="22"/>
+        </w:rPr>
+        <w:t xml:space="preserve">The archive reports one moneyline per side but does not say whether it is an opening or closing quote, and does not identify the book. This paper therefore calls the object an archived consensus moneyline and does not treat it as a closing line. The distinction is not cosmetic: a morning price and a price seconds before tip-off are different economic objects, and nothing here distinguishes them. One further sign that the series is a composite is that a single game is recorded with a booksum below one, which no individual book would offer.</w:t>
+      </w:r>
+    </w:p>
+    <w:p>
+      <w:pPr>
+        <w:spacing w:after="160" w:line="340"/>
+        <w:jc w:val="both"/>
+      </w:pPr>
+      <w:r>
+        <w:rPr>
+          <w:rFonts w:ascii="Georgia" w:cs="Georgia" w:eastAsia="Georgia" w:hAnsi="Georgia"/>
+          <w:color w:val="1a1a1a"/>
+          <w:sz w:val="22"/>
+          <w:szCs w:val="22"/>
+        </w:rPr>
+        <w:t xml:space="preserve">Because the data passed through two intermediaries they were audited before analysis. A stratified sample of 260 games, 20 per season, was checked against the live primary archive; all 260 moneylines matched on both sides, including prices as extreme as -1300 against +800, and all 260 outcomes matched. That sample was drawn by hand rather than by a seeded random procedure, so it is a spot check that found no errors, not a probabilistic guarantee. The stronger evidence is automated and covers the whole file: the same source repository ships an independent team-game-level extraction with its own moneyline and outcome columns, and every value in the analysis file is compared against it, 30,978 prices and 15,490 outcomes, with no discrepancy. Season counts match the true NBA schedule in every year, including the 990-game 2011-12 lockout, the 1,229-game 2012-13 season after one cancellation, and the 971 games played before the March 2020 suspension.</w:t>
+      </w:r>
+    </w:p>
+    <w:p>
+      <w:pPr>
+        <w:spacing w:after="160" w:line="340"/>
+        <w:jc w:val="both"/>
+      </w:pPr>
+      <w:r>
+        <w:rPr>
+          <w:rFonts w:ascii="Georgia" w:cs="Georgia" w:eastAsia="Georgia" w:hAnsi="Georgia"/>
+          <w:color w:val="1a1a1a"/>
+          <w:sz w:val="22"/>
+          <w:szCs w:val="22"/>
+        </w:rPr>
+        <w:t xml:space="preserve">One game with a missing moneyline and 138 pick'em games are excluded, leaving 15,351. The source pipeline had already removed 986 playoff games, so the sample is regular season only. Mean overround is 3.77 percent and favorite vig-free probabilities range from .502 to .985. The series ends in March 2020 because that is where the archive ends; it therefore predates the subsequent expansion of US legal sports betting, about which no claim is made.</w:t>
+      </w:r>
+    </w:p>
+    <w:p>
+      <w:pPr>
+        <w:spacing w:after="140" w:before="320" w:line="300"/>
+      </w:pPr>
+      <w:r>
+        <w:rPr>
+          <w:rFonts w:ascii="Georgia" w:cs="Georgia" w:eastAsia="Georgia" w:hAnsi="Georgia"/>
+          <w:b/>
+          <w:bCs/>
+          <w:color w:val="1a1a2e"/>
+          <w:sz w:val="28"/>
+          <w:szCs w:val="28"/>
+        </w:rPr>
+        <w:t xml:space="preserve">4. Methods</w:t>
+      </w:r>
+    </w:p>
+    <w:p>
+      <w:pPr>
+        <w:spacing w:after="160" w:line="340"/>
+        <w:jc w:val="both"/>
+      </w:pPr>
+      <w:r>
+        <w:rPr>
+          <w:rFonts w:ascii="Georgia" w:cs="Georgia" w:eastAsia="Georgia" w:hAnsi="Georgia"/>
+          <w:color w:val="1a1a1a"/>
+          <w:sz w:val="22"/>
+          <w:szCs w:val="22"/>
+        </w:rPr>
+        <w:t xml:space="preserve">The analysis plan was written and frozen before any outcome data were examined and is published in full with the replication materials. The record of that freeze is internal to the author's files rather than lodged with an outside registry, so the work is described throughout as pre-specified rather than pre-registered.</w:t>
       </w:r>
     </w:p>
     <w:p>
@@ -292,7 +428,7 @@
           <w:sz w:val="24"/>
           <w:szCs w:val="24"/>
         </w:rPr>
-        <w:t xml:space="preserve">1.1 Three questions that are easy to conflate</w:t>
+        <w:t xml:space="preserve">4.1 Probabilities, and why proportional normalization is primary</w:t>
       </w:r>
     </w:p>
     <w:p>
@@ -307,22 +443,24 @@
           <w:sz w:val="22"/>
           <w:szCs w:val="22"/>
         </w:rPr>
-        <w:t xml:space="preserve">This literature moves quickly between three claims that are related but not equivalent, and this paper is careful about which one it makes.</w:t>
-      </w:r>
-    </w:p>
-    <w:p>
-      <w:pPr>
-        <w:spacing w:after="160" w:line="340"/>
-        <w:jc w:val="both"/>
-      </w:pPr>
-      <w:r>
-        <w:rPr>
-          <w:rFonts w:ascii="Georgia" w:cs="Georgia" w:eastAsia="Georgia" w:hAnsi="Georgia"/>
+        <w:t xml:space="preserve">American odds convert to a raw implied probability: for negative odds, the absolute value divided by itself plus 100; for positive odds, 100 divided by the odds plus 100. The two raw probabilities sum to more than one, and the excess is the margin. Writing them q1 and q2 with sum P, the primary analysis removes the margin proportionally:</w:t>
+      </w:r>
+    </w:p>
+    <w:p>
+      <w:pPr>
+        <w:spacing w:after="70" w:before="70" w:line="300"/>
+        <w:jc w:val="center"/>
+      </w:pPr>
+      <w:r>
+        <w:rPr>
+          <w:rFonts w:ascii="Georgia" w:cs="Georgia" w:eastAsia="Georgia" w:hAnsi="Georgia"/>
+          <w:i/>
+          <w:iCs/>
           <w:color w:val="1a1a1a"/>
           <w:sz w:val="22"/>
           <w:szCs w:val="22"/>
         </w:rPr>
-        <w:t xml:space="preserve">Calibration asks whether stated probabilities match realized frequencies. Profitability asks whether a betting rule earns a positive return after paying the quoted price. Market efficiency asks whether available information is impounded in prices so thoroughly that no systematic strategy can exploit it.</w:t>
+        <w:t xml:space="preserve">p1 = q1 / P     and     p2 = q2 / P</w:t>
       </w:r>
     </w:p>
     <w:p>
@@ -337,23 +475,7 @@
           <w:sz w:val="22"/>
           <w:szCs w:val="22"/>
         </w:rPr>
-        <w:t xml:space="preserve">A market can be well calibrated on average and still contain predictable conditional patterns. It can also carry small calibration errors that no bettor could monetize once the margin is paid. This paper's primary estimand is calibration, with a secondary and direct test of flat-stake profitability. It is not a test of general informational efficiency, and no such claim is made.</w:t>
-      </w:r>
-    </w:p>
-    <w:p>
-      <w:pPr>
-        <w:spacing w:after="140" w:before="320" w:line="300"/>
-      </w:pPr>
-      <w:r>
-        <w:rPr>
-          <w:rFonts w:ascii="Georgia" w:cs="Georgia" w:eastAsia="Georgia" w:hAnsi="Georgia"/>
-          <w:b/>
-          <w:bCs/>
-          <w:color w:val="1a1a2e"/>
-          <w:sz w:val="28"/>
-          <w:szCs w:val="28"/>
-        </w:rPr>
-        <w:t xml:space="preserve">2. Background</w:t>
+        <w:t xml:space="preserve">Dividing both sides by the same constant leaves the ratio q1/q2 unchanged, so relative pricing is preserved exactly and only the level is rescaled. The additive rule preserves the difference q1 - q2 instead. Neither is derivable from first principles.</w:t>
       </w:r>
     </w:p>
     <w:p>
@@ -368,7 +490,7 @@
           <w:sz w:val="22"/>
           <w:szCs w:val="22"/>
         </w:rPr>
-        <w:t xml:space="preserve">Fama (1970) frames market efficiency as a question about what information prices absorb. Betting markets offer a clean version of that test because every price settles against a known outcome. Early point-spread work on professional football generally found that simple public betting rules did not produce stable profits (Zuber, Gandar, &amp; Bowers, 1985; Sauer, Brajer, Ferris, &amp; Marr, 1988), although profitability, calibration, and price efficiency are connected but distinct questions.</w:t>
+        <w:t xml:space="preserve">Three reasons make proportional the primary rule, and the choice determines the headline number. It was fixed in the frozen analysis plan before any outcomes were examined, so it was not selected after seeing which rule gave which answer. It is the prevailing convention in the applied betting-market literature, which keeps the estimate comparable. And preserving relative pricing is the natural default for a calibration question, where the object of interest is whether the two sides are priced correctly against each other. What should not be claimed is that it has stronger theoretical warrant than the alternatives. It does not. Of the rules tested, the one with an actual behavioral model behind it is Shin (1993), which for a two-outcome book reduces exactly to the additive rule and puts the gap at -0.60 rather than +0.58. That estimate is not significant and sits well below its own break-even requirement, so the substantive conclusion is unchanged, but the sign is not. Section 5.4 reports all five rules; the Shin derivation and its numerical verification are in the supplementary material.</w:t>
       </w:r>
     </w:p>
     <w:p>
@@ -383,113 +505,7 @@
           <w:sz w:val="22"/>
           <w:szCs w:val="22"/>
         </w:rPr>
-        <w:t xml:space="preserve">Four strands of that literature bear on this study, and they disagree with one another in ways worth naming.</w:t>
-      </w:r>
-    </w:p>
-    <w:p>
-      <w:pPr>
-        <w:spacing w:after="160" w:line="340"/>
-        <w:jc w:val="both"/>
-      </w:pPr>
-      <w:r>
-        <w:rPr>
-          <w:rFonts w:ascii="Georgia" w:cs="Georgia" w:eastAsia="Georgia" w:hAnsi="Georgia"/>
-          <w:color w:val="1a1a1a"/>
-          <w:sz w:val="22"/>
-          <w:szCs w:val="22"/>
-        </w:rPr>
-        <w:t xml:space="preserve">The first is behavioral. Longshot bias means longshots are overpriced and return less than favorites, the classic result in horse racing (Griffith, 1949; Thaler &amp; Ziemba, 1988). Favorite bias is the reverse. Because the labels are used inconsistently, this paper follows Newall and Cortis (2021). Woodland and Woodland (2001) report favorite bias in NHL money lines.</w:t>
-      </w:r>
-    </w:p>
-    <w:p>
-      <w:pPr>
-        <w:spacing w:after="160" w:line="340"/>
-        <w:jc w:val="both"/>
-      </w:pPr>
-      <w:r>
-        <w:rPr>
-          <w:rFonts w:ascii="Georgia" w:cs="Georgia" w:eastAsia="Georgia" w:hAnsi="Georgia"/>
-          <w:color w:val="1a1a1a"/>
-          <w:sz w:val="22"/>
-          <w:szCs w:val="22"/>
-        </w:rPr>
-        <w:t xml:space="preserve">The second concerns how bookmakers set prices. Levitt (2004) argues that a book can shade prices toward bettor demand rather than balancing every position. That is a candidate mechanism for mispricing, not evidence that mispricing exists. Paul and Weinbach (2008) find that NBA favorites attract a disproportionate share of tickets but do not find that betting against them beats the market.</w:t>
-      </w:r>
-    </w:p>
-    <w:p>
-      <w:pPr>
-        <w:spacing w:after="160" w:line="340"/>
-        <w:jc w:val="both"/>
-      </w:pPr>
-      <w:r>
-        <w:rPr>
-          <w:rFonts w:ascii="Georgia" w:cs="Georgia" w:eastAsia="Georgia" w:hAnsi="Georgia"/>
-          <w:color w:val="1a1a1a"/>
-          <w:sz w:val="22"/>
-          <w:szCs w:val="22"/>
-        </w:rPr>
-        <w:t xml:space="preserve">The third asks whether any of it survives costs. Moskowitz (2021) finds that behavioral patterns in betting prices are too small to clear transaction costs. Angelini and De Angelis (2019) test odds across many books and find most markets efficient at the best available price.</w:t>
-      </w:r>
-    </w:p>
-    <w:p>
-      <w:pPr>
-        <w:spacing w:after="160" w:line="340"/>
-        <w:jc w:val="both"/>
-      </w:pPr>
-      <w:r>
-        <w:rPr>
-          <w:rFonts w:ascii="Georgia" w:cs="Georgia" w:eastAsia="Georgia" w:hAnsi="Georgia"/>
-          <w:color w:val="1a1a1a"/>
-          <w:sz w:val="22"/>
-          <w:szCs w:val="22"/>
-        </w:rPr>
-        <w:t xml:space="preserve">The fourth is methodological, and it is where this paper sits. Winkelmann, Otting, Deutscher, and Makarewicz (2024) benchmark inefficiency tests against simulated and real odds and ask whether the tests themselves are up to the job. What is still missing is an NBA moneyline calibration analysis with a pre-specified comparison and an explicit power justification. This paper is not trying to rediscover favorite bias. It asks whether a test adequately powered for a pre-specified estimand, and anchored to an economic threshold, can separate real favorite mispricing from the artifact created by the bookmaker's margin.</w:t>
-      </w:r>
-    </w:p>
-    <w:p>
-      <w:pPr>
-        <w:spacing w:after="140" w:before="320" w:line="300"/>
-      </w:pPr>
-      <w:r>
-        <w:rPr>
-          <w:rFonts w:ascii="Georgia" w:cs="Georgia" w:eastAsia="Georgia" w:hAnsi="Georgia"/>
-          <w:b/>
-          <w:bCs/>
-          <w:color w:val="1a1a2e"/>
-          <w:sz w:val="28"/>
-          <w:szCs w:val="28"/>
-        </w:rPr>
-        <w:t xml:space="preserve">3. Data</w:t>
-      </w:r>
-    </w:p>
-    <w:p>
-      <w:pPr>
-        <w:spacing w:after="160" w:line="340"/>
-        <w:jc w:val="both"/>
-      </w:pPr>
-      <w:r>
-        <w:rPr>
-          <w:rFonts w:ascii="Georgia" w:cs="Georgia" w:eastAsia="Georgia" w:hAnsi="Georgia"/>
-          <w:color w:val="1a1a1a"/>
-          <w:sz w:val="22"/>
-          <w:szCs w:val="22"/>
-        </w:rPr>
-        <w:t xml:space="preserve">The data are consensus moneylines and final scores for 15,490 NBA regular-season games from 2007-08 through 2019-20, originally published by the sportsbookreviewsonline.com archive and redistributed in the public repository accompanying Dotan's UCLA master's thesis (Dotan, 2020). Files were retrieved unmodified on 20 July 2026.</w:t>
-      </w:r>
-    </w:p>
-    <w:p>
-      <w:pPr>
-        <w:spacing w:after="160" w:line="340"/>
-        <w:jc w:val="both"/>
-      </w:pPr>
-      <w:r>
-        <w:rPr>
-          <w:rFonts w:ascii="Georgia" w:cs="Georgia" w:eastAsia="Georgia" w:hAnsi="Georgia"/>
-          <w:color w:val="1a1a1a"/>
-          <w:sz w:val="22"/>
-          <w:szCs w:val="22"/>
-        </w:rPr>
-        <w:t xml:space="preserve">The archive reports one moneyline for each side of a game, but it does not say whether the line is an opening or closing quote, and it does not identify the originating sportsbook. This paper therefore calls the object an archived consensus moneyline and avoids treating it as a closing line. That distinction is not cosmetic: a price recorded in the morning and a price recorded seconds before tip-off are different economic objects, and nothing in this dataset distinguishes them. One further sign that the series is a composite rather than a single book's quote is that one game is recorded with a booksum below one, which no single book would offer.</w:t>
+        <w:t xml:space="preserve">The favorite is the side with the higher vig-free probability. Raw probabilities are retained for the sensitivity analysis.</w:t>
       </w:r>
     </w:p>
     <w:p>
@@ -505,7 +521,7 @@
           <w:sz w:val="24"/>
           <w:szCs w:val="24"/>
         </w:rPr>
-        <w:t xml:space="preserve">3.1 Verification</w:t>
+        <w:t xml:space="preserve">4.2 The primary test, dependence, and power</w:t>
       </w:r>
     </w:p>
     <w:p>
@@ -520,7 +536,7 @@
           <w:sz w:val="22"/>
           <w:szCs w:val="22"/>
         </w:rPr>
-        <w:t xml:space="preserve">Because the data passed through two intermediaries, they were audited before analysis began. A stratified sample of 260 games, 20 from each of the 13 seasons, was checked directly against the live primary archive. All 260 moneylines matched exactly on both sides, including extreme prices such as -1300 against +800, and all 260 outcomes matched the final scores.</w:t>
+        <w:t xml:space="preserve">The single confirmatory hypothesis concerns favorites whose vig-free probability exceeds .70. Under the null each game is a Bernoulli trial with its own probability, so favorite wins follow a Poisson-binomial distribution with mean equal to the sum of the game-level probabilities and variance equal to the sum of p(1 - p). The test compares actual wins with that expected sum, two-sided at alpha = .05. Because implied probabilities vary game by game, this replaces the fixed-probability bucket tests common in the literature, which treat every game in a bucket as carrying the same probability.</w:t>
       </w:r>
     </w:p>
     <w:p>
@@ -535,23 +551,7 @@
           <w:sz w:val="22"/>
           <w:szCs w:val="22"/>
         </w:rPr>
-        <w:t xml:space="preserve">That sample was drawn by hand rather than by a seeded random procedure, so it should be read as a stratified spot check that found no errors, not as a probabilistic guarantee about the remaining games. The stronger claim rests on an automated check that covers the whole file. The same source repository ships a separate team-game-level extraction with its own moneyline and outcome columns, and every value in the analysis file is compared against it: 30,978 prices and 15,490 outcomes, with no discrepancy. Season game counts match the true NBA schedule in every year, including the 990-game 2011-12 lockout season, the 1,229-game 2012-13 season after one cancellation, and the 971 games played before the March 2020 suspension. One game is missing a moneyline in the source, matching the source thesis's own description. The verification script and its full output are published with the replication materials.</w:t>
-      </w:r>
-    </w:p>
-    <w:p>
-      <w:pPr>
-        <w:spacing w:after="100" w:before="240" w:line="300"/>
-      </w:pPr>
-      <w:r>
-        <w:rPr>
-          <w:rFonts w:ascii="Georgia" w:cs="Georgia" w:eastAsia="Georgia" w:hAnsi="Georgia"/>
-          <w:b/>
-          <w:bCs/>
-          <w:color w:val="2c2c54"/>
-          <w:sz w:val="24"/>
-          <w:szCs w:val="24"/>
-        </w:rPr>
-        <w:t xml:space="preserve">3.2 Exclusions and profile</w:t>
+        <w:t xml:space="preserve">That framework treats games as independent conditional on their prices, which is standard for a calibration test but is an assumption. Dependence within a game is not an issue, since only one favorite outcome is analyzed and the two sides are collinear. Four other channels are plausible: each team appears in roughly a thousand games, so a persistently misjudged team would correlate its own residuals; roster rules, pace and market structure are common within a season; injuries and news propagate across nearby games; and a consensus price aggregates books that share information. None of this changes the point estimate and all of it can change the standard error, so section 5.4 re-estimates the gap under cluster-robust variance at the season, favorite-team, underdog-team and two-way levels, and adds a team-blocked bootstrap. The confirmatory test is retained in its pre-specified form.</w:t>
       </w:r>
     </w:p>
     <w:p>
@@ -566,289 +566,12 @@
           <w:sz w:val="22"/>
           <w:szCs w:val="22"/>
         </w:rPr>
-        <w:t xml:space="preserve">The analysis excludes one game with a missing moneyline and 138 pick'em games, where neither side is a favorite. That leaves 15,351 games. The source thesis's processing pipeline had already removed 986 playoff games, so the analysis covers the regular season only. The mean overround on the analysis sample is 3.77 percent, and favorite vig-free implied probabilities range from .502 to .985.</w:t>
-      </w:r>
-    </w:p>
-    <w:p>
-      <w:pPr>
-        <w:spacing w:after="160" w:line="340"/>
-        <w:jc w:val="both"/>
-      </w:pPr>
-      <w:r>
-        <w:rPr>
-          <w:rFonts w:ascii="Georgia" w:cs="Georgia" w:eastAsia="Georgia" w:hAnsi="Georgia"/>
-          <w:color w:val="1a1a1a"/>
-          <w:sz w:val="22"/>
-          <w:szCs w:val="22"/>
-        </w:rPr>
-        <w:t xml:space="preserve">The series ends in March 2020 because that is where the source archive ends. It therefore predates the subsequent expansion of legal sports betting in the United States. No claim is made here about whether that expansion changed market behavior; it is simply outside the sample.</w:t>
-      </w:r>
-    </w:p>
-    <w:p>
-      <w:pPr>
-        <w:spacing w:after="140" w:before="320" w:line="300"/>
-      </w:pPr>
-      <w:r>
-        <w:rPr>
-          <w:rFonts w:ascii="Georgia" w:cs="Georgia" w:eastAsia="Georgia" w:hAnsi="Georgia"/>
-          <w:b/>
-          <w:bCs/>
-          <w:color w:val="1a1a2e"/>
-          <w:sz w:val="28"/>
-          <w:szCs w:val="28"/>
-        </w:rPr>
-        <w:t xml:space="preserve">4. Methods</w:t>
-      </w:r>
-    </w:p>
-    <w:p>
-      <w:pPr>
-        <w:spacing w:after="160" w:line="340"/>
-        <w:jc w:val="both"/>
-      </w:pPr>
-      <w:r>
-        <w:rPr>
-          <w:rFonts w:ascii="Georgia" w:cs="Georgia" w:eastAsia="Georgia" w:hAnsi="Georgia"/>
-          <w:color w:val="1a1a1a"/>
-          <w:sz w:val="22"/>
-          <w:szCs w:val="22"/>
-        </w:rPr>
-        <w:t xml:space="preserve">The analysis plan was written and frozen before any outcome data were examined, and it is published in full with the replication materials. The record of that freeze is internal to the author's files rather than lodged with an outside registry, so the work is described throughout as pre-specified rather than pre-registered. The limitations section explains why that distinction matters.</w:t>
-      </w:r>
-    </w:p>
-    <w:p>
-      <w:pPr>
-        <w:spacing w:after="100" w:before="240" w:line="300"/>
-      </w:pPr>
-      <w:r>
-        <w:rPr>
-          <w:rFonts w:ascii="Georgia" w:cs="Georgia" w:eastAsia="Georgia" w:hAnsi="Georgia"/>
-          <w:b/>
-          <w:bCs/>
-          <w:color w:val="2c2c54"/>
-          <w:sz w:val="24"/>
-          <w:szCs w:val="24"/>
-        </w:rPr>
-        <w:t xml:space="preserve">4.1 Probabilities and the favorite</w:t>
-      </w:r>
-    </w:p>
-    <w:p>
-      <w:pPr>
-        <w:spacing w:after="160" w:line="340"/>
-        <w:jc w:val="both"/>
-      </w:pPr>
-      <w:r>
-        <w:rPr>
-          <w:rFonts w:ascii="Georgia" w:cs="Georgia" w:eastAsia="Georgia" w:hAnsi="Georgia"/>
-          <w:color w:val="1a1a1a"/>
-          <w:sz w:val="22"/>
-          <w:szCs w:val="22"/>
-        </w:rPr>
-        <w:t xml:space="preserve">American odds convert to a raw implied probability. For negative odds q equals the absolute value of the odds divided by that value plus 100; for positive odds q equals 100 divided by the odds plus 100. The two raw probabilities of a game sum to more than one, and the excess is the bookmaker's margin.</w:t>
-      </w:r>
-    </w:p>
-    <w:p>
-      <w:pPr>
-        <w:spacing w:after="160" w:line="340"/>
-        <w:jc w:val="both"/>
-      </w:pPr>
-      <w:r>
-        <w:rPr>
-          <w:rFonts w:ascii="Georgia" w:cs="Georgia" w:eastAsia="Georgia" w:hAnsi="Georgia"/>
-          <w:color w:val="1a1a1a"/>
-          <w:sz w:val="22"/>
-          <w:szCs w:val="22"/>
-        </w:rPr>
-        <w:t xml:space="preserve">Writing the two raw probabilities as q1 and q2, and their sum as P, the primary analysis removes the margin proportionally:</w:t>
-      </w:r>
-    </w:p>
-    <w:p>
-      <w:pPr>
-        <w:spacing w:after="80" w:before="80" w:line="300"/>
-        <w:jc w:val="center"/>
-      </w:pPr>
-      <w:r>
-        <w:rPr>
-          <w:rFonts w:ascii="Georgia" w:cs="Georgia" w:eastAsia="Georgia" w:hAnsi="Georgia"/>
-          <w:i/>
-          <w:iCs/>
-          <w:color w:val="1a1a1a"/>
-          <w:sz w:val="22"/>
-          <w:szCs w:val="22"/>
-        </w:rPr>
-        <w:t xml:space="preserve">p1 = q1 / P     and     p2 = q2 / P</w:t>
-      </w:r>
-    </w:p>
-    <w:p>
-      <w:pPr>
-        <w:spacing w:after="160" w:line="340"/>
-        <w:jc w:val="both"/>
-      </w:pPr>
-      <w:r>
-        <w:rPr>
-          <w:rFonts w:ascii="Georgia" w:cs="Georgia" w:eastAsia="Georgia" w:hAnsi="Georgia"/>
-          <w:color w:val="1a1a1a"/>
-          <w:sz w:val="22"/>
-          <w:szCs w:val="22"/>
-        </w:rPr>
-        <w:t xml:space="preserve">This assumes the margin is taken in proportion to price, so that in absolute terms the favorite absorbs more of it than the underdog. The rule has one clean property: dividing both sides by the same constant leaves the ratio q1/q2 unchanged, so the relative pricing of the two sides is preserved exactly and only the level is rescaled. The additive rule preserves the difference q1 - q2 instead. Neither is derivable from first principles; each preserves a different feature of the quoted price.</w:t>
-      </w:r>
-    </w:p>
-    <w:p>
-      <w:pPr>
-        <w:spacing w:after="160" w:line="340"/>
-        <w:jc w:val="both"/>
-      </w:pPr>
-      <w:r>
-        <w:rPr>
-          <w:rFonts w:ascii="Georgia" w:cs="Georgia" w:eastAsia="Georgia" w:hAnsi="Georgia"/>
-          <w:color w:val="1a1a1a"/>
-          <w:sz w:val="22"/>
-          <w:szCs w:val="22"/>
-        </w:rPr>
-        <w:t xml:space="preserve">Three things should be said plainly about why proportional is the primary rule, because the choice determines the headline number. First, it was fixed in the frozen analysis plan before any outcome data were examined, and that plan is published with the replication materials, so it was not selected after seeing which rule produced which answer. Second, it is the prevailing convention in the applied betting-market literature, which makes the primary estimate comparable with prior work. Third, its property of preserving relative pricing is the natural default for a calibration question, where the object of interest is whether the two sides are priced correctly against each other.</w:t>
-      </w:r>
-    </w:p>
-    <w:p>
-      <w:pPr>
-        <w:spacing w:after="160" w:line="340"/>
-        <w:jc w:val="both"/>
-      </w:pPr>
-      <w:r>
-        <w:rPr>
-          <w:rFonts w:ascii="Georgia" w:cs="Georgia" w:eastAsia="Georgia" w:hAnsi="Georgia"/>
-          <w:color w:val="1a1a1a"/>
-          <w:sz w:val="22"/>
-          <w:szCs w:val="22"/>
-        </w:rPr>
-        <w:t xml:space="preserve">What should not be claimed is that proportional normalization has stronger theoretical warrant than the alternatives. It does not. Of the rules tested, the one with an actual behavioral model behind it is Shin (1993), and for a two-outcome book Shin reduces exactly to the additive rule, which puts the gap at -0.60 rather than +0.58 points. That estimate is not significant (p = .186) and sits well below its own break-even requirement, so the substantive conclusion is unchanged, but the sign is not. Section 5.4 reports all five rules and Appendix A proves the Shin result. The favorite is the side with the higher vig-free probability. Raw probabilities are retained for the sensitivity analysis.</w:t>
-      </w:r>
-    </w:p>
-    <w:p>
-      <w:pPr>
-        <w:spacing w:after="100" w:before="240" w:line="300"/>
-      </w:pPr>
-      <w:r>
-        <w:rPr>
-          <w:rFonts w:ascii="Georgia" w:cs="Georgia" w:eastAsia="Georgia" w:hAnsi="Georgia"/>
-          <w:b/>
-          <w:bCs/>
-          <w:color w:val="2c2c54"/>
-          <w:sz w:val="24"/>
-          <w:szCs w:val="24"/>
-        </w:rPr>
-        <w:t xml:space="preserve">4.2 The primary test</w:t>
-      </w:r>
-    </w:p>
-    <w:p>
-      <w:pPr>
-        <w:spacing w:after="160" w:line="340"/>
-        <w:jc w:val="both"/>
-      </w:pPr>
-      <w:r>
-        <w:rPr>
-          <w:rFonts w:ascii="Georgia" w:cs="Georgia" w:eastAsia="Georgia" w:hAnsi="Georgia"/>
-          <w:color w:val="1a1a1a"/>
-          <w:sz w:val="22"/>
-          <w:szCs w:val="22"/>
-        </w:rPr>
-        <w:t xml:space="preserve">The single confirmatory hypothesis concerns favorites whose vig-free implied probability exceeds .70. Under the null each game is a Bernoulli trial with its own probability, so the number of favorite wins follows a Poisson-binomial distribution with mean equal to the sum of the game-level probabilities and variance equal to the sum of p(1 - p). The test compares actual wins with that expected sum and uses the corresponding game-level null variance. It is two-sided at alpha = .05. Because implied probabilities vary game by game, this construction replaces the fixed-probability bucket tests common in the literature, which treat every game in a bucket as carrying the same probability.</w:t>
-      </w:r>
-    </w:p>
-    <w:p>
-      <w:pPr>
-        <w:spacing w:after="100" w:before="240" w:line="300"/>
-      </w:pPr>
-      <w:r>
-        <w:rPr>
-          <w:rFonts w:ascii="Georgia" w:cs="Georgia" w:eastAsia="Georgia" w:hAnsi="Georgia"/>
-          <w:b/>
-          <w:bCs/>
-          <w:color w:val="2c2c54"/>
-          <w:sz w:val="24"/>
-          <w:szCs w:val="24"/>
-        </w:rPr>
-        <w:t xml:space="preserve">4.3 Dependence</w:t>
-      </w:r>
-    </w:p>
-    <w:p>
-      <w:pPr>
-        <w:spacing w:after="160" w:line="340"/>
-        <w:jc w:val="both"/>
-      </w:pPr>
-      <w:r>
-        <w:rPr>
-          <w:rFonts w:ascii="Georgia" w:cs="Georgia" w:eastAsia="Georgia" w:hAnsi="Georgia"/>
-          <w:color w:val="1a1a1a"/>
-          <w:sz w:val="22"/>
-          <w:szCs w:val="22"/>
-        </w:rPr>
-        <w:t xml:space="preserve">The Poisson-binomial framework treats games as independent conditional on their own prices. That is standard for a calibration test, but these observations are not obviously independent, and the assumption deserves to be named rather than assumed.</w:t>
-      </w:r>
-    </w:p>
-    <w:p>
-      <w:pPr>
-        <w:spacing w:after="160" w:line="340"/>
-        <w:jc w:val="both"/>
-      </w:pPr>
-      <w:r>
-        <w:rPr>
-          <w:rFonts w:ascii="Georgia" w:cs="Georgia" w:eastAsia="Georgia" w:hAnsi="Georgia"/>
-          <w:color w:val="1a1a1a"/>
-          <w:sz w:val="22"/>
-          <w:szCs w:val="22"/>
-        </w:rPr>
-        <w:t xml:space="preserve">Dependence within a game is not an issue, because only one favorite outcome is analyzed per game and the two sides are collinear by construction. Four other channels are plausible. Each team appears in roughly a thousand games, so a team the market persistently misjudges would correlate its own residuals across the sample. Roster rules, pace, officiating and market structure are common within a season. Injuries and news propagate across nearby games. And a consensus price aggregates books that share information, so pricing errors need not be idiosyncratic.</w:t>
-      </w:r>
-    </w:p>
-    <w:p>
-      <w:pPr>
-        <w:spacing w:after="160" w:line="340"/>
-        <w:jc w:val="both"/>
-      </w:pPr>
-      <w:r>
-        <w:rPr>
-          <w:rFonts w:ascii="Georgia" w:cs="Georgia" w:eastAsia="Georgia" w:hAnsi="Georgia"/>
-          <w:color w:val="1a1a1a"/>
-          <w:sz w:val="22"/>
-          <w:szCs w:val="22"/>
-        </w:rPr>
-        <w:t xml:space="preserve">None of this changes the point estimate; all of it can change the standard error. Section 5.4 therefore re-estimates the gap under cluster-robust variance at the season level, the favorite-team level, the underdog-team level, and two-way, and adds a team-blocked bootstrap alongside the season-blocked one. The confirmatory test is retained in its pre-specified form; the question asked of these alternatives is only whether the conclusion survives them.</w:t>
-      </w:r>
-    </w:p>
-    <w:p>
-      <w:pPr>
-        <w:spacing w:after="100" w:before="240" w:line="300"/>
-      </w:pPr>
-      <w:r>
-        <w:rPr>
-          <w:rFonts w:ascii="Georgia" w:cs="Georgia" w:eastAsia="Georgia" w:hAnsi="Georgia"/>
-          <w:b/>
-          <w:bCs/>
-          <w:color w:val="2c2c54"/>
-          <w:sz w:val="24"/>
-          <w:szCs w:val="24"/>
-        </w:rPr>
-        <w:t xml:space="preserve">4.4 Power</w:t>
-      </w:r>
-    </w:p>
-    <w:p>
-      <w:pPr>
-        <w:spacing w:after="160" w:line="340"/>
-        <w:jc w:val="both"/>
-      </w:pPr>
-      <w:r>
-        <w:rPr>
-          <w:rFonts w:ascii="Georgia" w:cs="Georgia" w:eastAsia="Georgia" w:hAnsi="Georgia"/>
-          <w:color w:val="1a1a1a"/>
-          <w:sz w:val="22"/>
-          <w:szCs w:val="22"/>
-        </w:rPr>
-        <w:t xml:space="preserve">The null result matters only if the design could have caught a deviation worth caring about, so the calculation is stated in full. Let p be the vig-free implied probability of each game in the primary group and n the number of games. The standard error of the gap is the square root of the sum of p(1 - p), divided by n. For a two-sided test at alpha, power against a true gap is the probability that the standardized estimate exceeds the critical value in either tail. Under the normal approximation, the conventional two-sided minimum detectable effect at 80 percent power is the sum of the two critical values multiplied by that standard error. The variance is the heterogeneous per-game one rather than a single pooled value, so the calculation reflects the actual distribution of prices.</w:t>
-      </w:r>
-    </w:p>
-    <w:p>
-      <w:pPr>
-        <w:spacing w:after="40"/>
+        <w:t xml:space="preserve">The null result matters only if the design could catch a deviation worth caring about. The standard error of the gap is the square root of the sum of p(1 - p) divided by n, using the heterogeneous per-game variance rather than a pooled value. Under the normal approximation the conventional two-sided minimum detectable effect at 80 percent power is the sum of the two critical values multiplied by that standard error. Because that is an approximation rather than an exact inversion of the Poisson-binomial power function, the exact version was computed as a check and agrees to four thousandths of a percentage point; details are in the supplementary material.</w:t>
+      </w:r>
+    </w:p>
+    <w:p>
+      <w:pPr>
+        <w:spacing w:after="30"/>
       </w:pPr>
     </w:p>
     <w:tbl>
@@ -1013,7 +736,7 @@
                 <w:sz w:val="17"/>
                 <w:szCs w:val="17"/>
               </w:rPr>
-              <w:t xml:space="preserve">Significance level (two-sided)</w:t>
+              <w:t xml:space="preserve">Significance level, two-sided</w:t>
             </w:r>
           </w:p>
         </w:tc>
@@ -1041,7 +764,7 @@
                 <w:sz w:val="17"/>
                 <w:szCs w:val="17"/>
               </w:rPr>
-              <w:t xml:space="preserve">α = .05</w:t>
+              <w:t xml:space="preserve">alpha = .05</w:t>
             </w:r>
           </w:p>
         </w:tc>
@@ -1245,7 +968,7 @@
                 <w:sz w:val="17"/>
                 <w:szCs w:val="17"/>
               </w:rPr>
-              <w:t xml:space="preserve">Critical values z(α/2), z(power)</w:t>
+              <w:t xml:space="preserve">MDE, normal approximation</w:t>
             </w:r>
           </w:p>
         </w:tc>
@@ -1273,7 +996,7 @@
                 <w:sz w:val="17"/>
                 <w:szCs w:val="17"/>
               </w:rPr>
-              <w:t xml:space="preserve">1.960, 0.842</w:t>
+              <w:t xml:space="preserve">1.3281 pp</w:t>
             </w:r>
           </w:p>
         </w:tc>
@@ -1303,65 +1026,7 @@
                 <w:sz w:val="17"/>
                 <w:szCs w:val="17"/>
               </w:rPr>
-              <w:t xml:space="preserve">Minimum detectable effect, normal approximation</w:t>
-            </w:r>
-          </w:p>
-        </w:tc>
-        <w:tc>
-          <w:tcPr>
-            <w:tcW w:type="dxa" w:w="3960"/>
-            <w:tcMar>
-              <w:top w:type="dxa" w:w="60"/>
-              <w:left w:type="dxa" w:w="90"/>
-              <w:bottom w:type="dxa" w:w="60"/>
-              <w:right w:type="dxa" w:w="90"/>
-            </w:tcMar>
-          </w:tcPr>
-          <w:p>
-            <w:pPr>
-              <w:spacing w:after="0" w:line="240"/>
-              <w:jc w:val="right"/>
-            </w:pPr>
-            <w:r>
-              <w:rPr>
-                <w:rFonts w:ascii="Georgia" w:cs="Georgia" w:eastAsia="Georgia" w:hAnsi="Georgia"/>
-                <w:b w:val="false"/>
-                <w:bCs w:val="false"/>
-                <w:color w:val="1a1a1a"/>
-                <w:sz w:val="17"/>
-                <w:szCs w:val="17"/>
-              </w:rPr>
-              <w:t xml:space="preserve">1.3281 pp</w:t>
-            </w:r>
-          </w:p>
-        </w:tc>
-      </w:tr>
-      <w:tr>
-        <w:tc>
-          <w:tcPr>
-            <w:tcW w:type="dxa" w:w="5400"/>
-            <w:tcMar>
-              <w:top w:type="dxa" w:w="60"/>
-              <w:left w:type="dxa" w:w="90"/>
-              <w:bottom w:type="dxa" w:w="60"/>
-              <w:right w:type="dxa" w:w="90"/>
-            </w:tcMar>
-          </w:tcPr>
-          <w:p>
-            <w:pPr>
-              <w:spacing w:after="0" w:line="240"/>
-              <w:jc w:val="left"/>
-            </w:pPr>
-            <w:r>
-              <w:rPr>
-                <w:rFonts w:ascii="Georgia" w:cs="Georgia" w:eastAsia="Georgia" w:hAnsi="Georgia"/>
-                <w:b w:val="false"/>
-                <w:bCs w:val="false"/>
-                <w:color w:val="1a1a1a"/>
-                <w:sz w:val="17"/>
-                <w:szCs w:val="17"/>
-              </w:rPr>
-              <w:t xml:space="preserve">Minimum detectable effect, exact Poisson-binomial</w:t>
+              <w:t xml:space="preserve">MDE, exact Poisson-binomial</w:t>
             </w:r>
           </w:p>
         </w:tc>
@@ -1525,22 +1190,7 @@
           <w:sz w:val="17"/>
           <w:szCs w:val="17"/>
         </w:rPr>
-        <w:t xml:space="preserve">Table 1. Power parameters for the primary test. The normal-approximation MDE is the sum of the two critical values multiplied by the standard error; the exact figure inverts the Poisson-binomial power function directly. Figure 3 plots the full power curve behind these numbers.</w:t>
-      </w:r>
-    </w:p>
-    <w:p>
-      <w:pPr>
-        <w:spacing w:after="160" w:line="340"/>
-        <w:jc w:val="both"/>
-      </w:pPr>
-      <w:r>
-        <w:rPr>
-          <w:rFonts w:ascii="Georgia" w:cs="Georgia" w:eastAsia="Georgia" w:hAnsi="Georgia"/>
-          <w:color w:val="1a1a1a"/>
-          <w:sz w:val="22"/>
-          <w:szCs w:val="22"/>
-        </w:rPr>
-        <w:t xml:space="preserve">That formula is an approximation, not an exact inversion of the Poisson-binomial power function, so the exact version was computed as a check. Building the exact Poisson-binomial distribution by discrete Fourier transform of its characteristic function gives an exact two-sided rejection region of 5,425 wins or fewer, or 5,554 or more, with true size .0484 rather than .05 because the statistic is discrete. Inverting exact power at 80 percent gives a minimum detectable effect of 1.3242 points against the normal approximation's 1.3281, a difference of four thousandths of a percentage point. The approximation is reported in the text because it is the conventional quantity; it is not doing any work the exact calculation would undo.</w:t>
+        <w:t xml:space="preserve">Table 1. Power parameters for the primary test. Figure 3 plots the full curve.</w:t>
       </w:r>
     </w:p>
     <w:p>
@@ -1556,7 +1206,7 @@
           <w:sz w:val="24"/>
           <w:szCs w:val="24"/>
         </w:rPr>
-        <w:t xml:space="preserve">4.5 The economic bar</w:t>
+        <w:t xml:space="preserve">4.3 The economic bar, and what was pre-specified</w:t>
       </w:r>
     </w:p>
     <w:p>
@@ -1571,43 +1221,12 @@
           <w:sz w:val="22"/>
           <w:szCs w:val="22"/>
         </w:rPr>
-        <w:t xml:space="preserve">A calibration gap matters to a bettor only when it is larger than the share of the margin carried by the favorite side of the price. That share equals the raw implied probability minus the vig-free probability, computed game by game. In the primary group it averages 3.01 percentage points, with a 10th-to-90th-percentile range of 2.35 to 3.72. Across all favorites it averages 2.61 points, and in the extreme tail 3.02 points. Because the design's minimum detectable effect is 1.33 points, the test can detect favorite mispricing well below the level a bettor could actually exploit.</w:t>
-      </w:r>
-    </w:p>
-    <w:p>
-      <w:pPr>
-        <w:spacing w:after="100" w:before="240" w:line="300"/>
-      </w:pPr>
-      <w:r>
-        <w:rPr>
-          <w:rFonts w:ascii="Georgia" w:cs="Georgia" w:eastAsia="Georgia" w:hAnsi="Georgia"/>
-          <w:b/>
-          <w:bCs/>
-          <w:color w:val="2c2c54"/>
-          <w:sz w:val="24"/>
-          <w:szCs w:val="24"/>
-        </w:rPr>
-        <w:t xml:space="preserve">4.6 Confirmatory and exploratory analyses</w:t>
-      </w:r>
-    </w:p>
-    <w:p>
-      <w:pPr>
-        <w:spacing w:after="160" w:line="340"/>
-        <w:jc w:val="both"/>
-      </w:pPr>
-      <w:r>
-        <w:rPr>
-          <w:rFonts w:ascii="Georgia" w:cs="Georgia" w:eastAsia="Georgia" w:hAnsi="Georgia"/>
-          <w:color w:val="1a1a1a"/>
-          <w:sz w:val="22"/>
-          <w:szCs w:val="22"/>
-        </w:rPr>
-        <w:t xml:space="preserve">The distinction is kept explicit throughout, because it governs how much weight each result can carry.</w:t>
-      </w:r>
-    </w:p>
-    <w:p>
-      <w:pPr>
-        <w:spacing w:after="40"/>
+        <w:t xml:space="preserve">A calibration gap matters to a bettor only when it exceeds the share of the margin carried by the favorite side, which equals the raw implied probability minus the vig-free probability, computed game by game. In the primary group that averages 3.01 percentage points (10th to 90th percentile 2.35 to 3.72), across all favorites 2.61, and in the extreme tail 3.02. Since the minimum detectable effect is 1.33 points, the test can detect mispricing well below the level a bettor could exploit.</w:t>
+      </w:r>
+    </w:p>
+    <w:p>
+      <w:pPr>
+        <w:spacing w:after="30"/>
       </w:pPr>
     </w:p>
     <w:tbl>
@@ -1742,7 +1361,7 @@
                 <w:sz w:val="17"/>
                 <w:szCs w:val="17"/>
               </w:rPr>
-              <w:t xml:space="preserve">Season-by-season gaps and Cochran Q</w:t>
+              <w:t xml:space="preserve">Season gaps and Cochran Q</w:t>
             </w:r>
           </w:p>
         </w:tc>
@@ -1830,7 +1449,7 @@
                 <w:sz w:val="17"/>
                 <w:szCs w:val="17"/>
               </w:rPr>
-              <w:t xml:space="preserve">Five fixed probability buckets, Holm corrected</w:t>
+              <w:t xml:space="preserve">Five probability buckets, Holm corrected</w:t>
             </w:r>
           </w:p>
         </w:tc>
@@ -1858,7 +1477,7 @@
                 <w:sz w:val="17"/>
                 <w:szCs w:val="17"/>
               </w:rPr>
-              <w:t xml:space="preserve">Season-blocked and team-blocked bootstrap</w:t>
+              <w:t xml:space="preserve">Season- and team-blocked bootstrap</w:t>
             </w:r>
           </w:p>
         </w:tc>
@@ -1994,7 +1613,7 @@
           <w:sz w:val="17"/>
           <w:szCs w:val="17"/>
         </w:rPr>
-        <w:t xml:space="preserve">Table 2. Only the left column was pre-specified. Results in the right column are reported as exploratory and are not corrected for multiplicity across the family.</w:t>
+        <w:t xml:space="preserve">Table 2. Only the left column was pre-specified. Right-column results are exploratory and are not corrected for multiplicity across the family.</w:t>
       </w:r>
     </w:p>
     <w:p>
@@ -2026,7 +1645,7 @@
           <w:sz w:val="24"/>
           <w:szCs w:val="24"/>
         </w:rPr>
-        <w:t xml:space="preserve">5.1 Primary result</w:t>
+        <w:t xml:space="preserve">5.1 Primary result and continuous calibration</w:t>
       </w:r>
     </w:p>
     <w:p>
@@ -2041,23 +1660,7 @@
           <w:sz w:val="22"/>
           <w:szCs w:val="22"/>
         </w:rPr>
-        <w:t xml:space="preserve">The primary group contains 6,840 games, 44.6 percent of the sample. Favorites won 5,529 games against an expected 5,489.45, an observed rate of 80.83 percent against an implied 80.26 percent. The gap is +0.58 percentage points, with z = 1.22 and p = .223. The test does not reject calibration. The direction of the gap runs toward favorites winning slightly more often than their price implies, which is the opposite of the favorite bias the study was designed to detect.</w:t>
-      </w:r>
-    </w:p>
-    <w:p>
-      <w:pPr>
-        <w:spacing w:after="100" w:before="240" w:line="300"/>
-      </w:pPr>
-      <w:r>
-        <w:rPr>
-          <w:rFonts w:ascii="Georgia" w:cs="Georgia" w:eastAsia="Georgia" w:hAnsi="Georgia"/>
-          <w:b/>
-          <w:bCs/>
-          <w:color w:val="2c2c54"/>
-          <w:sz w:val="24"/>
-          <w:szCs w:val="24"/>
-        </w:rPr>
-        <w:t xml:space="preserve">5.2 Continuous calibration</w:t>
+        <w:t xml:space="preserve">The primary group contains 6,840 games, 44.6 percent of the sample. Favorites won 5,529 against an expected 5,489.45, an observed rate of 80.83 percent against an implied 80.26. The gap is +0.58 percentage points, z = 1.22, p = .223. The test does not reject calibration, and the direction runs toward favorites winning slightly more often than their price implies, the opposite of the bias the study was designed to detect.</w:t>
       </w:r>
     </w:p>
     <w:p>
@@ -2072,7 +1675,7 @@
           <w:sz w:val="22"/>
           <w:szCs w:val="22"/>
         </w:rPr>
-        <w:t xml:space="preserve">The logistic regression gives an intercept of -0.047 (95% CI: -0.107 to 0.013) and a slope of 1.049 (95% CI: 0.982 to 1.116). Under classical standard errors the joint Wald test of perfect calibration gives chi-squared = 2.45 with p = .293. Section 5.4 reports how that test behaves under clustered variance, where it is less stable than the primary test. Figure 1 shows the decile calibration plot.</w:t>
+        <w:t xml:space="preserve">The logistic calibration regression gives an intercept of -0.047 (95% CI: -0.107 to 0.013) and a slope of 1.049 (0.982 to 1.116). Under classical standard errors the joint Wald test of perfect calibration gives chi-squared = 2.45, p = .293. Section 5.3 reports how that test behaves under clustered variance, where it is less stable than the primary test.</w:t>
       </w:r>
     </w:p>
     <w:p>
@@ -2083,7 +1686,7 @@
       <w:r>
         <w:drawing>
           <wp:inline distT="0" distB="0" distL="0" distR="0">
-            <wp:extent cx="4953000" cy="4219575"/>
+            <wp:extent cx="4095750" cy="3486150"/>
             <wp:effectExtent t="0" r="0" b="0" l="0"/>
             <wp:docPr id="1" name="" descr="" title=""/>
             <wp:cNvGraphicFramePr>
@@ -2108,7 +1711,7 @@
                   <pic:spPr bwMode="auto">
                     <a:xfrm>
                       <a:off x="0" y="0"/>
-                      <a:ext cx="4953000" cy="4219575"/>
+                      <a:ext cx="4095750" cy="3486150"/>
                     </a:xfrm>
                     <a:prstGeom prst="rect">
                       <a:avLst/>
@@ -2135,7 +1738,7 @@
           <w:sz w:val="17"/>
           <w:szCs w:val="17"/>
         </w:rPr>
-        <w:t xml:space="preserve">Figure 1. Observed favorite win rates against vig-free implied probability, by decile of implied probability, with 95 percent Wilson intervals, against the line of perfect calibration. Deciles of 15,351 games, 1,347 to 1,804 games each. Each game is weighted equally. Archived consensus moneylines, 2007-08 to 2019-20, vig removed proportionally.</w:t>
+        <w:t xml:space="preserve">Figure 1. Observed favorite win rates against vig-free implied probability, by decile, with 95 percent Wilson intervals, against the line of perfect calibration. Deciles of 15,351 games, 1,347 to 1,804 games each, equally weighted.</w:t>
       </w:r>
     </w:p>
     <w:p>
@@ -2151,7 +1754,7 @@
           <w:sz w:val="24"/>
           <w:szCs w:val="24"/>
         </w:rPr>
-        <w:t xml:space="preserve">5.3 Bucket results</w:t>
+        <w:t xml:space="preserve">5.2 Buckets</w:t>
       </w:r>
     </w:p>
     <w:p>
@@ -2166,12 +1769,12 @@
           <w:sz w:val="22"/>
           <w:szCs w:val="22"/>
         </w:rPr>
-        <w:t xml:space="preserve">None of the pre-specified buckets reject after the Holm correction. The largest deviation is +1.73 points in the .75 to .80 range, with a raw p of .091 and a Holm-adjusted p of .457.</w:t>
-      </w:r>
-    </w:p>
-    <w:p>
-      <w:pPr>
-        <w:spacing w:after="40"/>
+        <w:t xml:space="preserve">No pre-specified bucket rejects after Holm correction. The largest deviation is +1.73 points in the .75 to .80 range, raw p .091, Holm-adjusted .457.</w:t>
+      </w:r>
+    </w:p>
+    <w:p>
+      <w:pPr>
+        <w:spacing w:after="30"/>
       </w:pPr>
     </w:p>
     <w:tbl>
@@ -3748,7 +3351,7 @@
           <w:sz w:val="17"/>
           <w:szCs w:val="17"/>
         </w:rPr>
-        <w:t xml:space="preserve">Table 3. Pre-specified probability buckets, Poisson-binomial test in each, Holm correction across the five. Expected wins is the sum of the game-level vig-free probabilities in the bucket.</w:t>
+        <w:t xml:space="preserve">Table 3. Pre-specified buckets, Poisson-binomial test in each, Holm correction across the five. Expected wins is the sum of game-level vig-free probabilities.</w:t>
       </w:r>
     </w:p>
     <w:p>
@@ -3764,7 +3367,7 @@
           <w:sz w:val="24"/>
           <w:szCs w:val="24"/>
         </w:rPr>
-        <w:t xml:space="preserve">5.4 Robustness</w:t>
+        <w:t xml:space="preserve">5.3 Seasons and dependence</w:t>
       </w:r>
     </w:p>
     <w:p>
@@ -3779,12 +3382,12 @@
           <w:sz w:val="22"/>
           <w:szCs w:val="22"/>
         </w:rPr>
-        <w:t xml:space="preserve">Three families of check are reported: across seasons, across dependence structures, and across vig-removal rules. The first two leave the primary conclusion intact. The third does not merely qualify it. Under one of five normalization rules the sample shows a statistically significant favorite bias that marginally exceeds its own break-even threshold, which is evidence against universal robustness and is treated here as a finding rather than as a footnote.</w:t>
-      </w:r>
-    </w:p>
-    <w:p>
-      <w:pPr>
-        <w:spacing w:after="200" w:line="340"/>
+        <w:t xml:space="preserve">No individual season rejects. The 13 season gaps range from -2.82 to +2.52 points with every p above .10. Heterogeneity is assessed with the Cochran Q statistic in its meta-analytic form, a test of whether the season gaps differ from one another by more than sampling noise rather than a test that the pooled gap is zero: writing y for the season gap and w for the inverse of its Poisson-binomial null variance, Q is the sum of w times the squared deviation of y from the inverse-variance-weighted mean, on twelve degrees of freedom. So constructed, Q = 8.37, p = .756, I-squared 0 percent. In the extreme tail above .90, 756 games give +0.63 points at p = .506; its minimum detectable effect of 2.66 sits just below its 3.02-point break-even requirement, so even the thinnest pre-specified slice is adequately powered for economically relevant bias in that slice.</w:t>
+      </w:r>
+    </w:p>
+    <w:p>
+      <w:pPr>
+        <w:spacing w:after="160" w:line="340"/>
         <w:jc w:val="both"/>
       </w:pPr>
       <w:r>
@@ -3794,42 +3397,12 @@
           <w:sz w:val="22"/>
           <w:szCs w:val="22"/>
         </w:rPr>
-        <w:t xml:space="preserve">Across seasons, no individual season rejects the null. The 13 season-level gaps range from -2.82 to +2.52 percentage points and every p value is above .10. Heterogeneity is assessed with the Cochran Q statistic in its meta-analytic form, which is a test of whether the season gaps differ from one another by more than sampling noise, not a test that the pooled gap is zero. Writing y for the season gap and w for the inverse of its Poisson-binomial null variance, Q is the sum of w times the squared deviation of y from the inverse-variance-weighted mean, referred to a chi-squared distribution on twelve degrees of freedom. Constructed that way, Q = 8.37 with p = .756 and I-squared at 0 percent, so there is no detectable variation across seasons. In the extreme tail above .90 implied probability, 756 games produce a +0.63-point gap with p = .506; its minimum detectable effect of 2.66 points sits just below its 3.02-point break-even requirement, so even the thinnest pre-specified slice is adequately powered for economically relevant bias in that slice.</w:t>
-      </w:r>
-    </w:p>
-    <w:p>
-      <w:pPr>
-        <w:spacing w:after="160" w:line="340"/>
-        <w:jc w:val="both"/>
-      </w:pPr>
-      <w:r>
-        <w:rPr>
-          <w:rFonts w:ascii="Georgia" w:cs="Georgia" w:eastAsia="Georgia" w:hAnsi="Georgia"/>
-          <w:color w:val="1a1a1a"/>
-          <w:sz w:val="22"/>
-          <w:szCs w:val="22"/>
-        </w:rPr>
-        <w:t xml:space="preserve">Dependence is the more serious concern, and the primary estimate is unmoved by it. The most credible single check is the team-blocked bootstrap, because it resamples 32 favorite teams rather than 13 seasons and therefore does not depend on asymptotics that fail at small cluster counts. It gives a 95 percent interval of -0.52 to +1.57 percentage points, wider than the season-blocked interval of -0.19 to +1.26, and containing zero.</w:t>
-      </w:r>
-    </w:p>
-    <w:p>
-      <w:pPr>
-        <w:spacing w:after="160" w:line="340"/>
-        <w:jc w:val="both"/>
-      </w:pPr>
-      <w:r>
-        <w:rPr>
-          <w:rFonts w:ascii="Georgia" w:cs="Georgia" w:eastAsia="Georgia" w:hAnsi="Georgia"/>
-          <w:color w:val="1a1a1a"/>
-          <w:sz w:val="22"/>
-          <w:szCs w:val="22"/>
-        </w:rPr>
-        <w:t xml:space="preserve">Table 4 adds the cluster-robust estimators. The point estimate is +0.58 points in every specification by construction; what changes is the standard error, which ranges from 0.39 to 0.53 points against the Poisson-binomial value of 0.47. No estimator rejects calibration. The two rows resting on 13 season clusters are reported as sensitivity checks and should not be read as reliable finite-sample inference: cluster-robust variance is asymptotic in the number of clusters, and at 13 it is known to understate variance, so the season-clustered p of .134 is if anything too small rather than too large.</w:t>
-      </w:r>
-    </w:p>
-    <w:p>
-      <w:pPr>
-        <w:spacing w:after="40"/>
+        <w:t xml:space="preserve">The most credible dependence check is the team-blocked bootstrap, because it resamples 32 favorite teams rather than 13 seasons and so does not lean on asymptotics that fail at small cluster counts. It gives a 95 percent interval of -0.52 to +1.57 points, wider than the season-blocked -0.19 to +1.26, and containing zero. Table 4 adds the cluster-robust estimators; the point estimate is +0.58 throughout and only the standard error moves, from 0.39 to 0.53 against the Poisson-binomial 0.47. None rejects calibration. The rows resting on 13 season clusters are sensitivity checks, not reliable finite-sample inference: cluster-robust variance is asymptotic in the cluster count and at 13 is known to understate variance, so the season-clustered p of .134 is if anything too small.</w:t>
+      </w:r>
+    </w:p>
+    <w:p>
+      <w:pPr>
+        <w:spacing w:after="30"/>
       </w:pPr>
     </w:p>
     <w:tbl>
@@ -3845,11 +3418,11 @@
         </w:tblBorders>
       </w:tblPr>
       <w:tblGrid>
-        <w:gridCol w:w="3300"/>
-        <w:gridCol w:w="900"/>
-        <w:gridCol w:w="900"/>
-        <w:gridCol w:w="750"/>
-        <w:gridCol w:w="750"/>
+        <w:gridCol w:w="3500"/>
+        <w:gridCol w:w="850"/>
+        <w:gridCol w:w="850"/>
+        <w:gridCol w:w="700"/>
+        <w:gridCol w:w="700"/>
         <w:gridCol w:w="2760"/>
       </w:tblGrid>
       <w:tr>
@@ -3858,7 +3431,7 @@
         </w:trPr>
         <w:tc>
           <w:tcPr>
-            <w:tcW w:type="dxa" w:w="3300"/>
+            <w:tcW w:type="dxa" w:w="3500"/>
             <w:shd w:fill="eef1f5" w:val="clear"/>
             <w:tcMar>
               <w:top w:type="dxa" w:w="60"/>
@@ -3887,7 +3460,7 @@
         </w:tc>
         <w:tc>
           <w:tcPr>
-            <w:tcW w:type="dxa" w:w="900"/>
+            <w:tcW w:type="dxa" w:w="850"/>
             <w:shd w:fill="eef1f5" w:val="clear"/>
             <w:tcMar>
               <w:top w:type="dxa" w:w="60"/>
@@ -3916,7 +3489,7 @@
         </w:tc>
         <w:tc>
           <w:tcPr>
-            <w:tcW w:type="dxa" w:w="900"/>
+            <w:tcW w:type="dxa" w:w="850"/>
             <w:shd w:fill="eef1f5" w:val="clear"/>
             <w:tcMar>
               <w:top w:type="dxa" w:w="60"/>
@@ -3945,7 +3518,7 @@
         </w:tc>
         <w:tc>
           <w:tcPr>
-            <w:tcW w:type="dxa" w:w="750"/>
+            <w:tcW w:type="dxa" w:w="700"/>
             <w:shd w:fill="eef1f5" w:val="clear"/>
             <w:tcMar>
               <w:top w:type="dxa" w:w="60"/>
@@ -3974,7 +3547,7 @@
         </w:tc>
         <w:tc>
           <w:tcPr>
-            <w:tcW w:type="dxa" w:w="750"/>
+            <w:tcW w:type="dxa" w:w="700"/>
             <w:shd w:fill="eef1f5" w:val="clear"/>
             <w:tcMar>
               <w:top w:type="dxa" w:w="60"/>
@@ -4034,7 +3607,7 @@
       <w:tr>
         <w:tc>
           <w:tcPr>
-            <w:tcW w:type="dxa" w:w="3300"/>
+            <w:tcW w:type="dxa" w:w="3500"/>
             <w:tcMar>
               <w:top w:type="dxa" w:w="60"/>
               <w:left w:type="dxa" w:w="90"/>
@@ -4062,7 +3635,7 @@
         </w:tc>
         <w:tc>
           <w:tcPr>
-            <w:tcW w:type="dxa" w:w="900"/>
+            <w:tcW w:type="dxa" w:w="850"/>
             <w:tcMar>
               <w:top w:type="dxa" w:w="60"/>
               <w:left w:type="dxa" w:w="90"/>
@@ -4090,7 +3663,7 @@
         </w:tc>
         <w:tc>
           <w:tcPr>
-            <w:tcW w:type="dxa" w:w="900"/>
+            <w:tcW w:type="dxa" w:w="850"/>
             <w:tcMar>
               <w:top w:type="dxa" w:w="60"/>
               <w:left w:type="dxa" w:w="90"/>
@@ -4118,7 +3691,7 @@
         </w:tc>
         <w:tc>
           <w:tcPr>
-            <w:tcW w:type="dxa" w:w="750"/>
+            <w:tcW w:type="dxa" w:w="700"/>
             <w:tcMar>
               <w:top w:type="dxa" w:w="60"/>
               <w:left w:type="dxa" w:w="90"/>
@@ -4146,7 +3719,7 @@
         </w:tc>
         <w:tc>
           <w:tcPr>
-            <w:tcW w:type="dxa" w:w="750"/>
+            <w:tcW w:type="dxa" w:w="700"/>
             <w:tcMar>
               <w:top w:type="dxa" w:w="60"/>
               <w:left w:type="dxa" w:w="90"/>
@@ -4204,7 +3777,7 @@
       <w:tr>
         <w:tc>
           <w:tcPr>
-            <w:tcW w:type="dxa" w:w="3300"/>
+            <w:tcW w:type="dxa" w:w="3500"/>
             <w:tcMar>
               <w:top w:type="dxa" w:w="60"/>
               <w:left w:type="dxa" w:w="90"/>
@@ -4232,7 +3805,7 @@
         </w:tc>
         <w:tc>
           <w:tcPr>
-            <w:tcW w:type="dxa" w:w="900"/>
+            <w:tcW w:type="dxa" w:w="850"/>
             <w:tcMar>
               <w:top w:type="dxa" w:w="60"/>
               <w:left w:type="dxa" w:w="90"/>
@@ -4260,7 +3833,7 @@
         </w:tc>
         <w:tc>
           <w:tcPr>
-            <w:tcW w:type="dxa" w:w="900"/>
+            <w:tcW w:type="dxa" w:w="850"/>
             <w:tcMar>
               <w:top w:type="dxa" w:w="60"/>
               <w:left w:type="dxa" w:w="90"/>
@@ -4288,7 +3861,7 @@
         </w:tc>
         <w:tc>
           <w:tcPr>
-            <w:tcW w:type="dxa" w:w="750"/>
+            <w:tcW w:type="dxa" w:w="700"/>
             <w:tcMar>
               <w:top w:type="dxa" w:w="60"/>
               <w:left w:type="dxa" w:w="90"/>
@@ -4316,7 +3889,7 @@
         </w:tc>
         <w:tc>
           <w:tcPr>
-            <w:tcW w:type="dxa" w:w="750"/>
+            <w:tcW w:type="dxa" w:w="700"/>
             <w:tcMar>
               <w:top w:type="dxa" w:w="60"/>
               <w:left w:type="dxa" w:w="90"/>
@@ -4374,7 +3947,7 @@
       <w:tr>
         <w:tc>
           <w:tcPr>
-            <w:tcW w:type="dxa" w:w="3300"/>
+            <w:tcW w:type="dxa" w:w="3500"/>
             <w:tcMar>
               <w:top w:type="dxa" w:w="60"/>
               <w:left w:type="dxa" w:w="90"/>
@@ -4396,13 +3969,13 @@
                 <w:sz w:val="17"/>
                 <w:szCs w:val="17"/>
               </w:rPr>
-              <w:t xml:space="preserve">Clustered by season (13 clusters, unreliable)</w:t>
-            </w:r>
-          </w:p>
-        </w:tc>
-        <w:tc>
-          <w:tcPr>
-            <w:tcW w:type="dxa" w:w="900"/>
+              <w:t xml:space="preserve">Clustered by season (unreliable, 13)</w:t>
+            </w:r>
+          </w:p>
+        </w:tc>
+        <w:tc>
+          <w:tcPr>
+            <w:tcW w:type="dxa" w:w="850"/>
             <w:tcMar>
               <w:top w:type="dxa" w:w="60"/>
               <w:left w:type="dxa" w:w="90"/>
@@ -4430,7 +4003,7 @@
         </w:tc>
         <w:tc>
           <w:tcPr>
-            <w:tcW w:type="dxa" w:w="900"/>
+            <w:tcW w:type="dxa" w:w="850"/>
             <w:tcMar>
               <w:top w:type="dxa" w:w="60"/>
               <w:left w:type="dxa" w:w="90"/>
@@ -4458,7 +4031,7 @@
         </w:tc>
         <w:tc>
           <w:tcPr>
-            <w:tcW w:type="dxa" w:w="750"/>
+            <w:tcW w:type="dxa" w:w="700"/>
             <w:tcMar>
               <w:top w:type="dxa" w:w="60"/>
               <w:left w:type="dxa" w:w="90"/>
@@ -4486,7 +4059,7 @@
         </w:tc>
         <w:tc>
           <w:tcPr>
-            <w:tcW w:type="dxa" w:w="750"/>
+            <w:tcW w:type="dxa" w:w="700"/>
             <w:tcMar>
               <w:top w:type="dxa" w:w="60"/>
               <w:left w:type="dxa" w:w="90"/>
@@ -4544,7 +4117,7 @@
       <w:tr>
         <w:tc>
           <w:tcPr>
-            <w:tcW w:type="dxa" w:w="3300"/>
+            <w:tcW w:type="dxa" w:w="3500"/>
             <w:tcMar>
               <w:top w:type="dxa" w:w="60"/>
               <w:left w:type="dxa" w:w="90"/>
@@ -4572,7 +4145,7 @@
         </w:tc>
         <w:tc>
           <w:tcPr>
-            <w:tcW w:type="dxa" w:w="900"/>
+            <w:tcW w:type="dxa" w:w="850"/>
             <w:tcMar>
               <w:top w:type="dxa" w:w="60"/>
               <w:left w:type="dxa" w:w="90"/>
@@ -4600,7 +4173,7 @@
         </w:tc>
         <w:tc>
           <w:tcPr>
-            <w:tcW w:type="dxa" w:w="900"/>
+            <w:tcW w:type="dxa" w:w="850"/>
             <w:tcMar>
               <w:top w:type="dxa" w:w="60"/>
               <w:left w:type="dxa" w:w="90"/>
@@ -4628,7 +4201,7 @@
         </w:tc>
         <w:tc>
           <w:tcPr>
-            <w:tcW w:type="dxa" w:w="750"/>
+            <w:tcW w:type="dxa" w:w="700"/>
             <w:tcMar>
               <w:top w:type="dxa" w:w="60"/>
               <w:left w:type="dxa" w:w="90"/>
@@ -4656,7 +4229,7 @@
         </w:tc>
         <w:tc>
           <w:tcPr>
-            <w:tcW w:type="dxa" w:w="750"/>
+            <w:tcW w:type="dxa" w:w="700"/>
             <w:tcMar>
               <w:top w:type="dxa" w:w="60"/>
               <w:left w:type="dxa" w:w="90"/>
@@ -4714,7 +4287,7 @@
       <w:tr>
         <w:tc>
           <w:tcPr>
-            <w:tcW w:type="dxa" w:w="3300"/>
+            <w:tcW w:type="dxa" w:w="3500"/>
             <w:tcMar>
               <w:top w:type="dxa" w:w="60"/>
               <w:left w:type="dxa" w:w="90"/>
@@ -4742,7 +4315,7 @@
         </w:tc>
         <w:tc>
           <w:tcPr>
-            <w:tcW w:type="dxa" w:w="900"/>
+            <w:tcW w:type="dxa" w:w="850"/>
             <w:tcMar>
               <w:top w:type="dxa" w:w="60"/>
               <w:left w:type="dxa" w:w="90"/>
@@ -4770,7 +4343,7 @@
         </w:tc>
         <w:tc>
           <w:tcPr>
-            <w:tcW w:type="dxa" w:w="900"/>
+            <w:tcW w:type="dxa" w:w="850"/>
             <w:tcMar>
               <w:top w:type="dxa" w:w="60"/>
               <w:left w:type="dxa" w:w="90"/>
@@ -4798,7 +4371,7 @@
         </w:tc>
         <w:tc>
           <w:tcPr>
-            <w:tcW w:type="dxa" w:w="750"/>
+            <w:tcW w:type="dxa" w:w="700"/>
             <w:tcMar>
               <w:top w:type="dxa" w:w="60"/>
               <w:left w:type="dxa" w:w="90"/>
@@ -4826,7 +4399,7 @@
         </w:tc>
         <w:tc>
           <w:tcPr>
-            <w:tcW w:type="dxa" w:w="750"/>
+            <w:tcW w:type="dxa" w:w="700"/>
             <w:tcMar>
               <w:top w:type="dxa" w:w="60"/>
               <w:left w:type="dxa" w:w="90"/>
@@ -4884,7 +4457,7 @@
       <w:tr>
         <w:tc>
           <w:tcPr>
-            <w:tcW w:type="dxa" w:w="3300"/>
+            <w:tcW w:type="dxa" w:w="3500"/>
             <w:tcMar>
               <w:top w:type="dxa" w:w="60"/>
               <w:left w:type="dxa" w:w="90"/>
@@ -4906,13 +4479,13 @@
                 <w:sz w:val="17"/>
                 <w:szCs w:val="17"/>
               </w:rPr>
-              <w:t xml:space="preserve">Two-way, season and team (13 clusters, unreliable)</w:t>
-            </w:r>
-          </w:p>
-        </w:tc>
-        <w:tc>
-          <w:tcPr>
-            <w:tcW w:type="dxa" w:w="900"/>
+              <w:t xml:space="preserve">Two-way, season and team (unreliable, 13)</w:t>
+            </w:r>
+          </w:p>
+        </w:tc>
+        <w:tc>
+          <w:tcPr>
+            <w:tcW w:type="dxa" w:w="850"/>
             <w:tcMar>
               <w:top w:type="dxa" w:w="60"/>
               <w:left w:type="dxa" w:w="90"/>
@@ -4940,7 +4513,7 @@
         </w:tc>
         <w:tc>
           <w:tcPr>
-            <w:tcW w:type="dxa" w:w="900"/>
+            <w:tcW w:type="dxa" w:w="850"/>
             <w:tcMar>
               <w:top w:type="dxa" w:w="60"/>
               <w:left w:type="dxa" w:w="90"/>
@@ -4968,7 +4541,7 @@
         </w:tc>
         <w:tc>
           <w:tcPr>
-            <w:tcW w:type="dxa" w:w="750"/>
+            <w:tcW w:type="dxa" w:w="700"/>
             <w:tcMar>
               <w:top w:type="dxa" w:w="60"/>
               <w:left w:type="dxa" w:w="90"/>
@@ -4996,7 +4569,7 @@
         </w:tc>
         <w:tc>
           <w:tcPr>
-            <w:tcW w:type="dxa" w:w="750"/>
+            <w:tcW w:type="dxa" w:w="700"/>
             <w:tcMar>
               <w:top w:type="dxa" w:w="60"/>
               <w:left w:type="dxa" w:w="90"/>
@@ -5066,7 +4639,7 @@
           <w:sz w:val="17"/>
           <w:szCs w:val="17"/>
         </w:rPr>
-        <w:t xml:space="preserve">Table 4. The primary calibration gap under six variance estimators. The gap is +0.58 pp throughout; only its standard error changes, and none rejects calibration at .05. Estimators built on 13 season clusters are flagged: cluster-robust variance is asymptotic in the cluster count and is not reliable at that number. The team-blocked bootstrap over 32 clusters, 95% CI -0.52 to +1.57 pp, is the more dependable check.</w:t>
+        <w:t xml:space="preserve">Table 4. The primary gap under six variance estimators. The gap is +0.58 pp throughout; only the standard error changes, and none rejects calibration.</w:t>
       </w:r>
     </w:p>
     <w:p>
@@ -5081,7 +4654,23 @@
           <w:sz w:val="22"/>
           <w:szCs w:val="22"/>
         </w:rPr>
-        <w:t xml:space="preserve">The logistic calibration regression is less stable than the primary test under the same treatment. Its joint Wald p is .293 with classical errors, .221 clustering on favorite team, .181 on underdog team, .085 on season, and .037 two-way on season and team. The last of those would reject perfect calibration at .05. It is reported rather than omitted, with the caveat that cluster-robust variance is unreliable when the number of clusters is small, and thirteen seasons is small enough that the estimator is known to understate variance and overstate significance. The reading this paper takes is that the confirmatory result is robust, the secondary regression is sensitive to how dependence is modeled, and a reader who prefers the two-way estimate should treat the calibration slope as unresolved rather than confirmed.</w:t>
+        <w:t xml:space="preserve">The logistic calibration regression is less stable under the same treatment. Its joint Wald p is .293 classical, .221 clustering on favorite team, .181 on underdog team, .085 on season and .037 two-way, the last of which would reject at .05 but rests on the same thirteen clusters. The reading taken here is that the confirmatory result is robust, the secondary regression is sensitive to how dependence is modeled, and a reader who prefers the two-way estimate should treat the calibration slope as unresolved rather than confirmed.</w:t>
+      </w:r>
+    </w:p>
+    <w:p>
+      <w:pPr>
+        <w:spacing w:after="100" w:before="240" w:line="300"/>
+      </w:pPr>
+      <w:r>
+        <w:rPr>
+          <w:rFonts w:ascii="Georgia" w:cs="Georgia" w:eastAsia="Georgia" w:hAnsi="Georgia"/>
+          <w:b/>
+          <w:bCs/>
+          <w:color w:val="2c2c54"/>
+          <w:sz w:val="24"/>
+          <w:szCs w:val="24"/>
+        </w:rPr>
+        <w:t xml:space="preserve">5.4 Vig removal</w:t>
       </w:r>
     </w:p>
     <w:p>
@@ -5096,27 +4685,12 @@
           <w:sz w:val="22"/>
           <w:szCs w:val="22"/>
         </w:rPr>
-        <w:t xml:space="preserve">Vig removal is the assumption the whole analysis rests on, so four alternatives to proportional normalization were run. Under additive normalization each side gives up the same number of probability points. Under power normalization each raw probability is raised to a common exponent chosen so the pair sums to one. Under the constant-odds-ratio rule the quoted and fair odds differ by a common factor. Shin (1993) prices against a share of insider money, which is designed to load more margin onto longshots.</w:t>
-      </w:r>
-    </w:p>
-    <w:p>
-      <w:pPr>
-        <w:spacing w:after="160" w:line="340"/>
-        <w:jc w:val="both"/>
-      </w:pPr>
-      <w:r>
-        <w:rPr>
-          <w:rFonts w:ascii="Georgia" w:cs="Georgia" w:eastAsia="Georgia" w:hAnsi="Georgia"/>
-          <w:color w:val="1a1a1a"/>
-          <w:sz w:val="22"/>
-          <w:szCs w:val="22"/>
-        </w:rPr>
-        <w:t xml:space="preserve">Shin turns out to be redundant here. For a two-outcome book its solution coincides exactly with the additive rule, because the sum constraint together with Shin's difference-preserving property leaves only one admissible pair. Appendix A gives the derivation and verifies every step against the sample at machine precision; the recovered insider share ranges from 0.4 to 7.2 percent, so these are genuine Shin solutions rather than a degenerate case. The two rules separate again with three or more outcomes.</w:t>
-      </w:r>
-    </w:p>
-    <w:p>
-      <w:pPr>
-        <w:spacing w:after="40"/>
+        <w:t xml:space="preserve">Vig removal is the assumption the whole analysis rests on, so four alternatives were run. Additive normalization gives each side the same number of probability points; power normalization raises each raw probability to a common exponent; the constant-odds-ratio rule separates quoted and fair odds by a common factor; Shin (1993) prices against a share of insider money. Shin turns out to be redundant here, coinciding exactly with the additive rule for a two-outcome book, because the sum constraint together with Shin's difference-preserving property leaves only one admissible pair. The derivation, its verification at machine precision, and the recovered insider share of 0.4 to 7.2 percent are in the supplementary material.</w:t>
+      </w:r>
+    </w:p>
+    <w:p>
+      <w:pPr>
+        <w:spacing w:after="30"/>
       </w:pPr>
     </w:p>
     <w:tbl>
@@ -6551,7 +6125,7 @@
           <w:sz w:val="17"/>
           <w:szCs w:val="17"/>
         </w:rPr>
-        <w:t xml:space="preserve">Table 5. The primary test under five vig-removal rules, plus the no-normalization case. Verdict compares the absolute gap with that rule's own break-even requirement. Shin and additive coincide exactly for a two-outcome book.</w:t>
+        <w:t xml:space="preserve">Table 5. The primary test under five vig-removal rules plus the no-normalization case. Verdict compares the absolute gap with that rule's own break-even requirement.</w:t>
       </w:r>
     </w:p>
     <w:p>
@@ -6566,7 +6140,7 @@
           <w:sz w:val="22"/>
           <w:szCs w:val="22"/>
         </w:rPr>
-        <w:t xml:space="preserve">The result is that the primary conclusion is robust to four of five normalization rules examined, but power normalization produces a statistically significant favorite bias that marginally exceeds its own estimated break-even threshold. Four rules leave the gap below their own threshold and none of those four is significant at .05. Power normalization gives -1.31 points against a 1.24-point threshold at p = .004: a detectable favorite bias, in the direction of betting underdogs, clearing the economic bar by seven hundredths of a percentage point.</w:t>
+        <w:t xml:space="preserve">The primary conclusion is robust to four of five rules but power normalization produces a statistically significant favorite bias that marginally exceeds its own break-even threshold: -1.31 points against 1.24 at p = .004, in the direction of betting underdogs, clearing the bar by seven hundredths of a point. Two reasons are offered for treating that specification as the least persuasive of the five, and neither is that it produced an inconvenient answer. Raising probabilities to a common exponent is a flexible transformation without the direct behavioral or structural interpretation the others carry. And it departs furthest from the other rules where the sample is thinnest, pushing heavy favorites to higher implied probabilities than any other rule and concentrating much of the estimated gap in the region with the fewest observations. Neither reason is decisive. A reader who prefers power normalization should read this sample as showing a small, marginally exploitable favorite bias, and that reading is legitimate on the evidence presented here.</w:t>
       </w:r>
     </w:p>
     <w:p>
@@ -6581,7 +6155,7 @@
           <w:sz w:val="22"/>
           <w:szCs w:val="22"/>
         </w:rPr>
-        <w:t xml:space="preserve">Two reasons are offered for regarding that specification as the least persuasive of the five, and neither is that it produced an inconvenient answer. First, raising probabilities to a common exponent is a flexible transformation without the same direct behavioral or structural interpretation as the others: proportional preserves relative pricing, additive imposes an equal margin, and Shin follows from a model of insider money. Second, it departs furthest from the other rules where the sample is thinnest, pushing heavy favorites to higher implied probabilities than any other rule and thereby concentrating much of the estimated gap in the region with the fewest observations. Neither reason is decisive. A reader who prefers power normalization should read this sample as showing a small, marginally exploitable favorite bias, and that reading is legitimate on the evidence presented here.</w:t>
+        <w:t xml:space="preserve">The first row of Table 5 is the sharpest single result in the paper. Testing observed win rates against raw implied probabilities, without removing the vig at all, produces an apparent favorite bias of -2.50 points at z = -5.90. Under proportional normalization that gap is the bookmaker's margin rather than anything about bettors. Several bucket-test designs in circulation skip vig removal entirely, and the table shows that the sign of the headline finding turns on that single step.</w:t>
       </w:r>
     </w:p>
     <w:p>
@@ -6597,7 +6171,7 @@
           <w:sz w:val="24"/>
           <w:szCs w:val="24"/>
         </w:rPr>
-        <w:t xml:space="preserve">5.5 Returns</w:t>
+        <w:t xml:space="preserve">5.5 Returns and power</w:t>
       </w:r>
     </w:p>
     <w:p>
@@ -6612,7 +6186,7 @@
           <w:sz w:val="22"/>
           <w:szCs w:val="22"/>
         </w:rPr>
-        <w:t xml:space="preserve">The dollar-return results tell the same story. Flat one-dollar bets at the quoted prices lose money in every direction: -4.06 percent per bet on all favorites (95% CI: -5.13 to -3.00), -3.91 percent on all underdogs (-6.57 to -1.25), and -2.90 percent on favorites above .70 (-4.04 to -1.76). Those losses are consistent with the 3.77 percent mean overround. Figure 2 shows that observed returns in every bucket are within the confidence interval around the return expected when prices are calibrated. Put directly against the economic hurdle, the observed +0.58-point calibration gap, and even its +1.26-point upper bound, fall well short of the +3.01 points a favorite bettor needed at these prices.</w:t>
+        <w:t xml:space="preserve">Flat one-dollar bets at the quoted prices lose money in every direction: -4.06 percent on all favorites (95% CI: -5.13 to -3.00), -3.91 on all underdogs (-6.57 to -1.25), and -2.90 on favorites above .70 (-4.04 to -1.76), consistent with the 3.77 percent mean overround. Against the economic hurdle directly, the observed +0.58-point gap and even its +1.26-point upper bound fall well short of the +3.01 points a favorite bettor needed.</w:t>
       </w:r>
     </w:p>
     <w:p>
@@ -6623,7 +6197,7 @@
       <w:r>
         <w:drawing>
           <wp:inline distT="0" distB="0" distL="0" distR="0">
-            <wp:extent cx="5429250" cy="3619500"/>
+            <wp:extent cx="4476750" cy="2981325"/>
             <wp:effectExtent t="0" r="0" b="0" l="0"/>
             <wp:docPr id="1" name="" descr="" title=""/>
             <wp:cNvGraphicFramePr>
@@ -6648,7 +6222,7 @@
                   <pic:spPr bwMode="auto">
                     <a:xfrm>
                       <a:off x="0" y="0"/>
-                      <a:ext cx="5429250" cy="3619500"/>
+                      <a:ext cx="4476750" cy="2981325"/>
                     </a:xfrm>
                     <a:prstGeom prst="rect">
                       <a:avLst/>
@@ -6675,38 +6249,7 @@
           <w:sz w:val="17"/>
           <w:szCs w:val="17"/>
         </w:rPr>
-        <w:t xml:space="preserve">Figure 2. Flat one-dollar stakes on the favorite at the quoted price, by bucket of vig-free implied probability, with 95 percent intervals. The expected-return marker in each bucket is computed from the actual quoted odds in that bucket under the assumption that the vig-free probabilities are correct; it differs across buckets because the payout structure differs. Archived consensus moneylines, 2007-08 to 2019-20.</w:t>
-      </w:r>
-    </w:p>
-    <w:p>
-      <w:pPr>
-        <w:spacing w:after="100" w:before="240" w:line="300"/>
-      </w:pPr>
-      <w:r>
-        <w:rPr>
-          <w:rFonts w:ascii="Georgia" w:cs="Georgia" w:eastAsia="Georgia" w:hAnsi="Georgia"/>
-          <w:b/>
-          <w:bCs/>
-          <w:color w:val="2c2c54"/>
-          <w:sz w:val="24"/>
-          <w:szCs w:val="24"/>
-        </w:rPr>
-        <w:t xml:space="preserve">5.6 A methodological caution</w:t>
-      </w:r>
-    </w:p>
-    <w:p>
-      <w:pPr>
-        <w:spacing w:after="160" w:line="340"/>
-        <w:jc w:val="both"/>
-      </w:pPr>
-      <w:r>
-        <w:rPr>
-          <w:rFonts w:ascii="Georgia" w:cs="Georgia" w:eastAsia="Georgia" w:hAnsi="Georgia"/>
-          <w:color w:val="1a1a1a"/>
-          <w:sz w:val="22"/>
-          <w:szCs w:val="22"/>
-        </w:rPr>
-        <w:t xml:space="preserve">Testing observed win rates against raw implied probabilities, without removing the vig, produces an apparent favorite bias of -2.50 percentage points with z = -5.90. Under proportional vig removal that gap is the bookmaker's margin rather than anything about bettor behavior. The artifact reading is conditional on the normalization being approximately correct, and both raw and normalized results are reported so a reader can see exactly what the assumption is doing. The point matters because several bucket-test designs in circulation skip vig removal entirely, and Table 5 shows that the sign of the headline finding flips with that single step.</w:t>
+        <w:t xml:space="preserve">Figure 2. Flat one-dollar stakes on the favorite at the quoted price, by bucket, with 95 percent intervals. The expected-return marker in each bucket is computed from the actual quoted odds there under the assumption that vig-free probabilities are correct, so it differs across buckets because the payout structure differs.</w:t>
       </w:r>
     </w:p>
     <w:p>
@@ -6717,7 +6260,7 @@
       <w:r>
         <w:drawing>
           <wp:inline distT="0" distB="0" distL="0" distR="0">
-            <wp:extent cx="5429250" cy="3676650"/>
+            <wp:extent cx="4476750" cy="3028950"/>
             <wp:effectExtent t="0" r="0" b="0" l="0"/>
             <wp:docPr id="1" name="" descr="" title=""/>
             <wp:cNvGraphicFramePr>
@@ -6742,7 +6285,7 @@
                   <pic:spPr bwMode="auto">
                     <a:xfrm>
                       <a:off x="0" y="0"/>
-                      <a:ext cx="5429250" cy="3676650"/>
+                      <a:ext cx="4476750" cy="3028950"/>
                     </a:xfrm>
                     <a:prstGeom prst="rect">
                       <a:avLst/>
@@ -6769,7 +6312,7 @@
           <w:sz w:val="17"/>
           <w:szCs w:val="17"/>
         </w:rPr>
-        <w:t xml:space="preserve">Figure 3. Power of the primary test against a true calibration gap, two-sided at alpha = .05, n = 6,840, standard error 0.474 pp from the heterogeneous per-game null variance. Every mark is computed from this sample: the observed +0.58-point gap, the 1.33-point minimum detectable effect, and the 3.01-point break-even requirement. No mark is taken from outside the dataset; see the note in section 6 on why.</w:t>
+        <w:t xml:space="preserve">Figure 3. Power of the primary test against a true calibration gap, two-sided at alpha = .05, n = 6,840, standard error 0.474 pp. Every mark is computed from this sample: the observed +0.58-point gap, the 1.33-point minimum detectable effect, and the 3.01-point break-even requirement. No mark is taken from prior work; see section 6.</w:t>
       </w:r>
     </w:p>
     <w:p>
@@ -6800,7 +6343,7 @@
           <w:sz w:val="22"/>
           <w:szCs w:val="22"/>
         </w:rPr>
-        <w:t xml:space="preserve">The null result needs to be read narrowly. In these archived consensus moneylines, pooled across 2007 to 2020 and within every season and pre-specified odds range examined, the aggregate favorite calibration gap was smaller than the design's 1.33-point minimum detectable effect and well below the 3.01-point break-even requirement. The estimate holds up under variance estimators that allow correlation within seasons and within teams.</w:t>
+        <w:t xml:space="preserve">The null should be read narrowly. In these archived consensus moneylines, pooled across 2007 to 2020 and within every season and pre-specified odds range examined, the aggregate favorite calibration gap was smaller than the design's 1.33-point minimum detectable effect and well below the 3.01-point break-even requirement, and the estimate holds under variance estimators allowing correlation within seasons and teams. It does not rule out localized situational biases outside the pre-specified slices, mispricing at individual books, inefficiency in opening lines, or edges from shopping the best price across books. Because the timing of each quote is undocumented it says nothing about closing-line efficiency, and no claim is made about how professional bettors benchmark themselves.</w:t>
       </w:r>
     </w:p>
     <w:p>
@@ -6815,7 +6358,7 @@
           <w:sz w:val="22"/>
           <w:szCs w:val="22"/>
         </w:rPr>
-        <w:t xml:space="preserve">What the result does not establish is broader. It does not rule out localized situational biases outside the pre-specified slices, mispricing at individual books, inefficiency in opening lines, or edges available by shopping for the best price across books. It says nothing about informational efficiency in general, and nothing about the post-2020 market. Because the timing of each quote is undocumented, it also cannot speak to closing-line efficiency, and this paper deliberately makes no claim about how professional bettors benchmark themselves.</w:t>
+        <w:t xml:space="preserve">The more durable contribution is methodological, and it is larger than the vig artifact alone. Three treatments of the same 15,351 games give an estimated favorite bias of -2.50 points at p &lt; .001 with raw probabilities, +0.58 at p = .223 under proportional normalization, and -1.31 at p = .004 under power normalization. The existence, magnitude and sign of the estimate all move with a modeling choice most papers in this literature make in one sentence and never revisit. A pre-specified design with an economic anchor and a power justification does not make that choice for the analyst, but it makes the consequences visible, and Figure 3 states the power claim in the only units this paper can defend: above 99.9 percent at the 3.01-point break-even, 80 percent at 1.33 points, against roughly 11 percent for a 74-game bucket.</w:t>
       </w:r>
     </w:p>
     <w:p>
@@ -6830,67 +6373,7 @@
           <w:sz w:val="22"/>
           <w:szCs w:val="22"/>
         </w:rPr>
-        <w:t xml:space="preserve">The finding is consistent with the broader literature. Moskowitz (2021) reaches a similar conclusion for betting markets generally: whatever behavioral patterns exist in prices are too small to survive costs. The contribution here is the form of the test rather than the surprise of the answer. One pre-specified comparison, a power justification fixed in advance, an economic anchor computed from the actual quoted prices, a data layer verified against an independent extraction, and a robustness program that reports the one specification which does not agree.</w:t>
-      </w:r>
-    </w:p>
-    <w:p>
-      <w:pPr>
-        <w:spacing w:after="160" w:line="340"/>
-        <w:jc w:val="both"/>
-      </w:pPr>
-      <w:r>
-        <w:rPr>
-          <w:rFonts w:ascii="Georgia" w:cs="Georgia" w:eastAsia="Georgia" w:hAnsi="Georgia"/>
-          <w:color w:val="1a1a1a"/>
-          <w:sz w:val="22"/>
-          <w:szCs w:val="22"/>
-        </w:rPr>
-        <w:t xml:space="preserve">The design's power is what makes the null meaningful, and Figure 3 states the claim in the only units this paper can defend. Power exceeds 99.9 percent at the 3.01-point break-even requirement, so a bias large enough to be exploitable at these prices would have been detected almost regardless of where in the range it sat. Power is 80 percent at 1.33 points, well below that threshold. A narrow bucket of a few dozen games has no comparable claim: at 74 games the same calculation gives about 11 percent.</w:t>
-      </w:r>
-    </w:p>
-    <w:p>
-      <w:pPr>
-        <w:spacing w:after="160" w:line="340"/>
-        <w:jc w:val="both"/>
-      </w:pPr>
-      <w:r>
-        <w:rPr>
-          <w:rFonts w:ascii="Georgia" w:cs="Georgia" w:eastAsia="Georgia" w:hAnsi="Georgia"/>
-          <w:color w:val="1a1a1a"/>
-          <w:sz w:val="22"/>
-          <w:szCs w:val="22"/>
-        </w:rPr>
-        <w:t xml:space="preserve">Read together with Table 5, the more durable contribution is methodological, and it is larger than the vig artifact alone. Three treatments of the same 15,351 games give an estimated favorite bias of -2.50 points at p &lt; .001 with raw probabilities, +0.58 points at p = .223 under proportional normalization, and -1.31 points at p = .004 under power normalization. The existence, the magnitude and the sign of the estimate all move with a modeling choice that most papers in this literature make in a single sentence and never revisit.</w:t>
-      </w:r>
-    </w:p>
-    <w:p>
-      <w:pPr>
-        <w:spacing w:after="160" w:line="340"/>
-        <w:jc w:val="both"/>
-      </w:pPr>
-      <w:r>
-        <w:rPr>
-          <w:rFonts w:ascii="Georgia" w:cs="Georgia" w:eastAsia="Georgia" w:hAnsi="Georgia"/>
-          <w:color w:val="1a1a1a"/>
-          <w:sz w:val="22"/>
-          <w:szCs w:val="22"/>
-        </w:rPr>
-        <w:t xml:space="preserve">That is the finding worth carrying forward. An analyst who compares outcomes with raw implied probabilities here finds a 2.5-point favorite bias and would reasonably report it as behavioral; it is the bookmaker's margin. An analyst who picks a normalization rule without stating why can land on either side of zero. A pre-specified design with an economic anchor and a power justification does not make the choice for you, but it makes the consequences of the choice visible, and it is the part of this design most worth reusing.</w:t>
-      </w:r>
-    </w:p>
-    <w:p>
-      <w:pPr>
-        <w:spacing w:after="160" w:line="340"/>
-        <w:jc w:val="both"/>
-      </w:pPr>
-      <w:r>
-        <w:rPr>
-          <w:rFonts w:ascii="Georgia" w:cs="Georgia" w:eastAsia="Georgia" w:hAnsi="Georgia"/>
-          <w:color w:val="1a1a1a"/>
-          <w:sz w:val="22"/>
-          <w:szCs w:val="22"/>
-        </w:rPr>
-        <w:t xml:space="preserve">One thing Figure 3 deliberately does not do is mark effect sizes drawn from prior work. An earlier draft marked 1.7 and 5.1 percentage points as the smallest and largest favorite-bias effects reported in the cited literature. Those two numbers could not be traced to any source in that citation set, and the attempt to source them turned up a substantive problem rather than a clerical one. Six of the eight cited papers report rates of return or point-spread cover rates, not win-probability calibration gaps, and the two quantities are not interchangeable without the odds attached. The one literature review among them, Newall and Cortis (2021), is entirely directional and reports no effect magnitudes. Converting the classic return estimates into calibration gaps at these prices spans a far wider range than 1.7 to 5.1 and points in the opposite direction, because that work concerns parimutuel horse racing. The marks were therefore removed rather than re-sourced, and the power argument is made against this sample's own break-even threshold instead. A related caution applies to the moneyline branch of the literature generally: Woodland and Woodland (2001) is the closest antecedent, its conversion method has been questioned by Berkowitz, Depken and Gandar (2018), and the authors themselves reported in 2011 that the effect disappears in later seasons.</w:t>
+        <w:t xml:space="preserve">Figure 3 deliberately marks no effect sizes drawn from prior work. An earlier draft marked 1.7 and 5.1 percentage points as the smallest and largest favorite-bias effects in the cited literature; neither could be traced to any source in that citation set. Six of the eight cited papers report rates of return or point-spread cover rates rather than win-probability calibration gaps, and the two are not interchangeable without the odds attached; the one literature review among them reports no magnitudes at all. The marks were removed rather than re-sourced, and the power argument is made against this sample's own break-even threshold instead. The supplementary material documents the attempt in full.</w:t>
       </w:r>
     </w:p>
     <w:p>
@@ -6921,7 +6404,7 @@
           <w:sz w:val="22"/>
           <w:szCs w:val="22"/>
         </w:rPr>
-        <w:t xml:space="preserve">Several limits define the reach of these findings. The sample includes regular-season games only and ends in March 2020, where the source archive ends, so the conclusions describe that period. The archive provides one consensus line per game, which means the data cannot speak to line shopping, best-price execution, or the identity of the sportsbook, and the timing of each quote is undocumented at the source.</w:t>
+        <w:t xml:space="preserve">The sample is regular season only and ends where the source archive ends, in March 2020. The archive gives one consensus line per game, so the data cannot speak to line shopping, best-price execution or book identity, and the timing of each quote is undocumented. Proportional vig removal is one of several normalizations; four alternatives are reported in section 5.4, four of five leave the conclusion unchanged and power normalization does not. There is no ticket-share data, so claims about public betting cannot be tested. The 260-game primary-source audit was hand-drawn rather than seeded, and the full-sample cross-validation is the stronger evidence.</w:t>
       </w:r>
     </w:p>
     <w:p>
@@ -6936,37 +6419,7 @@
           <w:sz w:val="22"/>
           <w:szCs w:val="22"/>
         </w:rPr>
-        <w:t xml:space="preserve">Proportional vig removal is one of several possible normalizations. Four alternatives are reported in section 5.4; four of five leave the conclusion unchanged and power normalization does not, which is stated rather than set aside. The archive has no ticket-share data, so claims about public betting cannot be tested here. The 260-game primary-source audit was drawn by hand rather than by a seeded random procedure and should be read accordingly; the full-sample cross-validation is the stronger evidence.</w:t>
-      </w:r>
-    </w:p>
-    <w:p>
-      <w:pPr>
-        <w:spacing w:after="160" w:line="340"/>
-        <w:jc w:val="both"/>
-      </w:pPr>
-      <w:r>
-        <w:rPr>
-          <w:rFonts w:ascii="Georgia" w:cs="Georgia" w:eastAsia="Georgia" w:hAnsi="Georgia"/>
-          <w:color w:val="1a1a1a"/>
-          <w:sz w:val="22"/>
-          <w:szCs w:val="22"/>
-        </w:rPr>
-        <w:t xml:space="preserve">The primary test assumes games are independent conditional on their prices. Cluster-robust estimators and block bootstraps relax that assumption and leave the primary result unchanged, but the season-level estimators rest on only thirteen clusters, which is too few for cluster-robust variance to be reliable, and the two-way estimate of the calibration regression should be treated with corresponding caution in both directions. Equal-weight calibration is also a different question from dollar-weighted profitability, which is why the flat-stake return analysis is reported directly.</w:t>
-      </w:r>
-    </w:p>
-    <w:p>
-      <w:pPr>
-        <w:spacing w:after="160" w:line="340"/>
-        <w:jc w:val="both"/>
-      </w:pPr>
-      <w:r>
-        <w:rPr>
-          <w:rFonts w:ascii="Georgia" w:cs="Georgia" w:eastAsia="Georgia" w:hAnsi="Georgia"/>
-          <w:color w:val="1a1a1a"/>
-          <w:sz w:val="22"/>
-          <w:szCs w:val="22"/>
-        </w:rPr>
-        <w:t xml:space="preserve">Finally, the analysis plan was fixed before outcome data were examined, but the record of that freeze is internal to the author's files rather than lodged with an outside registry, so its timing is not independently verifiable and the work is described as pre-specified rather than pre-registered. The plan itself is published in full with the replication materials, and the design leaves little room for undisclosed flexibility: there is one named primary comparison, a threshold and an effect-size floor both set from stated reasoning rather than from the outcome data, and exploratory analyses reported separately and labeled as such. Readers who wish to check the stronger claim can re-run the confirmatory pipeline, which reproduces every reported statistic from the raw archive.</w:t>
+        <w:t xml:space="preserve">The primary test assumes games are independent conditional on their prices. Cluster-robust estimators and block bootstraps relax that and leave the result unchanged, but the season-level estimators rest on only thirteen clusters, too few for cluster-robust variance to be reliable, and the two-way estimate of the calibration regression should be treated with corresponding caution in both directions. Equal-weight calibration also answers a different question from dollar-weighted profitability, which is why the flat-stake analysis is reported directly. Finally, the analysis plan was fixed before outcome data were examined, but the record of that freeze is internal rather than lodged with a registry, so its timing is not independently verifiable and the work is described as pre-specified rather than pre-registered. The plan is published in full, and the design leaves little room for undisclosed flexibility: one named primary comparison, a threshold and an effect-size floor set from stated reasoning rather than from outcomes, and exploratory analyses reported separately. Readers who want to check the stronger claim can re-run the confirmatory pipeline, which reproduces every reported statistic from the raw archive.</w:t>
       </w:r>
     </w:p>
     <w:p>
@@ -6997,7 +6450,7 @@
           <w:sz w:val="22"/>
           <w:szCs w:val="22"/>
         </w:rPr>
-        <w:t xml:space="preserve">A pre-specified, economically anchored test, adequately powered for its pre-specified primary estimand and run on cross-validated archival data, finds the archived NBA consensus moneylines in this series calibrated: over 15,351 games, favorites were priced correctly to within a fraction of the bookmaker's own margin, and the estimate holds under variance estimators that allow correlation within seasons and within teams.</w:t>
+        <w:t xml:space="preserve">A pre-specified, economically anchored test, adequately powered for its primary estimand and run on cross-validated archival data, finds the archived NBA consensus moneylines in this series calibrated: over 15,351 games favorites were priced correctly to within a fraction of the bookmaker's own margin, and the estimate holds under variance estimators allowing correlation within seasons and teams. For bettors, in the archived consensus prices examined here, simply choosing favorites or underdogs offered no exploitable edge. That statement is confined to this series and this period.</w:t>
       </w:r>
     </w:p>
     <w:p>
@@ -7012,22 +6465,7 @@
           <w:sz w:val="22"/>
           <w:szCs w:val="22"/>
         </w:rPr>
-        <w:t xml:space="preserve">For bettors, the practical lesson is that in the archived consensus prices examined here, simply choosing favorites or underdogs did not offer an exploitable edge. That statement is deliberately confined to this series and this period; it is not a claim about the NBA betting market in general, and the one normalization rule that disagrees is reported in section 5.4.</w:t>
-      </w:r>
-    </w:p>
-    <w:p>
-      <w:pPr>
-        <w:spacing w:after="160" w:line="340"/>
-        <w:jc w:val="both"/>
-      </w:pPr>
-      <w:r>
-        <w:rPr>
-          <w:rFonts w:ascii="Georgia" w:cs="Georgia" w:eastAsia="Georgia" w:hAnsi="Georgia"/>
-          <w:color w:val="1a1a1a"/>
-          <w:sz w:val="22"/>
-          <w:szCs w:val="22"/>
-        </w:rPr>
-        <w:t xml:space="preserve">For researchers, the sharper conclusion is about method. A pre-specified, economically anchored calibration test under proportional normalization finds no meaningful aggregate favorite bias in this series, and that finding survives correction for dependence. But the estimated existence and even the direction of favorite bias here depend materially on how the bookmaker's margin is removed, and that dependence is invisible to the underpowered single-specification bucket tests this literature has relied on. Reporting the normalization sensitivity is not a caveat attached to the result. On this evidence it is the result.</w:t>
+        <w:t xml:space="preserve">For researchers the sharper conclusion is about method. The estimated existence and even direction of favorite bias here depend materially on how the bookmaker's margin is removed, and that dependence is invisible to the underpowered single-specification bucket tests this literature has relied on. Reporting the normalization sensitivity is not a caveat attached to the result. On this evidence it is the result.</w:t>
       </w:r>
     </w:p>
     <w:p>
@@ -7058,37 +6496,7 @@
           <w:sz w:val="22"/>
           <w:szCs w:val="22"/>
         </w:rPr>
-        <w:t xml:space="preserve">Data. The underlying historical odds archive is publicly available from sportsbookreviewsonline.com and is redistributed in the repository accompanying Dotan (2020) at https://github.com/guydotan/ucla-thesis. The derived analysis dataset is published with the replication materials, together with a script that re-downloads the complete upstream files, prints their SHA-256 hashes, and confirms that every retained column matches the original row for row.</w:t>
-      </w:r>
-    </w:p>
-    <w:p>
-      <w:pPr>
-        <w:spacing w:after="160" w:line="340"/>
-        <w:jc w:val="both"/>
-      </w:pPr>
-      <w:r>
-        <w:rPr>
-          <w:rFonts w:ascii="Georgia" w:cs="Georgia" w:eastAsia="Georgia" w:hAnsi="Georgia"/>
-          <w:color w:val="1a1a1a"/>
-          <w:sz w:val="22"/>
-          <w:szCs w:val="22"/>
-        </w:rPr>
-        <w:t xml:space="preserve">Code. All scripts required to reproduce the reported results, tables and figures are available at https://github.com/jacobburdier05/nba-moneyline-calibration. A single command runs verification, dataset construction, the confirmatory analyses, the robustness analyses, the figures and the Appendix A verification in about three minutes.</w:t>
-      </w:r>
-    </w:p>
-    <w:p>
-      <w:pPr>
-        <w:spacing w:after="160" w:line="340"/>
-        <w:jc w:val="both"/>
-      </w:pPr>
-      <w:r>
-        <w:rPr>
-          <w:rFonts w:ascii="Georgia" w:cs="Georgia" w:eastAsia="Georgia" w:hAnsi="Georgia"/>
-          <w:color w:val="1a1a1a"/>
-          <w:sz w:val="22"/>
-          <w:szCs w:val="22"/>
-        </w:rPr>
-        <w:t xml:space="preserve">Analysis plan. The pre-specified analysis plan is published in the same repository under preregistration/analysis_plan.md, with a provenance note stating when it was transcribed into the repository and what evidence does and does not exist for the date it was frozen. It fixes proportional normalization as the primary rule, which is why that choice is not a post hoc selection.</w:t>
+        <w:t xml:space="preserve">The historical odds archive is publicly available from sportsbookreviewsonline.com and redistributed at https://github.com/guydotan/ucla-thesis. All analysis scripts, the derived dataset, the frozen analysis plan, the supplementary material, and a script that re-downloads the upstream files and verifies every retained column against them are at https://github.com/jacobburdier05/nba-moneyline-calibration. A single command reproduces every reported statistic, table and figure from the raw archive in about three minutes.</w:t>
       </w:r>
     </w:p>
     <w:p>
@@ -7104,272 +6512,343 @@
           <w:sz w:val="28"/>
           <w:szCs w:val="28"/>
         </w:rPr>
-        <w:t xml:space="preserve">Appendix A. Shin's normalization equals the additive rule for a two-outcome book</w:t>
-      </w:r>
-    </w:p>
-    <w:p>
-      <w:pPr>
-        <w:spacing w:after="160" w:line="340"/>
-        <w:jc w:val="both"/>
+        <w:t xml:space="preserve">References</w:t>
+      </w:r>
+    </w:p>
+    <w:p>
+      <w:pPr>
+        <w:spacing w:after="120" w:line="260"/>
+        <w:ind w:left="360" w:hanging="360"/>
+        <w:jc w:val="left"/>
       </w:pPr>
       <w:r>
         <w:rPr>
           <w:rFonts w:ascii="Georgia" w:cs="Georgia" w:eastAsia="Georgia" w:hAnsi="Georgia"/>
           <w:color w:val="1a1a1a"/>
-          <w:sz w:val="22"/>
-          <w:szCs w:val="22"/>
-        </w:rPr>
-        <w:t xml:space="preserve">Section 5.4 reports that Shin (1993) and the additive rule give identical results in Table 5. Because that claim is unusual and it affects how Table 5 should be read, the derivation is given here rather than asserted. Every step is verified against the sample by src/shin_equivalence_proof.py in the replication materials.</w:t>
-      </w:r>
-    </w:p>
-    <w:p>
-      <w:pPr>
-        <w:spacing w:after="160" w:line="340"/>
-        <w:jc w:val="both"/>
+          <w:sz w:val="20"/>
+          <w:szCs w:val="20"/>
+        </w:rPr>
+        <w:t xml:space="preserve">American Gaming Association. (2025). State of the states 2025: The AGA survey of the commercial casino industry. https://www.americangaming.org/resources/state-of-the-states-2025/</w:t>
+      </w:r>
+    </w:p>
+    <w:p>
+      <w:pPr>
+        <w:spacing w:after="120" w:line="260"/>
+        <w:ind w:left="360" w:hanging="360"/>
+        <w:jc w:val="left"/>
       </w:pPr>
       <w:r>
         <w:rPr>
           <w:rFonts w:ascii="Georgia" w:cs="Georgia" w:eastAsia="Georgia" w:hAnsi="Georgia"/>
           <w:color w:val="1a1a1a"/>
-          <w:sz w:val="22"/>
-          <w:szCs w:val="22"/>
-        </w:rPr>
-        <w:t xml:space="preserve">Let q1 and q2 be the raw implied probabilities of the two sides and P = q1 + q2 the booksum, with P greater than one. Shin sets</w:t>
-      </w:r>
-    </w:p>
-    <w:p>
-      <w:pPr>
-        <w:spacing w:after="80" w:before="80" w:line="300"/>
-        <w:jc w:val="center"/>
-      </w:pPr>
-      <w:r>
-        <w:rPr>
-          <w:rFonts w:ascii="Georgia" w:cs="Georgia" w:eastAsia="Georgia" w:hAnsi="Georgia"/>
-          <w:i/>
-          <w:iCs/>
+          <w:sz w:val="20"/>
+          <w:szCs w:val="20"/>
+        </w:rPr>
+        <w:t xml:space="preserve">Angelini, G., &amp; De Angelis, L. (2019). Efficiency of online football betting markets. International Journal of Forecasting, 35(2), 712-721. https://doi.org/10.1016/j.ijforecast.2018.07.008</w:t>
+      </w:r>
+    </w:p>
+    <w:p>
+      <w:pPr>
+        <w:spacing w:after="120" w:line="260"/>
+        <w:ind w:left="360" w:hanging="360"/>
+        <w:jc w:val="left"/>
+      </w:pPr>
+      <w:r>
+        <w:rPr>
+          <w:rFonts w:ascii="Georgia" w:cs="Georgia" w:eastAsia="Georgia" w:hAnsi="Georgia"/>
           <w:color w:val="1a1a1a"/>
-          <w:sz w:val="22"/>
-          <w:szCs w:val="22"/>
-        </w:rPr>
-        <w:t xml:space="preserve">pi_i = [ sqrt( z^2 + 4(1 - z) q_i^2 / P ) - z ] / ( 2(1 - z) )</w:t>
-      </w:r>
-    </w:p>
-    <w:p>
-      <w:pPr>
-        <w:spacing w:after="160" w:line="340"/>
-        <w:jc w:val="both"/>
+          <w:sz w:val="20"/>
+          <w:szCs w:val="20"/>
+        </w:rPr>
+        <w:t xml:space="preserve">Berkowitz, J. P., Depken, C. A., &amp; Gandar, J. M. (2018). The conversion of money lines into win probabilities: Reconciliations and simplifications. Journal of Sports Economics, 19(1).</w:t>
+      </w:r>
+    </w:p>
+    <w:p>
+      <w:pPr>
+        <w:spacing w:after="120" w:line="260"/>
+        <w:ind w:left="360" w:hanging="360"/>
+        <w:jc w:val="left"/>
       </w:pPr>
       <w:r>
         <w:rPr>
           <w:rFonts w:ascii="Georgia" w:cs="Georgia" w:eastAsia="Georgia" w:hAnsi="Georgia"/>
           <w:color w:val="1a1a1a"/>
-          <w:sz w:val="22"/>
-          <w:szCs w:val="22"/>
-        </w:rPr>
-        <w:t xml:space="preserve">with z chosen so the pair sums to one. The additive rule sets pi_i = q_i - (P - 1)/2.</w:t>
-      </w:r>
-    </w:p>
-    <w:p>
-      <w:pPr>
-        <w:spacing w:after="100" w:before="240" w:line="300"/>
-      </w:pPr>
-      <w:r>
-        <w:rPr>
-          <w:rFonts w:ascii="Georgia" w:cs="Georgia" w:eastAsia="Georgia" w:hAnsi="Georgia"/>
-          <w:b/>
-          <w:bCs/>
-          <w:color w:val="2c2c54"/>
-          <w:sz w:val="24"/>
-          <w:szCs w:val="24"/>
-        </w:rPr>
-        <w:t xml:space="preserve">Step 1. Invert for z</w:t>
-      </w:r>
-    </w:p>
-    <w:p>
-      <w:pPr>
-        <w:spacing w:after="160" w:line="340"/>
-        <w:jc w:val="both"/>
+          <w:sz w:val="20"/>
+          <w:szCs w:val="20"/>
+        </w:rPr>
+        <w:t xml:space="preserve">Burdier, J. (2026). Replication materials for “Are archived NBA consensus moneylines calibrated?” [Computer software]. GitHub. https://github.com/jacobburdier05/nba-moneyline-calibration</w:t>
+      </w:r>
+    </w:p>
+    <w:p>
+      <w:pPr>
+        <w:spacing w:after="120" w:line="260"/>
+        <w:ind w:left="360" w:hanging="360"/>
+        <w:jc w:val="left"/>
       </w:pPr>
       <w:r>
         <w:rPr>
           <w:rFonts w:ascii="Georgia" w:cs="Georgia" w:eastAsia="Georgia" w:hAnsi="Georgia"/>
           <w:color w:val="1a1a1a"/>
-          <w:sz w:val="22"/>
-          <w:szCs w:val="22"/>
-        </w:rPr>
-        <w:t xml:space="preserve">Rearrange to 2 pi (1 - z) + z = sqrt( z^2 + 4(1 - z) q^2 / P ) and square both sides. The z-squared terms cancel, and dividing through by 4(1 - z), which is nonzero for z below one, leaves</w:t>
-      </w:r>
-    </w:p>
-    <w:p>
-      <w:pPr>
-        <w:spacing w:after="80" w:before="80" w:line="300"/>
-        <w:jc w:val="center"/>
-      </w:pPr>
-      <w:r>
-        <w:rPr>
-          <w:rFonts w:ascii="Georgia" w:cs="Georgia" w:eastAsia="Georgia" w:hAnsi="Georgia"/>
-          <w:i/>
-          <w:iCs/>
+          <w:sz w:val="20"/>
+          <w:szCs w:val="20"/>
+        </w:rPr>
+        <w:t xml:space="preserve">Cheung, K. C. (2015). Fixed-odds betting and traditional odds. Sports Trading Network.</w:t>
+      </w:r>
+    </w:p>
+    <w:p>
+      <w:pPr>
+        <w:spacing w:after="120" w:line="260"/>
+        <w:ind w:left="360" w:hanging="360"/>
+        <w:jc w:val="left"/>
+      </w:pPr>
+      <w:r>
+        <w:rPr>
+          <w:rFonts w:ascii="Georgia" w:cs="Georgia" w:eastAsia="Georgia" w:hAnsi="Georgia"/>
           <w:color w:val="1a1a1a"/>
-          <w:sz w:val="22"/>
-          <w:szCs w:val="22"/>
-        </w:rPr>
-        <w:t xml:space="preserve">pi^2 + z pi (1 - pi) = q^2 / P,      so     z = ( q^2 / P - pi^2 ) / ( pi (1 - pi) )</w:t>
-      </w:r>
-    </w:p>
-    <w:p>
-      <w:pPr>
-        <w:spacing w:after="100" w:before="240" w:line="300"/>
-      </w:pPr>
-      <w:r>
-        <w:rPr>
-          <w:rFonts w:ascii="Georgia" w:cs="Georgia" w:eastAsia="Georgia" w:hAnsi="Georgia"/>
-          <w:b/>
-          <w:bCs/>
-          <w:color w:val="2c2c54"/>
-          <w:sz w:val="24"/>
-          <w:szCs w:val="24"/>
-        </w:rPr>
-        <w:t xml:space="preserve">Step 2. Require both sides to return the same z</w:t>
-      </w:r>
-    </w:p>
-    <w:p>
-      <w:pPr>
-        <w:spacing w:after="160" w:line="340"/>
-        <w:jc w:val="both"/>
+          <w:sz w:val="20"/>
+          <w:szCs w:val="20"/>
+        </w:rPr>
+        <w:t xml:space="preserve">Dotan, G. (2020). Beating the book: A machine learning approach to identifying an edge in NBA betting markets (Master's thesis, UCLA). https://github.com/guydotan/ucla-thesis</w:t>
+      </w:r>
+    </w:p>
+    <w:p>
+      <w:pPr>
+        <w:spacing w:after="120" w:line="260"/>
+        <w:ind w:left="360" w:hanging="360"/>
+        <w:jc w:val="left"/>
       </w:pPr>
       <w:r>
         <w:rPr>
           <w:rFonts w:ascii="Georgia" w:cs="Georgia" w:eastAsia="Georgia" w:hAnsi="Georgia"/>
           <w:color w:val="1a1a1a"/>
-          <w:sz w:val="22"/>
-          <w:szCs w:val="22"/>
-        </w:rPr>
-        <w:t xml:space="preserve">Shin's z is a single property of the book, so the expression above must give the same value for each side. Because the pair sums to one, 1 - pi_1 equals pi_2 and 1 - pi_2 equals pi_1, so both denominators equal pi_1 pi_2 and the requirement reduces to equal numerators:</w:t>
-      </w:r>
-    </w:p>
-    <w:p>
-      <w:pPr>
-        <w:spacing w:after="80" w:before="80" w:line="300"/>
-        <w:jc w:val="center"/>
-      </w:pPr>
-      <w:r>
-        <w:rPr>
-          <w:rFonts w:ascii="Georgia" w:cs="Georgia" w:eastAsia="Georgia" w:hAnsi="Georgia"/>
-          <w:i/>
-          <w:iCs/>
+          <w:sz w:val="20"/>
+          <w:szCs w:val="20"/>
+        </w:rPr>
+        <w:t xml:space="preserve">Fama, E. F. (1970). Efficient capital markets: A review of theory and empirical work. The Journal of Finance, 25(2), 383-417. https://doi.org/10.2307/2325486</w:t>
+      </w:r>
+    </w:p>
+    <w:p>
+      <w:pPr>
+        <w:spacing w:after="120" w:line="260"/>
+        <w:ind w:left="360" w:hanging="360"/>
+        <w:jc w:val="left"/>
+      </w:pPr>
+      <w:r>
+        <w:rPr>
+          <w:rFonts w:ascii="Georgia" w:cs="Georgia" w:eastAsia="Georgia" w:hAnsi="Georgia"/>
           <w:color w:val="1a1a1a"/>
-          <w:sz w:val="22"/>
-          <w:szCs w:val="22"/>
-        </w:rPr>
-        <w:t xml:space="preserve">( q1^2 - q2^2 ) / P = pi_1^2 - pi_2^2,   that is   (q1 - q2)(q1 + q2)/P = (pi_1 - pi_2)(pi_1 + pi_2)</w:t>
-      </w:r>
-    </w:p>
-    <w:p>
-      <w:pPr>
-        <w:spacing w:after="160" w:line="340"/>
-        <w:jc w:val="both"/>
+          <w:sz w:val="20"/>
+          <w:szCs w:val="20"/>
+        </w:rPr>
+        <w:t xml:space="preserve">Griffith, R. M. (1949). Odds adjustments by American horse-race bettors. The American Journal of Psychology, 62(2), 290-294. https://doi.org/10.2307/1418469</w:t>
+      </w:r>
+    </w:p>
+    <w:p>
+      <w:pPr>
+        <w:spacing w:after="120" w:line="260"/>
+        <w:ind w:left="360" w:hanging="360"/>
+        <w:jc w:val="left"/>
       </w:pPr>
       <w:r>
         <w:rPr>
           <w:rFonts w:ascii="Georgia" w:cs="Georgia" w:eastAsia="Georgia" w:hAnsi="Georgia"/>
           <w:color w:val="1a1a1a"/>
-          <w:sz w:val="22"/>
-          <w:szCs w:val="22"/>
-        </w:rPr>
-        <w:t xml:space="preserve">Since q1 + q2 = P by definition and pi_1 + pi_2 = 1 by the constraint, this collapses to q1 - q2 = pi_1 - pi_2. Shin's rule preserves the difference of the raw probabilities.</w:t>
-      </w:r>
-    </w:p>
-    <w:p>
-      <w:pPr>
-        <w:spacing w:after="100" w:before="240" w:line="300"/>
-      </w:pPr>
-      <w:r>
-        <w:rPr>
-          <w:rFonts w:ascii="Georgia" w:cs="Georgia" w:eastAsia="Georgia" w:hAnsi="Georgia"/>
-          <w:b/>
-          <w:bCs/>
-          <w:color w:val="2c2c54"/>
-          <w:sz w:val="24"/>
-          <w:szCs w:val="24"/>
-        </w:rPr>
-        <w:t xml:space="preserve">Step 3. Solve</w:t>
-      </w:r>
-    </w:p>
-    <w:p>
-      <w:pPr>
-        <w:spacing w:after="160" w:line="340"/>
-        <w:jc w:val="both"/>
+          <w:sz w:val="20"/>
+          <w:szCs w:val="20"/>
+        </w:rPr>
+        <w:t xml:space="preserve">Holm, S. (1979). A simple sequentially rejective multiple test procedure. Scandinavian Journal of Statistics, 6(2), 65-70.</w:t>
+      </w:r>
+    </w:p>
+    <w:p>
+      <w:pPr>
+        <w:spacing w:after="120" w:line="260"/>
+        <w:ind w:left="360" w:hanging="360"/>
+        <w:jc w:val="left"/>
       </w:pPr>
       <w:r>
         <w:rPr>
           <w:rFonts w:ascii="Georgia" w:cs="Georgia" w:eastAsia="Georgia" w:hAnsi="Georgia"/>
           <w:color w:val="1a1a1a"/>
-          <w:sz w:val="22"/>
-          <w:szCs w:val="22"/>
-        </w:rPr>
-        <w:t xml:space="preserve">Two linear conditions now pin the pair down uniquely: the sum is one and the difference is q1 - q2. Therefore pi_1 = (1 + q1 - q2)/2. The additive rule gives q1 - (q1 + q2 - 1)/2, which is the same expression. The two rules coincide.</w:t>
-      </w:r>
-    </w:p>
-    <w:p>
-      <w:pPr>
-        <w:spacing w:after="100" w:before="240" w:line="300"/>
-      </w:pPr>
-      <w:r>
-        <w:rPr>
-          <w:rFonts w:ascii="Georgia" w:cs="Georgia" w:eastAsia="Georgia" w:hAnsi="Georgia"/>
-          <w:b/>
-          <w:bCs/>
-          <w:color w:val="2c2c54"/>
-          <w:sz w:val="24"/>
-          <w:szCs w:val="24"/>
-        </w:rPr>
-        <w:t xml:space="preserve">Numerical verification and scope</w:t>
-      </w:r>
-    </w:p>
-    <w:p>
-      <w:pPr>
-        <w:spacing w:after="160" w:line="340"/>
-        <w:jc w:val="both"/>
+          <w:sz w:val="20"/>
+          <w:szCs w:val="20"/>
+        </w:rPr>
+        <w:t xml:space="preserve">Levitt, S. D. (2004). Why are gambling markets organised so differently from financial markets? The Economic Journal, 114(495), 223-246. https://doi.org/10.1111/j.1468-0297.2004.00207.x</w:t>
+      </w:r>
+    </w:p>
+    <w:p>
+      <w:pPr>
+        <w:spacing w:after="120" w:line="260"/>
+        <w:ind w:left="360" w:hanging="360"/>
+        <w:jc w:val="left"/>
       </w:pPr>
       <w:r>
         <w:rPr>
           <w:rFonts w:ascii="Georgia" w:cs="Georgia" w:eastAsia="Georgia" w:hAnsi="Georgia"/>
           <w:color w:val="1a1a1a"/>
-          <w:sz w:val="22"/>
-          <w:szCs w:val="22"/>
-        </w:rPr>
-        <w:t xml:space="preserve">Across the 15,350 games in the sample with a positive margin, the maximum absolute error is 3.3e-16 for the difference-preserving property in step 2, 2.8e-16 for the closed form in step 3, and 2.8e-16 for the equivalence itself, all at the limit of double precision. The recovered insider share z is consistent across the two sides to 1.5e-14 and ranges from 0.0037 to 0.0718 with a mean of 0.0384, so these are genuine interior Shin solutions and not a degenerate corner. One game in the archive is quoted with a booksum below one, where Shin's model has no valid solution; it is excluded from this appendix and falls back to proportional in Table 5.</w:t>
-      </w:r>
-    </w:p>
-    <w:p>
-      <w:pPr>
-        <w:spacing w:after="160" w:line="340"/>
-        <w:jc w:val="both"/>
+          <w:sz w:val="20"/>
+          <w:szCs w:val="20"/>
+        </w:rPr>
+        <w:t xml:space="preserve">Moskowitz, T. J. (2021). Asset pricing and sports betting. The Journal of Finance, 76(6), 3153-3209. https://doi.org/10.1111/jofi.13082</w:t>
+      </w:r>
+    </w:p>
+    <w:p>
+      <w:pPr>
+        <w:spacing w:after="120" w:line="260"/>
+        <w:ind w:left="360" w:hanging="360"/>
+        <w:jc w:val="left"/>
       </w:pPr>
       <w:r>
         <w:rPr>
           <w:rFonts w:ascii="Georgia" w:cs="Georgia" w:eastAsia="Georgia" w:hAnsi="Georgia"/>
           <w:color w:val="1a1a1a"/>
-          <w:sz w:val="22"/>
-          <w:szCs w:val="22"/>
-        </w:rPr>
-        <w:t xml:space="preserve">The equivalence does not mean the two rules express the same idea. Shin's is derived from a bookmaker pricing against insider money and is intended to load margin onto longshots; the additive rule is a mechanical convention with no behavioral content. They coincide only because a two-outcome market leaves a single degree of freedom once the sum constraint and the difference-preserving property are both imposed. With three or more outcomes they separate. The practical consequence for this paper is narrow: a reader who asks why Shin was not tested should know that it was, and that in this market it is the additive row.</w:t>
-      </w:r>
-    </w:p>
-    <w:p>
-      <w:pPr>
-        <w:spacing w:after="160" w:line="340"/>
-        <w:jc w:val="both"/>
+          <w:sz w:val="20"/>
+          <w:szCs w:val="20"/>
+        </w:rPr>
+        <w:t xml:space="preserve">Newall, P. W. S., &amp; Cortis, D. (2021). Are sports bettors biased toward longshots, favorites, or both? A literature review. Risks, 9(1), Article 22. https://doi.org/10.3390/risks9010022</w:t>
+      </w:r>
+    </w:p>
+    <w:p>
+      <w:pPr>
+        <w:spacing w:after="120" w:line="260"/>
+        <w:ind w:left="360" w:hanging="360"/>
+        <w:jc w:val="left"/>
       </w:pPr>
       <w:r>
         <w:rPr>
           <w:rFonts w:ascii="Georgia" w:cs="Georgia" w:eastAsia="Georgia" w:hAnsi="Georgia"/>
           <w:color w:val="1a1a1a"/>
-          <w:sz w:val="22"/>
-          <w:szCs w:val="22"/>
-        </w:rPr>
-        <w:t xml:space="preserve">One implementation note, recorded because it produced wrong numbers before it was caught. Evaluated directly, the numerator sqrt(z^2 + a) - z is a difference of nearly equal quantities as z approaches one, and in double precision it loses most of its significant digits, which sends the root finder to values whose probabilities sum to roughly 0.98 rather than one. Multiplying by the conjugate gives the algebraically identical and numerically stable form pi = 2 q^2 / [ P ( sqrt(z^2 + a) + z ) ], which is what the code uses.</w:t>
+          <w:sz w:val="20"/>
+          <w:szCs w:val="20"/>
+        </w:rPr>
+        <w:t xml:space="preserve">Paul, R. J., &amp; Weinbach, A. P. (2008). Price setting in the NBA gambling market: Tests of the Levitt model of sportsbook behavior. International Journal of Sport Finance, 3(3), 137-145.</w:t>
+      </w:r>
+    </w:p>
+    <w:p>
+      <w:pPr>
+        <w:spacing w:after="120" w:line="260"/>
+        <w:ind w:left="360" w:hanging="360"/>
+        <w:jc w:val="left"/>
+      </w:pPr>
+      <w:r>
+        <w:rPr>
+          <w:rFonts w:ascii="Georgia" w:cs="Georgia" w:eastAsia="Georgia" w:hAnsi="Georgia"/>
+          <w:color w:val="1a1a1a"/>
+          <w:sz w:val="20"/>
+          <w:szCs w:val="20"/>
+        </w:rPr>
+        <w:t xml:space="preserve">Sauer, R. D., Brajer, V., Ferris, S. P., &amp; Marr, M. W. (1988). Hold your bets: Another look at the efficiency of the gambling market for National Football League games. Journal of Political Economy, 96(1), 206-213. https://doi.org/10.1086/261532</w:t>
+      </w:r>
+    </w:p>
+    <w:p>
+      <w:pPr>
+        <w:spacing w:after="120" w:line="260"/>
+        <w:ind w:left="360" w:hanging="360"/>
+        <w:jc w:val="left"/>
+      </w:pPr>
+      <w:r>
+        <w:rPr>
+          <w:rFonts w:ascii="Georgia" w:cs="Georgia" w:eastAsia="Georgia" w:hAnsi="Georgia"/>
+          <w:color w:val="1a1a1a"/>
+          <w:sz w:val="20"/>
+          <w:szCs w:val="20"/>
+        </w:rPr>
+        <w:t xml:space="preserve">Shin, H. S. (1993). Measuring the incidence of insider trading in a market for state-contingent claims. The Economic Journal, 103(420), 1141-1153. https://doi.org/10.2307/2234240</w:t>
+      </w:r>
+    </w:p>
+    <w:p>
+      <w:pPr>
+        <w:spacing w:after="120" w:line="260"/>
+        <w:ind w:left="360" w:hanging="360"/>
+        <w:jc w:val="left"/>
+      </w:pPr>
+      <w:r>
+        <w:rPr>
+          <w:rFonts w:ascii="Georgia" w:cs="Georgia" w:eastAsia="Georgia" w:hAnsi="Georgia"/>
+          <w:color w:val="1a1a1a"/>
+          <w:sz w:val="20"/>
+          <w:szCs w:val="20"/>
+        </w:rPr>
+        <w:t xml:space="preserve">Sportsbook Reviews Online. (n.d.). NBA scores and odds archives. https://www.sportsbookreviewsonline.com/scoresoddsarchives/nba/nbaoddsarchives.htm</w:t>
+      </w:r>
+    </w:p>
+    <w:p>
+      <w:pPr>
+        <w:spacing w:after="120" w:line="260"/>
+        <w:ind w:left="360" w:hanging="360"/>
+        <w:jc w:val="left"/>
+      </w:pPr>
+      <w:r>
+        <w:rPr>
+          <w:rFonts w:ascii="Georgia" w:cs="Georgia" w:eastAsia="Georgia" w:hAnsi="Georgia"/>
+          <w:color w:val="1a1a1a"/>
+          <w:sz w:val="20"/>
+          <w:szCs w:val="20"/>
+        </w:rPr>
+        <w:t xml:space="preserve">Thaler, R. H., &amp; Ziemba, W. T. (1988). Anomalies: Parimutuel betting markets. Journal of Economic Perspectives, 2(2), 161-174. https://doi.org/10.1257/jep.2.2.161</w:t>
+      </w:r>
+    </w:p>
+    <w:p>
+      <w:pPr>
+        <w:spacing w:after="120" w:line="260"/>
+        <w:ind w:left="360" w:hanging="360"/>
+        <w:jc w:val="left"/>
+      </w:pPr>
+      <w:r>
+        <w:rPr>
+          <w:rFonts w:ascii="Georgia" w:cs="Georgia" w:eastAsia="Georgia" w:hAnsi="Georgia"/>
+          <w:color w:val="1a1a1a"/>
+          <w:sz w:val="20"/>
+          <w:szCs w:val="20"/>
+        </w:rPr>
+        <w:t xml:space="preserve">Winkelmann, D., Otting, M., Deutscher, C., &amp; Makarewicz, T. (2024). Are betting markets inefficient? Evidence from simulations and real data. Journal of Sports Economics, 25(1). https://doi.org/10.1177/15270025231204997</w:t>
+      </w:r>
+    </w:p>
+    <w:p>
+      <w:pPr>
+        <w:spacing w:after="120" w:line="260"/>
+        <w:ind w:left="360" w:hanging="360"/>
+        <w:jc w:val="left"/>
+      </w:pPr>
+      <w:r>
+        <w:rPr>
+          <w:rFonts w:ascii="Georgia" w:cs="Georgia" w:eastAsia="Georgia" w:hAnsi="Georgia"/>
+          <w:color w:val="1a1a1a"/>
+          <w:sz w:val="20"/>
+          <w:szCs w:val="20"/>
+        </w:rPr>
+        <w:t xml:space="preserve">Woodland, L. M., &amp; Woodland, B. M. (2001). Market efficiency and profitable wagering in the National Hockey League: Can bettors score on longshots? Southern Economic Journal, 67(4), 983-995.</w:t>
+      </w:r>
+    </w:p>
+    <w:p>
+      <w:pPr>
+        <w:spacing w:after="120" w:line="260"/>
+        <w:ind w:left="360" w:hanging="360"/>
+        <w:jc w:val="left"/>
+      </w:pPr>
+      <w:r>
+        <w:rPr>
+          <w:rFonts w:ascii="Georgia" w:cs="Georgia" w:eastAsia="Georgia" w:hAnsi="Georgia"/>
+          <w:color w:val="1a1a1a"/>
+          <w:sz w:val="20"/>
+          <w:szCs w:val="20"/>
+        </w:rPr>
+        <w:t xml:space="preserve">Woodland, L. M., &amp; Woodland, B. M. (2011). The reverse favourite-longshot bias in the National Hockey League: Do bettors still score on longshots? Journal of Sports Economics, 12(1), 106-117.</w:t>
+      </w:r>
+    </w:p>
+    <w:p>
+      <w:pPr>
+        <w:spacing w:after="120" w:line="260"/>
+        <w:ind w:left="360" w:hanging="360"/>
+        <w:jc w:val="left"/>
+      </w:pPr>
+      <w:r>
+        <w:rPr>
+          <w:rFonts w:ascii="Georgia" w:cs="Georgia" w:eastAsia="Georgia" w:hAnsi="Georgia"/>
+          <w:color w:val="1a1a1a"/>
+          <w:sz w:val="20"/>
+          <w:szCs w:val="20"/>
+        </w:rPr>
+        <w:t xml:space="preserve">Zuber, R. A., Gandar, J. M., &amp; Bowers, B. D. (1985). Beating the spread: Testing the efficiency of the gambling market for National Football League games. Journal of Political Economy, 93(4), 800-806. https://doi.org/10.1086/261332</w:t>
       </w:r>
     </w:p>
     <w:p>
@@ -7385,374 +6864,6 @@
           <w:sz w:val="28"/>
           <w:szCs w:val="28"/>
         </w:rPr>
-        <w:t xml:space="preserve">References</w:t>
-      </w:r>
-    </w:p>
-    <w:p>
-      <w:pPr>
-        <w:spacing w:after="120" w:line="260"/>
-        <w:ind w:left="360" w:hanging="360"/>
-        <w:jc w:val="left"/>
-      </w:pPr>
-      <w:r>
-        <w:rPr>
-          <w:rFonts w:ascii="Georgia" w:cs="Georgia" w:eastAsia="Georgia" w:hAnsi="Georgia"/>
-          <w:color w:val="1a1a1a"/>
-          <w:sz w:val="20"/>
-          <w:szCs w:val="20"/>
-        </w:rPr>
-        <w:t xml:space="preserve">American Gaming Association. (2025). State of the states 2025: The AGA survey of the commercial casino industry. https://www.americangaming.org/resources/state-of-the-states-2025/</w:t>
-      </w:r>
-    </w:p>
-    <w:p>
-      <w:pPr>
-        <w:spacing w:after="120" w:line="260"/>
-        <w:ind w:left="360" w:hanging="360"/>
-        <w:jc w:val="left"/>
-      </w:pPr>
-      <w:r>
-        <w:rPr>
-          <w:rFonts w:ascii="Georgia" w:cs="Georgia" w:eastAsia="Georgia" w:hAnsi="Georgia"/>
-          <w:color w:val="1a1a1a"/>
-          <w:sz w:val="20"/>
-          <w:szCs w:val="20"/>
-        </w:rPr>
-        <w:t xml:space="preserve">Angelini, G., &amp; De Angelis, L. (2019). Efficiency of online football betting markets. International Journal of Forecasting, 35(2), 712-721. https://doi.org/10.1016/j.ijforecast.2018.07.008</w:t>
-      </w:r>
-    </w:p>
-    <w:p>
-      <w:pPr>
-        <w:spacing w:after="120" w:line="260"/>
-        <w:ind w:left="360" w:hanging="360"/>
-        <w:jc w:val="left"/>
-      </w:pPr>
-      <w:r>
-        <w:rPr>
-          <w:rFonts w:ascii="Georgia" w:cs="Georgia" w:eastAsia="Georgia" w:hAnsi="Georgia"/>
-          <w:color w:val="1a1a1a"/>
-          <w:sz w:val="20"/>
-          <w:szCs w:val="20"/>
-        </w:rPr>
-        <w:t xml:space="preserve">Burdier, J. (2026). Replication materials for “Are archived NBA consensus moneylines calibrated? A pre-specified test of favorite pricing across 15,351 games” [Computer software]. GitHub. https://github.com/jacobburdier05/nba-moneyline-calibration</w:t>
-      </w:r>
-    </w:p>
-    <w:p>
-      <w:pPr>
-        <w:spacing w:after="120" w:line="260"/>
-        <w:ind w:left="360" w:hanging="360"/>
-        <w:jc w:val="left"/>
-      </w:pPr>
-      <w:r>
-        <w:rPr>
-          <w:rFonts w:ascii="Georgia" w:cs="Georgia" w:eastAsia="Georgia" w:hAnsi="Georgia"/>
-          <w:color w:val="1a1a1a"/>
-          <w:sz w:val="20"/>
-          <w:szCs w:val="20"/>
-        </w:rPr>
-        <w:t xml:space="preserve">Berkowitz, J. P., Depken, C. A., &amp; Gandar, J. M. (2018). The conversion of money lines into win probabilities: Reconciliations and simplifications. Journal of Sports Economics, 19(1). Working paper: https://pages.charlotte.edu/wp-content/uploads/sites/850/2012/10/wp2016-006.pdf</w:t>
-      </w:r>
-    </w:p>
-    <w:p>
-      <w:pPr>
-        <w:spacing w:after="120" w:line="260"/>
-        <w:ind w:left="360" w:hanging="360"/>
-        <w:jc w:val="left"/>
-      </w:pPr>
-      <w:r>
-        <w:rPr>
-          <w:rFonts w:ascii="Georgia" w:cs="Georgia" w:eastAsia="Georgia" w:hAnsi="Georgia"/>
-          <w:color w:val="1a1a1a"/>
-          <w:sz w:val="20"/>
-          <w:szCs w:val="20"/>
-        </w:rPr>
-        <w:t xml:space="preserve">Cheung, K. C. (2015). Fixed-odds betting and traditional odds. Sports Trading Network.</w:t>
-      </w:r>
-    </w:p>
-    <w:p>
-      <w:pPr>
-        <w:spacing w:after="120" w:line="260"/>
-        <w:ind w:left="360" w:hanging="360"/>
-        <w:jc w:val="left"/>
-      </w:pPr>
-      <w:r>
-        <w:rPr>
-          <w:rFonts w:ascii="Georgia" w:cs="Georgia" w:eastAsia="Georgia" w:hAnsi="Georgia"/>
-          <w:color w:val="1a1a1a"/>
-          <w:sz w:val="20"/>
-          <w:szCs w:val="20"/>
-        </w:rPr>
-        <w:t xml:space="preserve">Dotan, G. (2020). Beating the book: A machine learning approach to identifying an edge in NBA betting markets (Master's thesis, UCLA). Data repository: https://github.com/guydotan/ucla-thesis</w:t>
-      </w:r>
-    </w:p>
-    <w:p>
-      <w:pPr>
-        <w:spacing w:after="120" w:line="260"/>
-        <w:ind w:left="360" w:hanging="360"/>
-        <w:jc w:val="left"/>
-      </w:pPr>
-      <w:r>
-        <w:rPr>
-          <w:rFonts w:ascii="Georgia" w:cs="Georgia" w:eastAsia="Georgia" w:hAnsi="Georgia"/>
-          <w:color w:val="1a1a1a"/>
-          <w:sz w:val="20"/>
-          <w:szCs w:val="20"/>
-        </w:rPr>
-        <w:t xml:space="preserve">Fama, E. F. (1970). Efficient capital markets: A review of theory and empirical work. The Journal of Finance, 25(2), 383-417. https://doi.org/10.2307/2325486</w:t>
-      </w:r>
-    </w:p>
-    <w:p>
-      <w:pPr>
-        <w:spacing w:after="120" w:line="260"/>
-        <w:ind w:left="360" w:hanging="360"/>
-        <w:jc w:val="left"/>
-      </w:pPr>
-      <w:r>
-        <w:rPr>
-          <w:rFonts w:ascii="Georgia" w:cs="Georgia" w:eastAsia="Georgia" w:hAnsi="Georgia"/>
-          <w:color w:val="1a1a1a"/>
-          <w:sz w:val="20"/>
-          <w:szCs w:val="20"/>
-        </w:rPr>
-        <w:t xml:space="preserve">Griffith, R. M. (1949). Odds adjustments by American horse-race bettors. The American Journal of Psychology, 62(2), 290-294. https://doi.org/10.2307/1418469</w:t>
-      </w:r>
-    </w:p>
-    <w:p>
-      <w:pPr>
-        <w:spacing w:after="120" w:line="260"/>
-        <w:ind w:left="360" w:hanging="360"/>
-        <w:jc w:val="left"/>
-      </w:pPr>
-      <w:r>
-        <w:rPr>
-          <w:rFonts w:ascii="Georgia" w:cs="Georgia" w:eastAsia="Georgia" w:hAnsi="Georgia"/>
-          <w:color w:val="1a1a1a"/>
-          <w:sz w:val="20"/>
-          <w:szCs w:val="20"/>
-        </w:rPr>
-        <w:t xml:space="preserve">Holm, S. (1979). A simple sequentially rejective multiple test procedure. Scandinavian Journal of Statistics, 6(2), 65-70.</w:t>
-      </w:r>
-    </w:p>
-    <w:p>
-      <w:pPr>
-        <w:spacing w:after="120" w:line="260"/>
-        <w:ind w:left="360" w:hanging="360"/>
-        <w:jc w:val="left"/>
-      </w:pPr>
-      <w:r>
-        <w:rPr>
-          <w:rFonts w:ascii="Georgia" w:cs="Georgia" w:eastAsia="Georgia" w:hAnsi="Georgia"/>
-          <w:color w:val="1a1a1a"/>
-          <w:sz w:val="20"/>
-          <w:szCs w:val="20"/>
-        </w:rPr>
-        <w:t xml:space="preserve">Kahneman, D., &amp; Tversky, A. (1979). Prospect theory: An analysis of decision under risk. Econometrica, 47(2), 263-291. https://doi.org/10.2307/1914185</w:t>
-      </w:r>
-    </w:p>
-    <w:p>
-      <w:pPr>
-        <w:spacing w:after="120" w:line="260"/>
-        <w:ind w:left="360" w:hanging="360"/>
-        <w:jc w:val="left"/>
-      </w:pPr>
-      <w:r>
-        <w:rPr>
-          <w:rFonts w:ascii="Georgia" w:cs="Georgia" w:eastAsia="Georgia" w:hAnsi="Georgia"/>
-          <w:color w:val="1a1a1a"/>
-          <w:sz w:val="20"/>
-          <w:szCs w:val="20"/>
-        </w:rPr>
-        <w:t xml:space="preserve">Levitt, S. D. (2004). Why are gambling markets organised so differently from financial markets? The Economic Journal, 114(495), 223-246. https://doi.org/10.1111/j.1468-0297.2004.00207.x</w:t>
-      </w:r>
-    </w:p>
-    <w:p>
-      <w:pPr>
-        <w:spacing w:after="120" w:line="260"/>
-        <w:ind w:left="360" w:hanging="360"/>
-        <w:jc w:val="left"/>
-      </w:pPr>
-      <w:r>
-        <w:rPr>
-          <w:rFonts w:ascii="Georgia" w:cs="Georgia" w:eastAsia="Georgia" w:hAnsi="Georgia"/>
-          <w:color w:val="1a1a1a"/>
-          <w:sz w:val="20"/>
-          <w:szCs w:val="20"/>
-        </w:rPr>
-        <w:t xml:space="preserve">Moskowitz, T. J. (2021). Asset pricing and sports betting. The Journal of Finance, 76(6), 3153-3209. https://doi.org/10.1111/jofi.13082</w:t>
-      </w:r>
-    </w:p>
-    <w:p>
-      <w:pPr>
-        <w:spacing w:after="120" w:line="260"/>
-        <w:ind w:left="360" w:hanging="360"/>
-        <w:jc w:val="left"/>
-      </w:pPr>
-      <w:r>
-        <w:rPr>
-          <w:rFonts w:ascii="Georgia" w:cs="Georgia" w:eastAsia="Georgia" w:hAnsi="Georgia"/>
-          <w:color w:val="1a1a1a"/>
-          <w:sz w:val="20"/>
-          <w:szCs w:val="20"/>
-        </w:rPr>
-        <w:t xml:space="preserve">Newall, P. W. S., &amp; Cortis, D. (2021). Are sports bettors biased toward longshots, favorites, or both? A literature review. Risks, 9(1), Article 22. https://doi.org/10.3390/risks9010022</w:t>
-      </w:r>
-    </w:p>
-    <w:p>
-      <w:pPr>
-        <w:spacing w:after="120" w:line="260"/>
-        <w:ind w:left="360" w:hanging="360"/>
-        <w:jc w:val="left"/>
-      </w:pPr>
-      <w:r>
-        <w:rPr>
-          <w:rFonts w:ascii="Georgia" w:cs="Georgia" w:eastAsia="Georgia" w:hAnsi="Georgia"/>
-          <w:color w:val="1a1a1a"/>
-          <w:sz w:val="20"/>
-          <w:szCs w:val="20"/>
-        </w:rPr>
-        <w:t xml:space="preserve">Paul, R. J., &amp; Weinbach, A. P. (2008). Price setting in the NBA gambling market: Tests of the Levitt model of sportsbook behavior. International Journal of Sport Finance, 3(3), 137-145.</w:t>
-      </w:r>
-    </w:p>
-    <w:p>
-      <w:pPr>
-        <w:spacing w:after="120" w:line="260"/>
-        <w:ind w:left="360" w:hanging="360"/>
-        <w:jc w:val="left"/>
-      </w:pPr>
-      <w:r>
-        <w:rPr>
-          <w:rFonts w:ascii="Georgia" w:cs="Georgia" w:eastAsia="Georgia" w:hAnsi="Georgia"/>
-          <w:color w:val="1a1a1a"/>
-          <w:sz w:val="20"/>
-          <w:szCs w:val="20"/>
-        </w:rPr>
-        <w:t xml:space="preserve">Sauer, R. D., Brajer, V., Ferris, S. P., &amp; Marr, M. W. (1988). Hold your bets: Another look at the efficiency of the gambling market for National Football League games. Journal of Political Economy, 96(1), 206-213. https://doi.org/10.1086/261532</w:t>
-      </w:r>
-    </w:p>
-    <w:p>
-      <w:pPr>
-        <w:spacing w:after="120" w:line="260"/>
-        <w:ind w:left="360" w:hanging="360"/>
-        <w:jc w:val="left"/>
-      </w:pPr>
-      <w:r>
-        <w:rPr>
-          <w:rFonts w:ascii="Georgia" w:cs="Georgia" w:eastAsia="Georgia" w:hAnsi="Georgia"/>
-          <w:color w:val="1a1a1a"/>
-          <w:sz w:val="20"/>
-          <w:szCs w:val="20"/>
-        </w:rPr>
-        <w:t xml:space="preserve">Shin, H. S. (1993). Measuring the incidence of insider trading in a market for state-contingent claims. The Economic Journal, 103(420), 1141-1153. https://doi.org/10.2307/2234240</w:t>
-      </w:r>
-    </w:p>
-    <w:p>
-      <w:pPr>
-        <w:spacing w:after="120" w:line="260"/>
-        <w:ind w:left="360" w:hanging="360"/>
-        <w:jc w:val="left"/>
-      </w:pPr>
-      <w:r>
-        <w:rPr>
-          <w:rFonts w:ascii="Georgia" w:cs="Georgia" w:eastAsia="Georgia" w:hAnsi="Georgia"/>
-          <w:color w:val="1a1a1a"/>
-          <w:sz w:val="20"/>
-          <w:szCs w:val="20"/>
-        </w:rPr>
-        <w:t xml:space="preserve">Sportsbook Reviews Online. (n.d.). NBA scores and odds archives. https://www.sportsbookreviewsonline.com/scoresoddsarchives/nba/nbaoddsarchives.htm</w:t>
-      </w:r>
-    </w:p>
-    <w:p>
-      <w:pPr>
-        <w:spacing w:after="120" w:line="260"/>
-        <w:ind w:left="360" w:hanging="360"/>
-        <w:jc w:val="left"/>
-      </w:pPr>
-      <w:r>
-        <w:rPr>
-          <w:rFonts w:ascii="Georgia" w:cs="Georgia" w:eastAsia="Georgia" w:hAnsi="Georgia"/>
-          <w:color w:val="1a1a1a"/>
-          <w:sz w:val="20"/>
-          <w:szCs w:val="20"/>
-        </w:rPr>
-        <w:t xml:space="preserve">Thaler, R. H., &amp; Ziemba, W. T. (1988). Anomalies: Parimutuel betting markets. Journal of Economic Perspectives, 2(2), 161-174. https://doi.org/10.1257/jep.2.2.161</w:t>
-      </w:r>
-    </w:p>
-    <w:p>
-      <w:pPr>
-        <w:spacing w:after="120" w:line="260"/>
-        <w:ind w:left="360" w:hanging="360"/>
-        <w:jc w:val="left"/>
-      </w:pPr>
-      <w:r>
-        <w:rPr>
-          <w:rFonts w:ascii="Georgia" w:cs="Georgia" w:eastAsia="Georgia" w:hAnsi="Georgia"/>
-          <w:color w:val="1a1a1a"/>
-          <w:sz w:val="20"/>
-          <w:szCs w:val="20"/>
-        </w:rPr>
-        <w:t xml:space="preserve">Winkelmann, D., Otting, M., Deutscher, C., &amp; Makarewicz, T. (2024). Are betting markets inefficient? Evidence from simulations and real data. Journal of Sports Economics, 25(1). https://doi.org/10.1177/15270025231204997</w:t>
-      </w:r>
-    </w:p>
-    <w:p>
-      <w:pPr>
-        <w:spacing w:after="120" w:line="260"/>
-        <w:ind w:left="360" w:hanging="360"/>
-        <w:jc w:val="left"/>
-      </w:pPr>
-      <w:r>
-        <w:rPr>
-          <w:rFonts w:ascii="Georgia" w:cs="Georgia" w:eastAsia="Georgia" w:hAnsi="Georgia"/>
-          <w:color w:val="1a1a1a"/>
-          <w:sz w:val="20"/>
-          <w:szCs w:val="20"/>
-        </w:rPr>
-        <w:t xml:space="preserve">Woodland, L. M., &amp; Woodland, B. M. (2001). Market efficiency and profitable wagering in the National Hockey League: Can bettors score on longshots? Southern Economic Journal, 67(4), 983-995.</w:t>
-      </w:r>
-    </w:p>
-    <w:p>
-      <w:pPr>
-        <w:spacing w:after="120" w:line="260"/>
-        <w:ind w:left="360" w:hanging="360"/>
-        <w:jc w:val="left"/>
-      </w:pPr>
-      <w:r>
-        <w:rPr>
-          <w:rFonts w:ascii="Georgia" w:cs="Georgia" w:eastAsia="Georgia" w:hAnsi="Georgia"/>
-          <w:color w:val="1a1a1a"/>
-          <w:sz w:val="20"/>
-          <w:szCs w:val="20"/>
-        </w:rPr>
-        <w:t xml:space="preserve">Woodland, L. M., &amp; Woodland, B. M. (2011). The reverse favourite-longshot bias in the National Hockey League: Do bettors still score on longshots? Journal of Sports Economics, 12(1), 106-117.</w:t>
-      </w:r>
-    </w:p>
-    <w:p>
-      <w:pPr>
-        <w:spacing w:after="120" w:line="260"/>
-        <w:ind w:left="360" w:hanging="360"/>
-        <w:jc w:val="left"/>
-      </w:pPr>
-      <w:r>
-        <w:rPr>
-          <w:rFonts w:ascii="Georgia" w:cs="Georgia" w:eastAsia="Georgia" w:hAnsi="Georgia"/>
-          <w:color w:val="1a1a1a"/>
-          <w:sz w:val="20"/>
-          <w:szCs w:val="20"/>
-        </w:rPr>
-        <w:t xml:space="preserve">Zuber, R. A., Gandar, J. M., &amp; Bowers, B. D. (1985). Beating the spread: Testing the efficiency of the gambling market for National Football League games. Journal of Political Economy, 93(4), 800-806. https://doi.org/10.1086/261332</w:t>
-      </w:r>
-    </w:p>
-    <w:p>
-      <w:pPr>
-        <w:spacing w:after="140" w:before="320" w:line="300"/>
-      </w:pPr>
-      <w:r>
-        <w:rPr>
-          <w:rFonts w:ascii="Georgia" w:cs="Georgia" w:eastAsia="Georgia" w:hAnsi="Georgia"/>
-          <w:b/>
-          <w:bCs/>
-          <w:color w:val="1a1a2e"/>
-          <w:sz w:val="28"/>
-          <w:szCs w:val="28"/>
-        </w:rPr>
         <w:t xml:space="preserve">Reproducibility and AI Disclosure</w:t>
       </w:r>
     </w:p>
@@ -7768,7 +6879,7 @@
           <w:sz w:val="22"/>
           <w:szCs w:val="22"/>
         </w:rPr>
-        <w:t xml:space="preserve">This paper is designed to be reproducible. The replication materials include the frozen analysis plan, the primary and robustness analysis scripts, the data verification script and its full output, the figure-generating scripts, and machine-readable result tables, so every number and figure can be regenerated from the raw archive. The headline statistics were reproduced independently from the raw files, including the exact test size and power, the Poisson-binomial test statistic, the break-even algebra, the Cochran Q construction, and the alternative normalizations.</w:t>
+        <w:t xml:space="preserve">The replication materials include the frozen analysis plan, the confirmatory and robustness scripts, the data verification script and its full output, the figure scripts, the supplementary material, and machine-readable result tables, so every number and figure regenerates from the raw archive. Headline statistics were reproduced independently from the raw files, including the test size and power, the Poisson-binomial statistic, the break-even algebra, the Cochran Q construction and the alternative normalizations.</w:t>
       </w:r>
     </w:p>
     <w:p>
@@ -7783,7 +6894,7 @@
           <w:sz w:val="22"/>
           <w:szCs w:val="22"/>
         </w:rPr>
-        <w:t xml:space="preserve">AI tools assisted with code generation, statistical checking, data verification, and copy-editing. The research question, study design, assumptions, interpretation, and final claims are the author's. No AI-generated source or statistic is cited as evidence, and every reference in this paper was located and read directly.</w:t>
+        <w:t xml:space="preserve">AI tools assisted with code generation, statistical checking, data verification, and copy-editing. The research question, study design, assumptions, interpretation and final claims are the author's. No AI-generated source or statistic is cited as evidence, and every reference was located and read directly.</w:t>
       </w:r>
     </w:p>
     <w:sectPr>

</xml_diff>

<commit_message>
Paper: add supplement S6 on the simulated return intervals
</commit_message>
<xml_diff>
--- a/paper/NBA_Moneyline_Calibration_Paper.docx
+++ b/paper/NBA_Moneyline_Calibration_Paper.docx
@@ -6186,7 +6186,7 @@
           <w:sz w:val="22"/>
           <w:szCs w:val="22"/>
         </w:rPr>
-        <w:t xml:space="preserve">Flat one-dollar bets at the quoted prices lose money in every direction: -4.06 percent on all favorites (95% CI: -5.13 to -3.00), -3.91 on all underdogs (-6.57 to -1.25), and -2.90 on favorites above .70 (-4.04 to -1.76), consistent with the 3.77 percent mean overround. Against the economic hurdle directly, the observed +0.58-point gap and even its +1.26-point upper bound fall well short of the +3.01 points a favorite bettor needed.</w:t>
+        <w:t xml:space="preserve">Flat one-dollar bets at the quoted prices lose money in every direction: -4.06 percent on all favorites (95% CI: -5.13 to -3.00), -3.91 on all underdogs (-6.57 to -1.25), and -2.90 on favorites above .70 (-4.04 to -1.76), consistent with the 3.77 percent mean overround. Those intervals use a normal approximation on a skewed quantity, which Losak and Kalamvokis (2025) argue inflates the true rejection rate of profitability tests in this literature. Simulating their null here moves no bound by more than 0.09 points and the test holds its nominal size, so the intervals stand, though the failure they describe does reproduce in these prices at smaller sample sizes; see the supplementary material. Against the economic hurdle directly, the observed +0.58-point gap and even its +1.26-point upper bound fall well short of the +3.01 points a favorite bettor needed.</w:t>
       </w:r>
     </w:p>
     <w:p>
@@ -6496,7 +6496,7 @@
           <w:sz w:val="22"/>
           <w:szCs w:val="22"/>
         </w:rPr>
-        <w:t xml:space="preserve">The historical odds archive is publicly available from sportsbookreviewsonline.com and redistributed at https://github.com/guydotan/ucla-thesis. All analysis scripts, the derived dataset, the frozen analysis plan, the supplementary material, and a script that re-downloads the upstream files and verifies every retained column against them are at https://github.com/jacobburdier05/nba-moneyline-calibration. A single command reproduces every reported statistic, table and figure from the raw archive in about three minutes.</w:t>
+        <w:t xml:space="preserve">The historical odds archive is publicly available from sportsbookreviewsonline.com and redistributed at https://github.com/guydotan/ucla-thesis. All analysis scripts, the derived dataset, the frozen analysis plan, the supplementary material, and a script that re-downloads the upstream files and verifies every retained column against them are at https://github.com/jacobburdier05/nba-moneyline-calibration. A single command reproduces every reported statistic, table and figure from the raw archive in about five minutes.</w:t>
       </w:r>
     </w:p>
     <w:p>
@@ -6673,6 +6673,22 @@
           <w:szCs w:val="20"/>
         </w:rPr>
         <w:t xml:space="preserve">Levitt, S. D. (2004). Why are gambling markets organised so differently from financial markets? The Economic Journal, 114(495), 223-246. https://doi.org/10.1111/j.1468-0297.2004.00207.x</w:t>
+      </w:r>
+    </w:p>
+    <w:p>
+      <w:pPr>
+        <w:spacing w:after="120" w:line="260"/>
+        <w:ind w:left="360" w:hanging="360"/>
+        <w:jc w:val="left"/>
+      </w:pPr>
+      <w:r>
+        <w:rPr>
+          <w:rFonts w:ascii="Georgia" w:cs="Georgia" w:eastAsia="Georgia" w:hAnsi="Georgia"/>
+          <w:color w:val="1a1a1a"/>
+          <w:sz w:val="20"/>
+          <w:szCs w:val="20"/>
+        </w:rPr>
+        <w:t xml:space="preserve">Losak, J. M., &amp; Kalamvokis, J. (2025). Simulation for the win: A better way to test for betting strategy profitability [Conference presentation]. International Association of Sports Economists. Unpublished; slides provided by the author.</w:t>
       </w:r>
     </w:p>
     <w:p>

</xml_diff>

<commit_message>
Split long sentences: Flesch-Kincaid 13.0 to 10.8
</commit_message>
<xml_diff>
--- a/paper/NBA_Moneyline_Calibration_Paper.docx
+++ b/paper/NBA_Moneyline_Calibration_Paper.docx
@@ -82,7 +82,7 @@
     </w:p>
     <w:p>
       <w:pPr>
-        <w:spacing w:after="160" w:line="340"/>
+        <w:spacing w:after="152" w:line="326"/>
         <w:jc w:val="both"/>
       </w:pPr>
       <w:r>
@@ -92,12 +92,12 @@
           <w:sz w:val="22"/>
           <w:szCs w:val="22"/>
         </w:rPr>
-        <w:t xml:space="preserve">Tests for bias in sports-betting prices often rely on small groups of games, which creates a power problem: a significant result can be fragile, and a non-significant one may simply be too weak to detect a meaningful effect. This study fixed its analysis plan before looking at outcomes, set the smallest effect worth detecting at the margin a bettor must overcome at the quoted prices, and ran one primary test on 15,351 NBA regular-season games from 2007-08 through 2019-20.</w:t>
-      </w:r>
-    </w:p>
-    <w:p>
-      <w:pPr>
-        <w:spacing w:after="160" w:line="340"/>
+        <w:t xml:space="preserve">Tests for bias in sports-betting prices often rely on small groups of games, which creates a power problem. A significant result can be fragile, and a non-significant one may simply be too weak to detect a meaningful effect. This study fixed its analysis plan before looking at outcomes. It set the smallest effect worth detecting at the margin a bettor must overcome at the quoted prices. It then ran one primary test on 15,351 NBA regular-season games from 2007-08 through 2019-20.</w:t>
+      </w:r>
+    </w:p>
+    <w:p>
+      <w:pPr>
+        <w:spacing w:after="152" w:line="326"/>
         <w:jc w:val="both"/>
       </w:pPr>
       <w:r>
@@ -107,12 +107,12 @@
           <w:sz w:val="22"/>
           <w:szCs w:val="22"/>
         </w:rPr>
-        <w:t xml:space="preserve">Favorites with a vig-free implied probability above .70 (6,840 games) won 80.83 percent of the time against an implied 80.26 percent, a gap of 0.58 percentage points (z = 1.22, p = .223). The estimate is unchanged across six variance estimators allowing correlation within seasons and within teams, none of which rejects calibration. A bettor needed favorites to beat their vig-free probability by 3.01 points to break even, against a design able to detect 1.33, so the observed gap sits well inside the region the test was built to rule out.</w:t>
-      </w:r>
-    </w:p>
-    <w:p>
-      <w:pPr>
-        <w:spacing w:after="160" w:line="340"/>
+        <w:t xml:space="preserve">Favorites with a vig-free implied probability above .70 (6,840 games) won 80.83 percent of the time against an implied 80.26 percent, a gap of 0.58 percentage points (z = 1.22, p = .223). The estimate is unchanged across six variance estimators allowing correlation within seasons and within teams, none of which rejects calibration. A bettor needed favorites to beat their vig-free probability by 3.01 points to break even, against a design able to detect 1.33. The observed gap sits well inside the region the test was built to rule out.</w:t>
+      </w:r>
+    </w:p>
+    <w:p>
+      <w:pPr>
+        <w:spacing w:after="152" w:line="326"/>
         <w:jc w:val="both"/>
       </w:pPr>
       <w:r>
@@ -122,7 +122,7 @@
           <w:sz w:val="22"/>
           <w:szCs w:val="22"/>
         </w:rPr>
-        <w:t xml:space="preserve">That conclusion is not universal. Under five vig-removal rules the gap runs from -1.31 to +0.58 points; four leave it below that rule's own break-even threshold and none of those four is significant, but power normalization gives -1.31 against a 1.24-point threshold at p = .004. On the same games, raw implied probabilities imply a favorite bias of -2.50 points at p &lt; .001. Whether favorite bias exists in this market, how large it is, and even which way it points all depend heavily on how the bookmaker's margin is removed. That dependence, rather than the null result itself, is the paper's more lasting finding, and a design fixed in advance and tied to an economic threshold is what makes it visible.</w:t>
+        <w:t xml:space="preserve">That conclusion is not universal. Under five vig-removal rules the gap runs from -1.31 to +0.58 points. Four leave it below that rule's own break-even threshold, and none of those four is significant. Power normalization gives -1.31 against a 1.24-point threshold at p = .004. On the same games, raw implied probabilities imply a favorite bias of -2.50 points at p &lt; .001. Whether favorite bias exists in this market, how large it is, and even which way it points all depend heavily on how the bookmaker's margin is removed. That dependence, rather than the null result itself, is the paper's more lasting finding. A design fixed in advance and tied to an economic threshold is what makes it visible.</w:t>
       </w:r>
     </w:p>
     <w:p>
@@ -171,7 +171,7 @@
     </w:p>
     <w:p>
       <w:pPr>
-        <w:spacing w:after="160" w:line="340"/>
+        <w:spacing w:after="152" w:line="326"/>
         <w:jc w:val="both"/>
       </w:pPr>
       <w:r>
@@ -181,12 +181,12 @@
           <w:sz w:val="22"/>
           <w:szCs w:val="22"/>
         </w:rPr>
-        <w:t xml:space="preserve">State-regulated sportsbooks accepted roughly $149.9 billion in wagers during 2024 (American Gaming Association, 2025). That scale makes it worth asking how well the prices work, but it does not make every statistical finding about them convincing. A dataset can hold thousands of games and still leave only a few dozen observations in the range that carries the conclusion. Take a 74-game bucket of favorites priced near .85, the kind of slice these studies often report, and ask whether it could detect a deviation the size of the break-even margin computed later from these very prices, 3.01 percentage points. It has about 11 percent power. A significant result from such a test can turn on one or two outcomes, and a null result says almost nothing.</w:t>
-      </w:r>
-    </w:p>
-    <w:p>
-      <w:pPr>
-        <w:spacing w:after="160" w:line="340"/>
+        <w:t xml:space="preserve">State-regulated sportsbooks accepted roughly $149.9 billion in wagers during 2024 (American Gaming Association, 2025). That scale makes it worth asking how well the prices work, but it does not make every statistical finding about them convincing. A dataset can hold thousands of games and still leave only a few dozen observations in the range that carries the conclusion. Take a 74-game bucket of favorites priced near .85, the kind of slice these studies often report. Ask whether it could detect a deviation the size of the break-even margin computed later from these very prices, 3.01 percentage points. It has about 11 percent power. A significant result from such a test can turn on one or two outcomes, and a null result says almost nothing.</w:t>
+      </w:r>
+    </w:p>
+    <w:p>
+      <w:pPr>
+        <w:spacing w:after="152" w:line="326"/>
         <w:jc w:val="both"/>
       </w:pPr>
       <w:r>
@@ -201,7 +201,7 @@
     </w:p>
     <w:p>
       <w:pPr>
-        <w:spacing w:after="160" w:line="340"/>
+        <w:spacing w:after="152" w:line="326"/>
         <w:ind w:left="400" w:right="400"/>
         <w:jc w:val="both"/>
       </w:pPr>
@@ -219,7 +219,7 @@
     </w:p>
     <w:p>
       <w:pPr>
-        <w:spacing w:after="160" w:line="340"/>
+        <w:spacing w:after="152" w:line="326"/>
         <w:jc w:val="both"/>
       </w:pPr>
       <w:r>
@@ -234,7 +234,7 @@
     </w:p>
     <w:p>
       <w:pPr>
-        <w:spacing w:after="160" w:line="340"/>
+        <w:spacing w:after="152" w:line="326"/>
         <w:jc w:val="both"/>
       </w:pPr>
       <w:r>
@@ -244,7 +244,7 @@
           <w:sz w:val="22"/>
           <w:szCs w:val="22"/>
         </w:rPr>
-        <w:t xml:space="preserve">Three claims are easy to mix up, and this paper is careful about which one it makes. Calibration asks whether stated probabilities match how often those outcomes actually happen. Profitability asks whether a betting rule earns a positive return after paying the quoted price. Market efficiency asks whether prices absorb information so completely that no systematic strategy can beat them. A market can be well calibrated on average and still contain predictable patterns in particular situations, and it can carry calibration errors too small for any bettor to turn into profit once the margin is paid. What this paper estimates is calibration, with a secondary direct test of flat-stake profitability. No claim is made about how well the market uses information.</w:t>
+        <w:t xml:space="preserve">Three claims are easy to mix up, and this paper is careful about which one it makes. Calibration asks whether stated probabilities match how often those outcomes actually happen. Profitability asks whether a betting rule earns a positive return after paying the quoted price. Market efficiency asks whether prices absorb information so completely that no systematic strategy can beat them. A market can be well calibrated on average and still contain predictable patterns in particular situations. It can also carry calibration errors too small for any bettor to turn into profit once the margin is paid. What this paper estimates is calibration, with a secondary direct test of flat-stake profitability. No claim is made about how well the market uses information.</w:t>
       </w:r>
     </w:p>
     <w:p>
@@ -265,7 +265,7 @@
     </w:p>
     <w:p>
       <w:pPr>
-        <w:spacing w:after="160" w:line="340"/>
+        <w:spacing w:after="152" w:line="326"/>
         <w:jc w:val="both"/>
       </w:pPr>
       <w:r>
@@ -280,7 +280,7 @@
     </w:p>
     <w:p>
       <w:pPr>
-        <w:spacing w:after="160" w:line="340"/>
+        <w:spacing w:after="152" w:line="326"/>
         <w:jc w:val="both"/>
       </w:pPr>
       <w:r>
@@ -290,12 +290,12 @@
           <w:sz w:val="22"/>
           <w:szCs w:val="22"/>
         </w:rPr>
-        <w:t xml:space="preserve">The behavioral strand concerns direction. Longshot bias means longshots are overpriced, the classic horse-racing result (Griffith, 1949; Thaler &amp; Ziemba, 1988); favorite bias is the reverse. Because the labels are used inconsistently this paper follows Newall and Cortis (2021). Woodland and Woodland (2001) report favorite bias in NHL money lines, though their conversion method was later questioned by Berkowitz, Depken and Gandar (2018) and the authors themselves reported in 2011 that the effect disappears in later seasons. A second strand concerns pricing. Levitt (2004) argues a book can shade prices toward what bettors want rather than balancing every position, which is a possible explanation rather than evidence of mispricing. Paul and Weinbach (2008) find NBA favorites attract more than their share of tickets, but find no profit in betting against them. A third asks whether any edge survives costs, and mostly finds that none does (Moskowitz, 2021; Angelini &amp; De Angelis, 2019).</w:t>
-      </w:r>
-    </w:p>
-    <w:p>
-      <w:pPr>
-        <w:spacing w:after="160" w:line="340"/>
+        <w:t xml:space="preserve">The behavioral strand concerns direction. Longshot bias means longshots are overpriced, the classic horse-racing result (Griffith, 1949; Thaler &amp; Ziemba, 1988); favorite bias is the reverse. Because the labels are used inconsistently this paper follows Newall and Cortis (2021). Woodland and Woodland (2001) report favorite bias in NHL money lines. Berkowitz, Depken and Gandar (2018) later questioned their conversion method, and the authors themselves reported in 2011 that the effect disappears in later seasons. A second strand concerns pricing. Levitt (2004) argues a book can shade prices toward what bettors want rather than balancing every position, which is a possible explanation rather than evidence of mispricing. Paul and Weinbach (2008) find NBA favorites attract more than their share of tickets, but find no profit in betting against them. A third asks whether any edge survives costs, and mostly finds that none does (Moskowitz, 2021; Angelini &amp; De Angelis, 2019).</w:t>
+      </w:r>
+    </w:p>
+    <w:p>
+      <w:pPr>
+        <w:spacing w:after="152" w:line="326"/>
         <w:jc w:val="both"/>
       </w:pPr>
       <w:r>
@@ -305,7 +305,7 @@
           <w:sz w:val="22"/>
           <w:szCs w:val="22"/>
         </w:rPr>
-        <w:t xml:space="preserve">The fourth strand is methodological, and it is where this paper sits. Winkelmann, Otting, Deutscher, and Makarewicz (2024) ask whether the inefficiency tests themselves are up to the job. What is missing is an NBA moneyline calibration analysis with a comparison chosen in advance and a stated power justification. This paper is not trying to rediscover favorite bias. It asks whether a test with enough power for a comparison chosen in advance, and tied to an economic threshold, can separate real mispricing from the false signal created by the bookmaker's margin.</w:t>
+        <w:t xml:space="preserve">The fourth strand is methodological, and it is where this paper sits. Winkelmann, Otting, Deutscher, and Makarewicz (2024) ask whether the inefficiency tests themselves are up to the job. What is missing is an NBA moneyline calibration analysis with a comparison chosen in advance and a stated power justification. This paper is not trying to rediscover favorite bias. It asks a narrower question. Can a test with enough power for a comparison chosen in advance, and tied to an economic threshold, separate real mispricing from the false signal created by the bookmaker's margin?</w:t>
       </w:r>
     </w:p>
     <w:p>
@@ -326,7 +326,7 @@
     </w:p>
     <w:p>
       <w:pPr>
-        <w:spacing w:after="160" w:line="340"/>
+        <w:spacing w:after="152" w:line="326"/>
         <w:jc w:val="both"/>
       </w:pPr>
       <w:r>
@@ -336,12 +336,12 @@
           <w:sz w:val="22"/>
           <w:szCs w:val="22"/>
         </w:rPr>
-        <w:t xml:space="preserve">The data are consensus moneylines and final scores for 15,490 NBA regular-season games from 2007-08 through 2019-20, published originally by the sportsbookreviewsonline.com archive and redistributed in the repository accompanying Dotan (2020). Files were retrieved unmodified on 20 July 2026.</w:t>
-      </w:r>
-    </w:p>
-    <w:p>
-      <w:pPr>
-        <w:spacing w:after="160" w:line="340"/>
+        <w:t xml:space="preserve">The data are consensus moneylines and final scores for 15,490 NBA regular-season games from 2007-08 through 2019-20. They were published originally by the sportsbookreviewsonline.com archive and redistributed in the repository accompanying Dotan (2020). Files were retrieved unmodified on 20 July 2026.</w:t>
+      </w:r>
+    </w:p>
+    <w:p>
+      <w:pPr>
+        <w:spacing w:after="152" w:line="326"/>
         <w:jc w:val="both"/>
       </w:pPr>
       <w:r>
@@ -356,7 +356,7 @@
     </w:p>
     <w:p>
       <w:pPr>
-        <w:spacing w:after="160" w:line="340"/>
+        <w:spacing w:after="152" w:line="326"/>
         <w:jc w:val="both"/>
       </w:pPr>
       <w:r>
@@ -366,12 +366,12 @@
           <w:sz w:val="22"/>
           <w:szCs w:val="22"/>
         </w:rPr>
-        <w:t xml:space="preserve">Because the data passed through two other hands before reaching this study, they were audited before analysis. A stratified sample of 260 games, 20 per season, was checked against the live original archive; all 260 moneylines matched on both sides, including prices as extreme as -1300 against +800, and all 260 outcomes matched. That sample was drawn by hand rather than by a seeded random procedure, so it is a spot check that found no errors, not a guarantee backed by random sampling. The stronger evidence is automated and covers the whole file: the same source repository ships an independent team-game-level extraction with its own moneyline and outcome columns, and every value in the analysis file is compared against it, 30,978 prices and 15,490 outcomes, with no discrepancy. Season counts match the true NBA schedule in every year, including the 990-game 2011-12 lockout, the 1,229-game 2012-13 season after one cancellation, and the 971 games played before the March 2020 suspension.</w:t>
-      </w:r>
-    </w:p>
-    <w:p>
-      <w:pPr>
-        <w:spacing w:after="160" w:line="340"/>
+        <w:t xml:space="preserve">Because the data passed through two other hands before reaching this study, they were audited before analysis. A stratified sample of 260 games, 20 per season, was checked against the live original archive. All 260 moneylines matched on both sides, including prices as extreme as -1300 against +800, and all 260 outcomes matched. That sample was drawn by hand rather than by a seeded random procedure, so it is a spot check that found no errors, not a guarantee backed by random sampling. The stronger evidence is automated and covers the whole file. The same source repository ships a separate team-game-level extraction with its own moneyline and outcome columns. Every value in the analysis file was compared against it: 30,978 prices and 15,490 outcomes, with no discrepancy. Season counts match the true NBA schedule in every year, including the 990-game 2011-12 lockout, the 1,229-game 2012-13 season after one cancellation, and the 971 games played before the March 2020 suspension.</w:t>
+      </w:r>
+    </w:p>
+    <w:p>
+      <w:pPr>
+        <w:spacing w:after="152" w:line="326"/>
         <w:jc w:val="both"/>
       </w:pPr>
       <w:r>
@@ -402,7 +402,7 @@
     </w:p>
     <w:p>
       <w:pPr>
-        <w:spacing w:after="160" w:line="340"/>
+        <w:spacing w:after="152" w:line="326"/>
         <w:jc w:val="both"/>
       </w:pPr>
       <w:r>
@@ -433,7 +433,7 @@
     </w:p>
     <w:p>
       <w:pPr>
-        <w:spacing w:after="160" w:line="340"/>
+        <w:spacing w:after="152" w:line="326"/>
         <w:jc w:val="both"/>
       </w:pPr>
       <w:r>
@@ -465,7 +465,7 @@
     </w:p>
     <w:p>
       <w:pPr>
-        <w:spacing w:after="160" w:line="340"/>
+        <w:spacing w:after="152" w:line="326"/>
         <w:jc w:val="both"/>
       </w:pPr>
       <w:r>
@@ -480,7 +480,7 @@
     </w:p>
     <w:p>
       <w:pPr>
-        <w:spacing w:after="160" w:line="340"/>
+        <w:spacing w:after="152" w:line="326"/>
         <w:jc w:val="both"/>
       </w:pPr>
       <w:r>
@@ -490,12 +490,12 @@
           <w:sz w:val="22"/>
           <w:szCs w:val="22"/>
         </w:rPr>
-        <w:t xml:space="preserve">Three reasons make proportional the primary rule, and the choice determines the headline number. It was fixed in the frozen analysis plan before any outcomes were examined, so it was not selected after seeing which rule gave which answer. It is the prevailing convention in the applied betting-market literature, which keeps the estimate comparable. And keeping relative pricing fixed is the natural default for a calibration question, where what matters is whether the two sides are priced correctly against each other. What should not be claimed is that it has better theoretical support than the alternatives. It does not. Of the rules tested, the only one with a real model of behavior behind it is Shin (1993), which for a two-outcome book reduces exactly to the additive rule and puts the gap at -0.60 rather than +0.58. That estimate is not significant and sits well below its own break-even requirement, so the main conclusion is unchanged, but the sign is not. Section 5.4 reports all five rules; the Shin derivation and its numerical verification are in the supplementary material.</w:t>
-      </w:r>
-    </w:p>
-    <w:p>
-      <w:pPr>
-        <w:spacing w:after="160" w:line="340"/>
+        <w:t xml:space="preserve">Three reasons make proportional the primary rule, and the choice determines the headline number. It was fixed in the frozen analysis plan before any outcomes were examined, so it was not selected after seeing which rule gave which answer. It is the prevailing convention in the applied betting-market literature, which keeps the estimate comparable. And keeping relative pricing fixed is the natural default for a calibration question, where what matters is whether the two sides are priced correctly against each other. What should not be claimed is that it has better theoretical support than the alternatives. It does not. Of the rules tested, the only one with a real model of behavior behind it is Shin (1993). For a two-outcome book it reduces exactly to the additive rule, and it puts the gap at -0.60 rather than +0.58. That estimate is not significant and sits well below its own break-even requirement, so the main conclusion is unchanged, but the sign is not. Section 5.4 reports all five rules; the Shin derivation and its numerical verification are in the supplementary material.</w:t>
+      </w:r>
+    </w:p>
+    <w:p>
+      <w:pPr>
+        <w:spacing w:after="152" w:line="326"/>
         <w:jc w:val="both"/>
       </w:pPr>
       <w:r>
@@ -526,7 +526,7 @@
     </w:p>
     <w:p>
       <w:pPr>
-        <w:spacing w:after="160" w:line="340"/>
+        <w:spacing w:after="152" w:line="326"/>
         <w:jc w:val="both"/>
       </w:pPr>
       <w:r>
@@ -536,12 +536,12 @@
           <w:sz w:val="22"/>
           <w:szCs w:val="22"/>
         </w:rPr>
-        <w:t xml:space="preserve">The single confirmatory hypothesis concerns favorites whose vig-free probability exceeds .70. Under the null each game is a Bernoulli trial with its own probability, so favorite wins follow a Poisson-binomial distribution with mean equal to the sum of the game-level probabilities and variance equal to the sum of p(1 - p). The test compares actual wins with that expected sum, two-sided at alpha = .05. Because implied probabilities vary game by game, this replaces the fixed-probability bucket tests common in the literature, which treat every game in a bucket as carrying the same probability.</w:t>
-      </w:r>
-    </w:p>
-    <w:p>
-      <w:pPr>
-        <w:spacing w:after="160" w:line="340"/>
+        <w:t xml:space="preserve">The single confirmatory hypothesis concerns favorites whose vig-free probability exceeds .70. Under the null each game is a Bernoulli trial with its own probability. Favorite wins therefore follow a Poisson-binomial distribution. Its mean is the sum of the game-level probabilities and its variance is the sum of p(1 - p). The test compares actual wins with that expected sum, two-sided at alpha = .05. Because implied probabilities vary game by game, this replaces the fixed-probability bucket tests common in the literature, which treat every game in a bucket as carrying the same probability.</w:t>
+      </w:r>
+    </w:p>
+    <w:p>
+      <w:pPr>
+        <w:spacing w:after="152" w:line="326"/>
         <w:jc w:val="both"/>
       </w:pPr>
       <w:r>
@@ -551,12 +551,12 @@
           <w:sz w:val="22"/>
           <w:szCs w:val="22"/>
         </w:rPr>
-        <w:t xml:space="preserve">That framework treats games as independent conditional on their prices, which is standard for a calibration test but is an assumption. Dependence within a game is not an issue, since only one favorite outcome is analyzed and the two sides are mirror images of each other. Four other routes are plausible: each team appears in roughly a thousand games, so a team the market keeps misjudging would correlate its own errors; roster rules, pace and market structure are shared within a season; injuries and news carry over into nearby games; and a consensus price blends books that share information. None of this changes the point estimate and all of it can change the standard error, so section 5.4 re-estimates the gap under cluster-robust variance at the season, favorite-team, underdog-team and two-way levels, and adds a team-blocked bootstrap. The confirmatory test is retained in its pre-specified form.</w:t>
-      </w:r>
-    </w:p>
-    <w:p>
-      <w:pPr>
-        <w:spacing w:after="160" w:line="340"/>
+        <w:t xml:space="preserve">That framework treats games as independent conditional on their prices, which is standard for a calibration test but is an assumption. Dependence within a game is not an issue, since only one favorite outcome is analyzed and the two sides are mirror images of each other. Four other routes are plausible. Each team appears in roughly a thousand games, so a team the market keeps misjudging would correlate its own errors. Roster rules, pace and market structure are shared within a season. Injuries and news carry over into nearby games. And a consensus price blends books that share information. None of this changes the point estimate, and all of it can change the standard error. Section 5.4 therefore re-estimates the gap under cluster-robust variance at the season, favorite-team, underdog-team and two-way levels, and adds a team-blocked bootstrap. The confirmatory test is retained in its pre-specified form.</w:t>
+      </w:r>
+    </w:p>
+    <w:p>
+      <w:pPr>
+        <w:spacing w:after="152" w:line="326"/>
         <w:jc w:val="both"/>
       </w:pPr>
       <w:r>
@@ -566,7 +566,7 @@
           <w:sz w:val="22"/>
           <w:szCs w:val="22"/>
         </w:rPr>
-        <w:t xml:space="preserve">The null result matters only if the design could catch a deviation worth caring about. The standard error of the gap is the square root of the sum of p(1 - p) divided by n, using each game's own variance rather than a single pooled value. Under the normal approximation, the standard two-sided minimum detectable effect at 80 percent power is the sum of the two critical values multiplied by that standard error. That formula is an approximation rather than an exact inversion of the Poisson-binomial power function, so the exact version was computed as a check; the two agree to four thousandths of a percentage point, and details are in the supplementary material.</w:t>
+        <w:t xml:space="preserve">The null result matters only if the design could catch a deviation worth caring about. The standard error of the gap is the square root of the sum of p(1 - p), divided by n. It uses each game's own variance rather than a single pooled value. Under the normal approximation, the standard two-sided minimum detectable effect at 80 percent power is the sum of the two critical values multiplied by that standard error. That formula is an approximation rather than an exact inversion of the Poisson-binomial power function, so the exact version was computed as a check. The two agree to four thousandths of a percentage point. Details are in the supplementary material.</w:t>
       </w:r>
     </w:p>
     <w:p>
@@ -1211,7 +1211,7 @@
     </w:p>
     <w:p>
       <w:pPr>
-        <w:spacing w:after="160" w:line="340"/>
+        <w:spacing w:after="152" w:line="326"/>
         <w:jc w:val="both"/>
       </w:pPr>
       <w:r>
@@ -1221,7 +1221,7 @@
           <w:sz w:val="22"/>
           <w:szCs w:val="22"/>
         </w:rPr>
-        <w:t xml:space="preserve">A calibration gap matters to a bettor only when it exceeds the share of the margin carried by the favorite side, which equals the raw implied probability minus the vig-free probability, computed game by game. In the primary group that averages 3.01 percentage points (10th to 90th percentile 2.35 to 3.72), across all favorites 2.61, and in the extreme tail 3.02. Since the minimum detectable effect is 1.33 points, the test can pick up mispricing well below the level a bettor could exploit.</w:t>
+        <w:t xml:space="preserve">A calibration gap matters to a bettor only when it exceeds the share of the margin carried by the favorite side. That share equals the raw implied probability minus the vig-free probability, computed game by game. In the primary group that averages 3.01 percentage points (10th to 90th percentile 2.35 to 3.72), across all favorites 2.61, and in the extreme tail 3.02. Since the minimum detectable effect is 1.33 points, the test can pick up mispricing well below the level a bettor could exploit.</w:t>
       </w:r>
     </w:p>
     <w:p>
@@ -1650,7 +1650,7 @@
     </w:p>
     <w:p>
       <w:pPr>
-        <w:spacing w:after="160" w:line="340"/>
+        <w:spacing w:after="152" w:line="326"/>
         <w:jc w:val="both"/>
       </w:pPr>
       <w:r>
@@ -1660,12 +1660,12 @@
           <w:sz w:val="22"/>
           <w:szCs w:val="22"/>
         </w:rPr>
-        <w:t xml:space="preserve">The primary group contains 6,840 games, 44.6 percent of the sample. Favorites won 5,529 against an expected 5,489.45, an observed rate of 80.83 percent against an implied 80.26. The gap is +0.58 percentage points, z = 1.22, p = .223. The test does not reject calibration, and the direction runs toward favorites winning slightly more often than their price implies, the opposite of the bias the study was designed to detect.</w:t>
-      </w:r>
-    </w:p>
-    <w:p>
-      <w:pPr>
-        <w:spacing w:after="160" w:line="340"/>
+        <w:t xml:space="preserve">The primary group contains 6,840 games, 44.6 percent of the sample. Favorites won 5,529 against an expected 5,489.45, an observed rate of 80.83 percent against an implied 80.26. The gap is +0.58 percentage points, z = 1.22, p = .223. The test does not reject calibration. The direction runs toward favorites winning slightly more often than their price implies, the opposite of the bias the study was designed to detect.</w:t>
+      </w:r>
+    </w:p>
+    <w:p>
+      <w:pPr>
+        <w:spacing w:after="152" w:line="326"/>
         <w:jc w:val="both"/>
       </w:pPr>
       <w:r>
@@ -1759,7 +1759,7 @@
     </w:p>
     <w:p>
       <w:pPr>
-        <w:spacing w:after="160" w:line="340"/>
+        <w:spacing w:after="152" w:line="326"/>
         <w:jc w:val="both"/>
       </w:pPr>
       <w:r>
@@ -3372,7 +3372,7 @@
     </w:p>
     <w:p>
       <w:pPr>
-        <w:spacing w:after="160" w:line="340"/>
+        <w:spacing w:after="152" w:line="326"/>
         <w:jc w:val="both"/>
       </w:pPr>
       <w:r>
@@ -3382,12 +3382,12 @@
           <w:sz w:val="22"/>
           <w:szCs w:val="22"/>
         </w:rPr>
-        <w:t xml:space="preserve">No individual season rejects. The 13 season gaps range from -2.82 to +2.52 points with every p above .10. Differences among the seasons, what meta-analysis calls heterogeneity, are assessed with the Cochran Q statistic. It asks whether the season gaps differ from one another by more than sampling noise, not whether the pooled gap is zero. Write y for a season's gap and w for the inverse of its Poisson-binomial null variance. Q is then the sum of w times the squared deviation of y from the inverse-variance-weighted mean, on twelve degrees of freedom. Built that way, Q = 8.37, p = .756, I-squared 0 percent. In the extreme tail above .90, 756 games give +0.63 points at p = .506; its minimum detectable effect of 2.66 sits just below its 3.02-point break-even requirement, so even the thinnest pre-specified slice has enough power to catch bias large enough to matter there.</w:t>
-      </w:r>
-    </w:p>
-    <w:p>
-      <w:pPr>
-        <w:spacing w:after="160" w:line="340"/>
+        <w:t xml:space="preserve">No individual season rejects. The 13 season gaps range from -2.82 to +2.52 points with every p above .10. Differences among the seasons, what meta-analysis calls heterogeneity, are assessed with the Cochran Q statistic. It asks whether the season gaps differ from one another by more than sampling noise, not whether the pooled gap is zero. Write y for a season's gap and w for the inverse of its Poisson-binomial null variance. Q is then the sum of w times the squared deviation of y from the inverse-variance-weighted mean, on twelve degrees of freedom. Built that way, Q = 8.37, p = .756, I-squared 0 percent. In the extreme tail above .90, 756 games give +0.63 points at p = .506. Its minimum detectable effect of 2.66 sits just below its 3.02-point break-even requirement. Even the thinnest pre-specified slice has enough power to catch bias large enough to matter there.</w:t>
+      </w:r>
+    </w:p>
+    <w:p>
+      <w:pPr>
+        <w:spacing w:after="152" w:line="326"/>
         <w:jc w:val="both"/>
       </w:pPr>
       <w:r>
@@ -3397,7 +3397,7 @@
           <w:sz w:val="22"/>
           <w:szCs w:val="22"/>
         </w:rPr>
-        <w:t xml:space="preserve">The most credible dependence check is the team-blocked bootstrap, because it resamples 32 favorite teams rather than 13 seasons and so does not lean on approximations that fail when clusters are few. It gives a 95 percent interval of -0.52 to +1.57 points, wider than the season-blocked -0.19 to +1.26, and containing zero. Table 4 adds the cluster-robust estimators; the point estimate is +0.58 throughout and only the standard error moves, from 0.39 to 0.53 against the Poisson-binomial 0.47. None rejects calibration. The rows resting on 13 season clusters are sensitivity checks rather than reliable inference: cluster-robust variance needs many clusters to be accurate, and at 13 it is known to come out too small, so the season-clustered p of .134 is if anything too low.</w:t>
+        <w:t xml:space="preserve">The most credible dependence check is the team-blocked bootstrap. It resamples 32 favorite teams rather than 13 seasons, so it does not lean on approximations that fail when clusters are few. It gives a 95 percent interval of -0.52 to +1.57 points, wider than the season-blocked -0.19 to +1.26, and containing zero. Table 4 adds the cluster-robust estimators; the point estimate is +0.58 throughout and only the standard error moves, from 0.39 to 0.53 against the Poisson-binomial 0.47. None rejects calibration. The rows resting on 13 season clusters are sensitivity checks rather than reliable inference. Cluster-robust variance needs many clusters to be accurate, and at 13 it is known to come out too small. The season-clustered p of .134 is therefore, if anything, too low.</w:t>
       </w:r>
     </w:p>
     <w:p>
@@ -4644,7 +4644,7 @@
     </w:p>
     <w:p>
       <w:pPr>
-        <w:spacing w:after="160" w:line="340"/>
+        <w:spacing w:after="152" w:line="326"/>
         <w:jc w:val="both"/>
       </w:pPr>
       <w:r>
@@ -4654,7 +4654,7 @@
           <w:sz w:val="22"/>
           <w:szCs w:val="22"/>
         </w:rPr>
-        <w:t xml:space="preserve">The logistic calibration regression is less stable under the same treatment. Its joint Wald p is .293 classical, .221 clustering on favorite team, .181 on underdog team, .085 on season and .037 two-way, the last of which would reject at .05 but rests on the same thirteen clusters. The reading taken here is that the confirmatory result is robust, the secondary regression is sensitive to how dependence is modeled, and a reader who prefers the two-way estimate should treat the calibration slope as unresolved rather than confirmed.</w:t>
+        <w:t xml:space="preserve">The logistic calibration regression is less stable under the same treatment. Its joint Wald p is .293 classical, .221 clustering on favorite team, .181 on underdog team, .085 on season and .037 two-way. The last of these would reject at .05, but it rests on the same thirteen clusters. The reading taken here is that the confirmatory result is robust and the secondary regression is sensitive to how dependence is modeled. A reader who prefers the two-way estimate should treat the calibration slope as unresolved rather than confirmed.</w:t>
       </w:r>
     </w:p>
     <w:p>
@@ -4675,7 +4675,7 @@
     </w:p>
     <w:p>
       <w:pPr>
-        <w:spacing w:after="160" w:line="340"/>
+        <w:spacing w:after="152" w:line="326"/>
         <w:jc w:val="both"/>
       </w:pPr>
       <w:r>
@@ -4685,7 +4685,7 @@
           <w:sz w:val="22"/>
           <w:szCs w:val="22"/>
         </w:rPr>
-        <w:t xml:space="preserve">Vig removal is the assumption the whole analysis rests on, so four alternatives were run. Additive normalization gives each side the same number of probability points; power normalization raises each raw probability to a common exponent; the constant-odds-ratio rule separates quoted and fair odds by a common factor; Shin (1993) prices against a share of insider money. Shin turns out to add nothing new here, matching the additive rule exactly for a two-outcome book, because requiring the two probabilities to sum to one while Shin keeps their difference fixed leaves only one possible pair. The derivation, its verification at machine precision, and the recovered insider share of 0.4 to 7.2 percent are in the supplementary material.</w:t>
+        <w:t xml:space="preserve">Vig removal is the assumption the whole analysis rests on, so four alternatives were run. Additive normalization gives each side the same number of probability points, and power normalization raises each raw probability to a common exponent. The constant-odds-ratio rule separates quoted and fair odds by a common factor, and Shin (1993) prices against a share of insider money. Shin turns out to add nothing new here. It matches the additive rule exactly for a two-outcome book, because requiring the two probabilities to sum to one while Shin keeps their difference fixed leaves only one possible pair. The derivation, its verification at machine precision, and the recovered insider share of 0.4 to 7.2 percent are in the supplementary material.</w:t>
       </w:r>
     </w:p>
     <w:p>
@@ -6130,7 +6130,7 @@
     </w:p>
     <w:p>
       <w:pPr>
-        <w:spacing w:after="160" w:line="340"/>
+        <w:spacing w:after="152" w:line="326"/>
         <w:jc w:val="both"/>
       </w:pPr>
       <w:r>
@@ -6140,12 +6140,12 @@
           <w:sz w:val="22"/>
           <w:szCs w:val="22"/>
         </w:rPr>
-        <w:t xml:space="preserve">The primary conclusion is robust to four of five rules but power normalization produces a statistically significant favorite bias that marginally exceeds its own break-even threshold: -1.31 points against 1.24 at p = .004, in the direction of betting underdogs, clearing the bar by seven hundredths of a point. Two reasons are offered for treating that rule as the least convincing of the five, and neither is that it gave an inconvenient answer. Raising probabilities to a common exponent is a flexible adjustment with no story about bookmakers or bettors behind it, unlike the others. And it differs most from the other rules exactly where the sample is thinnest, pushing heavy favorites to higher implied probabilities than any other rule and placing much of the estimated gap in the range with the fewest games. Neither reason settles the matter. A reader who prefers power normalization should read this sample as showing a small, barely exploitable favorite bias, and that reading is fair on the evidence presented here.</w:t>
-      </w:r>
-    </w:p>
-    <w:p>
-      <w:pPr>
-        <w:spacing w:after="160" w:line="340"/>
+        <w:t xml:space="preserve">The primary conclusion holds under four of the five rules. Power normalization is the exception. It produces a statistically significant favorite bias that just exceeds its own break-even threshold: -1.31 points against 1.24 at p = .004, in the direction of betting underdogs. It clears the bar by seven hundredths of a point. Two reasons are offered for treating that rule as the least convincing of the five, and neither is that it gave an inconvenient answer. Raising probabilities to a common exponent is a flexible adjustment with no story about bookmakers or bettors behind it, unlike the others. And it differs most from the other rules exactly where the sample is thinnest. It pushes heavy favorites to higher implied probabilities than any other rule, which places much of the estimated gap in the range with the fewest games. Neither reason settles the matter. A reader who prefers power normalization should read this sample as showing a small, barely exploitable favorite bias, and that reading is fair on the evidence presented here.</w:t>
+      </w:r>
+    </w:p>
+    <w:p>
+      <w:pPr>
+        <w:spacing w:after="152" w:line="326"/>
         <w:jc w:val="both"/>
       </w:pPr>
       <w:r>
@@ -6176,7 +6176,7 @@
     </w:p>
     <w:p>
       <w:pPr>
-        <w:spacing w:after="160" w:line="340"/>
+        <w:spacing w:after="152" w:line="326"/>
         <w:jc w:val="both"/>
       </w:pPr>
       <w:r>
@@ -6186,7 +6186,7 @@
           <w:sz w:val="22"/>
           <w:szCs w:val="22"/>
         </w:rPr>
-        <w:t xml:space="preserve">Flat one-dollar bets at the quoted prices lose money in every direction: -4.06 percent on all favorites (95% CI: -5.13 to -3.00), -3.91 on all underdogs (-6.57 to -1.25), and -2.90 on favorites above .70 (-4.04 to -1.76), consistent with the 3.77 percent mean overround. Those intervals use a normal approximation on a skewed quantity, which Losak and Kalamvokis (2025) argue inflates the true rejection rate of profitability tests in this literature. Simulating their null here moves no bound by more than 0.09 points and the test holds its nominal size, so the intervals stand, though the failure they describe does reproduce in these prices at smaller sample sizes; see the supplementary material. Against the economic hurdle directly, the observed +0.58-point gap and even its +1.26-point upper bound fall well short of the +3.01 points a favorite bettor needed.</w:t>
+        <w:t xml:space="preserve">Flat one-dollar bets at the quoted prices lose money in every direction: -4.06 percent on all favorites (95% CI: -5.13 to -3.00), -3.91 on all underdogs (-6.57 to -1.25), and -2.90 on favorites above .70 (-4.04 to -1.76). That is consistent with the 3.77 percent mean overround. Those intervals use a normal approximation on a skewed quantity, which Losak and Kalamvokis (2025) argue inflates the true rejection rate of profitability tests in this literature. Simulating their null here moves no bound by more than 0.09 points, and the test holds its nominal size, so the intervals stand. The failure they describe does reproduce in these prices at smaller sample sizes; see the supplementary material. Against the economic hurdle directly, the observed +0.58-point gap and even its +1.26-point upper bound fall well short of the +3.01 points a favorite bettor needed.</w:t>
       </w:r>
     </w:p>
     <w:p>
@@ -6333,7 +6333,7 @@
     </w:p>
     <w:p>
       <w:pPr>
-        <w:spacing w:after="160" w:line="340"/>
+        <w:spacing w:after="152" w:line="326"/>
         <w:jc w:val="both"/>
       </w:pPr>
       <w:r>
@@ -6343,12 +6343,12 @@
           <w:sz w:val="22"/>
           <w:szCs w:val="22"/>
         </w:rPr>
-        <w:t xml:space="preserve">The null should be read narrowly. In these archived consensus moneylines, pooled across 2007 to 2020 and within every season and pre-specified odds range examined, the overall favorite calibration gap was smaller than the design's 1.33-point minimum detectable effect and well below the 3.01-point break-even requirement. The estimate also holds under variance estimators allowing correlation within seasons and teams. It does not rule out biases in specific situations outside the pre-specified slices, mispricing at individual books, inefficiency in opening lines, or edges from shopping for the best price across books. Because the timing of each quote is unrecorded it says nothing about closing-line efficiency, and no claim is made about how professional bettors measure themselves.</w:t>
-      </w:r>
-    </w:p>
-    <w:p>
-      <w:pPr>
-        <w:spacing w:after="160" w:line="340"/>
+        <w:t xml:space="preserve">The null should be read narrowly. In these archived consensus moneylines, the overall favorite calibration gap was smaller than the design's 1.33-point minimum detectable effect and well below the 3.01-point break-even requirement. That holds pooled across 2007 to 2020, and within every season and pre-specified odds range examined. The estimate also holds under variance estimators allowing correlation within seasons and teams. It does not rule out biases in specific situations outside the pre-specified slices, mispricing at individual books, inefficiency in opening lines, or edges from shopping for the best price across books. Because the timing of each quote is unrecorded it says nothing about closing-line efficiency, and no claim is made about how professional bettors measure themselves.</w:t>
+      </w:r>
+    </w:p>
+    <w:p>
+      <w:pPr>
+        <w:spacing w:after="152" w:line="326"/>
         <w:jc w:val="both"/>
       </w:pPr>
       <w:r>
@@ -6358,12 +6358,12 @@
           <w:sz w:val="22"/>
           <w:szCs w:val="22"/>
         </w:rPr>
-        <w:t xml:space="preserve">The more lasting contribution is about method, and it is bigger than the margin effect alone. Three treatments of the same 15,351 games give an estimated favorite bias of -2.50 points at p &lt; .001 with raw probabilities, +0.58 at p = .223 under proportional normalization, and -1.31 at p = .004 under power normalization. Whether the bias exists, how big it is, and which way it points all move with a modeling choice most papers in this literature make in one sentence and never return to. A design fixed in advance, tied to an economic threshold and backed by a power calculation, does not make that choice for the analyst. What it does is make the consequences visible. Figure 3 states the power claim in the only units this paper can defend: above 99.9 percent at the 3.01-point break-even, 80 percent at 1.33 points, against roughly 11 percent for a 74-game bucket.</w:t>
-      </w:r>
-    </w:p>
-    <w:p>
-      <w:pPr>
-        <w:spacing w:after="160" w:line="340"/>
+        <w:t xml:space="preserve">The more lasting contribution is about method, and it is bigger than the margin effect alone. Three treatments of the same 15,351 games give three different answers. Raw probabilities give an estimated favorite bias of -2.50 points at p &lt; .001. Proportional normalization gives +0.58 at p = .223, and power normalization gives -1.31 at p = .004. Whether the bias exists, how big it is, and which way it points all move with one modeling choice. Most papers in this literature make that choice in a single sentence and never return to it. A design fixed in advance, tied to an economic threshold and backed by a power calculation, does not make that choice for the analyst. What it does is make the consequences visible. Figure 3 states the power claim in the only units this paper can defend: above 99.9 percent at the 3.01-point break-even, 80 percent at 1.33 points, against roughly 11 percent for a 74-game bucket.</w:t>
+      </w:r>
+    </w:p>
+    <w:p>
+      <w:pPr>
+        <w:spacing w:after="152" w:line="326"/>
         <w:jc w:val="both"/>
       </w:pPr>
       <w:r>
@@ -6373,7 +6373,7 @@
           <w:sz w:val="22"/>
           <w:szCs w:val="22"/>
         </w:rPr>
-        <w:t xml:space="preserve">Figure 3 deliberately marks no effect sizes drawn from prior work. An earlier draft marked 1.7 and 5.1 percentage points as the smallest and largest favorite-bias effects in the cited literature; neither could be traced to any source in that citation set. Six of the eight cited papers report rates of return or point-spread cover rates rather than win-probability calibration gaps, and the two cannot be swapped for each other without attaching the odds; the one literature review among them reports no effect sizes at all. The marks were removed rather than replaced with sourced ones, and the power argument is made against this sample's own break-even threshold instead. The supplementary material records the search in full.</w:t>
+        <w:t xml:space="preserve">Figure 3 deliberately marks no effect sizes drawn from prior work. An earlier draft marked 1.7 and 5.1 percentage points as the smallest and largest favorite-bias effects in the cited literature; neither could be traced to any source in that citation set. Six of the eight cited papers report rates of return or point-spread cover rates rather than win-probability calibration gaps. The two cannot be swapped for each other without attaching the odds. The one literature review among them reports no effect sizes at all. The marks were removed rather than replaced with sourced ones, and the power argument is made against this sample's own break-even threshold instead. The supplementary material records the search in full.</w:t>
       </w:r>
     </w:p>
     <w:p>
@@ -6394,7 +6394,7 @@
     </w:p>
     <w:p>
       <w:pPr>
-        <w:spacing w:after="160" w:line="340"/>
+        <w:spacing w:after="152" w:line="326"/>
         <w:jc w:val="both"/>
       </w:pPr>
       <w:r>
@@ -6409,7 +6409,7 @@
     </w:p>
     <w:p>
       <w:pPr>
-        <w:spacing w:after="160" w:line="340"/>
+        <w:spacing w:after="152" w:line="326"/>
         <w:jc w:val="both"/>
       </w:pPr>
       <w:r>
@@ -6419,7 +6419,7 @@
           <w:sz w:val="22"/>
           <w:szCs w:val="22"/>
         </w:rPr>
-        <w:t xml:space="preserve">The primary test assumes games are independent conditional on their prices. Cluster-robust estimators and block bootstraps relax that and leave the result unchanged, but the season-level estimators rest on only thirteen clusters, too few for cluster-robust variance to be reliable, and the two-way estimate of the calibration regression should be treated with matching caution in both directions. Weighting every game equally also answers a different question from weighting by dollars wagered, which is why the flat-stake analysis is reported directly. Finally, the analysis plan was fixed before outcome data were examined, but the record of that freeze is internal rather than filed with a registry, so its timing cannot be checked independently and the work is described as pre-specified rather than pre-registered. The plan is published in full, and the design leaves little room for hidden flexibility: one named primary comparison, a threshold and an effect-size floor set from stated reasoning rather than from outcomes, and exploratory analyses reported separately. Readers who want to check the stronger claim can re-run the confirmatory pipeline, which reproduces every reported statistic from the raw archive.</w:t>
+        <w:t xml:space="preserve">The primary test assumes games are independent conditional on their prices. Cluster-robust estimators and block bootstraps relax that assumption and leave the result unchanged. But the season-level estimators rest on only thirteen clusters. That is too few for cluster-robust variance to be reliable, so the two-way estimate of the calibration regression deserves matching caution in both directions. Weighting every game equally also answers a different question from weighting by dollars wagered, which is why the flat-stake analysis is reported directly. Finally, the analysis plan was fixed before outcome data were examined. But the record of that freeze is internal rather than filed with a registry. Its timing cannot be checked independently, which is why the work is described as pre-specified rather than pre-registered. The plan is published in full, and the design leaves little room for hidden flexibility. There is one named primary comparison, a threshold and an effect-size floor set from stated reasoning rather than from outcomes, and exploratory analyses reported separately. Readers who want to check the stronger claim can re-run the confirmatory pipeline, which reproduces every reported statistic from the raw archive.</w:t>
       </w:r>
     </w:p>
     <w:p>
@@ -6440,7 +6440,7 @@
     </w:p>
     <w:p>
       <w:pPr>
-        <w:spacing w:after="160" w:line="340"/>
+        <w:spacing w:after="152" w:line="326"/>
         <w:jc w:val="both"/>
       </w:pPr>
       <w:r>
@@ -6450,12 +6450,12 @@
           <w:sz w:val="22"/>
           <w:szCs w:val="22"/>
         </w:rPr>
-        <w:t xml:space="preserve">A test fixed in advance, tied to an economic threshold, powered well enough for the comparison it was built to make, and run on cross-checked archival data finds the archived NBA consensus moneylines in this series calibrated. Over 15,351 games, favorites were priced correctly to within a fraction of the bookmaker's own margin, and the estimate holds under variance estimators allowing correlation within seasons and teams. For bettors, in the archived consensus prices examined here, simply choosing favorites or underdogs offered no exploitable edge. That statement is confined to this series and this period.</w:t>
-      </w:r>
-    </w:p>
-    <w:p>
-      <w:pPr>
-        <w:spacing w:after="160" w:line="340"/>
+        <w:t xml:space="preserve">This test was fixed in advance, tied to an economic threshold, powered well enough for the comparison it was built to make, and run on cross-checked archival data. It finds the archived NBA consensus moneylines in this series calibrated. Over 15,351 games, favorites were priced correctly to within a fraction of the bookmaker's own margin, and the estimate holds under variance estimators allowing correlation within seasons and teams. For bettors, in the archived consensus prices examined here, simply choosing favorites or underdogs offered no exploitable edge. That statement is confined to this series and this period.</w:t>
+      </w:r>
+    </w:p>
+    <w:p>
+      <w:pPr>
+        <w:spacing w:after="152" w:line="326"/>
         <w:jc w:val="both"/>
       </w:pPr>
       <w:r>
@@ -6465,7 +6465,7 @@
           <w:sz w:val="22"/>
           <w:szCs w:val="22"/>
         </w:rPr>
-        <w:t xml:space="preserve">For researchers the sharper conclusion is about method. Whether favorite bias appears at all, and which way it points, depends heavily on how the bookmaker's margin is removed, and that dependence is invisible to the underpowered, single-rule bucket tests this literature has relied on. Reporting how the answer moves across vig-removal rules is not a caveat attached to the result. On this evidence it is the result.</w:t>
+        <w:t xml:space="preserve">For researchers the sharper conclusion is about method. Whether favorite bias appears at all, and which way it points, depends heavily on how the bookmaker's margin is removed. That dependence is invisible to the underpowered, single-rule bucket tests this literature has relied on. Reporting how the answer moves across vig-removal rules is not a caveat attached to the result. On this evidence it is the result.</w:t>
       </w:r>
     </w:p>
     <w:p>
@@ -6486,7 +6486,7 @@
     </w:p>
     <w:p>
       <w:pPr>
-        <w:spacing w:after="160" w:line="340"/>
+        <w:spacing w:after="152" w:line="326"/>
         <w:jc w:val="both"/>
       </w:pPr>
       <w:r>
@@ -6885,7 +6885,7 @@
     </w:p>
     <w:p>
       <w:pPr>
-        <w:spacing w:after="160" w:line="340"/>
+        <w:spacing w:after="152" w:line="326"/>
         <w:jc w:val="both"/>
       </w:pPr>
       <w:r>
@@ -6895,12 +6895,12 @@
           <w:sz w:val="22"/>
           <w:szCs w:val="22"/>
         </w:rPr>
-        <w:t xml:space="preserve">The replication materials include the frozen analysis plan, the confirmatory and robustness scripts, the data verification script and its full output, the figure scripts, the supplementary material, and result tables in machine-readable form, so every number and figure can be rebuilt from the raw archive. Headline statistics were reproduced independently from the raw files, including the test size and power, the Poisson-binomial statistic, the break-even algebra, the Cochran Q construction and the alternative normalizations.</w:t>
-      </w:r>
-    </w:p>
-    <w:p>
-      <w:pPr>
-        <w:spacing w:after="160" w:line="340"/>
+        <w:t xml:space="preserve">The replication materials include the frozen analysis plan and the confirmatory and robustness scripts. They also include the data verification script and its full output, the figure scripts, the supplementary material, and result tables in machine-readable form. Every number and figure can be rebuilt from the raw archive. Headline statistics were reproduced independently from the raw files, including the test size and power, the Poisson-binomial statistic, the break-even algebra, the Cochran Q construction and the alternative normalizations.</w:t>
+      </w:r>
+    </w:p>
+    <w:p>
+      <w:pPr>
+        <w:spacing w:after="152" w:line="326"/>
         <w:jc w:val="both"/>
       </w:pPr>
       <w:r>

</xml_diff>